<commit_message>
Compact MC layout and right-aligned True/False blanks on the Long Quiz
Vocabulary MC now uses a 2-column table (A/B left, C/D right) per
item instead of stacking 4 options vertically, cutting Part I to one
page. True/False blanks are right-aligned via table cells instead of
inline spacing, so they line up in a column regardless of statement
length. Also folds in label simplifications (Part N: Title, point
counts without the item breakdown, Course field) made directly in
the file.

Co-Authored-By: Claude Sonnet 5 <noreply@anthropic.com>
</commit_message>
<xml_diff>
--- a/_deliverables/MICE-LongQuiz-Units9-11.docx
+++ b/_deliverables/MICE-LongQuiz-Units9-11.docx
@@ -236,7 +236,7 @@
                 <w:sz w:val="20"/>
                 <w:szCs w:val="20"/>
               </w:rPr>
-              <w:t xml:space="preserve">Section:</w:t>
+              <w:t xml:space="preserve">Course:</w:t>
             </w:r>
           </w:p>
         </w:tc>
@@ -348,7 +348,7 @@
           <w:sz w:val="27"/>
           <w:szCs w:val="27"/>
         </w:rPr>
-        <w:t xml:space="preserve">Part I — Vocabulary (Units 9–10)</w:t>
+        <w:t xml:space="preserve">Part I: Vocabulary</w:t>
       </w:r>
     </w:p>
     <w:p>
@@ -364,7 +364,7 @@
           <w:sz w:val="19"/>
           <w:szCs w:val="19"/>
         </w:rPr>
-        <w:t xml:space="preserve">Multiple Choice · 10 items × 1 point = 10 points</w:t>
+        <w:t xml:space="preserve">Multiple Choice · 10 points</w:t>
       </w:r>
     </w:p>
     <w:p>
@@ -393,65 +393,138 @@
         <w:t xml:space="preserve">1. A company that has a booth at an exhibition to show its products.</w:t>
       </w:r>
     </w:p>
-    <w:p>
-      <w:pPr>
-        <w:spacing w:after="50"/>
-        <w:ind w:left="360"/>
-      </w:pPr>
-      <w:r>
-        <w:rPr>
-          <w:rFonts w:ascii="Times New Roman" w:cs="Times New Roman" w:eastAsia="Times New Roman" w:hAnsi="Times New Roman"/>
-          <w:sz w:val="20"/>
-          <w:szCs w:val="20"/>
-        </w:rPr>
-        <w:t xml:space="preserve">A. Visitor</w:t>
-      </w:r>
-    </w:p>
-    <w:p>
-      <w:pPr>
-        <w:spacing w:after="50"/>
-        <w:ind w:left="360"/>
-      </w:pPr>
-      <w:r>
-        <w:rPr>
-          <w:rFonts w:ascii="Times New Roman" w:cs="Times New Roman" w:eastAsia="Times New Roman" w:hAnsi="Times New Roman"/>
-          <w:sz w:val="20"/>
-          <w:szCs w:val="20"/>
-        </w:rPr>
-        <w:t xml:space="preserve">B. Exhibitor</w:t>
-      </w:r>
-    </w:p>
-    <w:p>
-      <w:pPr>
-        <w:spacing w:after="50"/>
-        <w:ind w:left="360"/>
-      </w:pPr>
-      <w:r>
-        <w:rPr>
-          <w:rFonts w:ascii="Times New Roman" w:cs="Times New Roman" w:eastAsia="Times New Roman" w:hAnsi="Times New Roman"/>
-          <w:sz w:val="20"/>
-          <w:szCs w:val="20"/>
-        </w:rPr>
-        <w:t xml:space="preserve">C. Competitor</w:t>
-      </w:r>
-    </w:p>
-    <w:p>
-      <w:pPr>
-        <w:spacing w:after="50"/>
-        <w:ind w:left="360"/>
-      </w:pPr>
-      <w:r>
-        <w:rPr>
-          <w:rFonts w:ascii="Times New Roman" w:cs="Times New Roman" w:eastAsia="Times New Roman" w:hAnsi="Times New Roman"/>
-          <w:sz w:val="20"/>
-          <w:szCs w:val="20"/>
-        </w:rPr>
-        <w:t xml:space="preserve">D. Lead</w:t>
-      </w:r>
-    </w:p>
-    <w:p>
-      <w:pPr>
-        <w:spacing w:after="140"/>
+    <w:tbl>
+      <w:tblPr>
+        <w:tblW w:type="dxa" w:w="9360"/>
+        <w:tblBorders>
+          <w:top w:val="single" w:color="auto" w:sz="4"/>
+          <w:left w:val="single" w:color="auto" w:sz="4"/>
+          <w:bottom w:val="single" w:color="auto" w:sz="4"/>
+          <w:right w:val="single" w:color="auto" w:sz="4"/>
+          <w:insideH w:val="single" w:color="auto" w:sz="4"/>
+          <w:insideV w:val="single" w:color="auto" w:sz="4"/>
+        </w:tblBorders>
+      </w:tblPr>
+      <w:tblGrid>
+        <w:gridCol w:w="4680"/>
+        <w:gridCol w:w="4680"/>
+      </w:tblGrid>
+      <w:tr>
+        <w:tc>
+          <w:tcPr>
+            <w:tcW w:type="dxa" w:w="4680"/>
+            <w:tcBorders>
+              <w:top w:val="none" w:color="FFFFFF" w:sz="0"/>
+              <w:left w:val="none" w:color="FFFFFF" w:sz="0"/>
+              <w:bottom w:val="none" w:color="FFFFFF" w:sz="0"/>
+              <w:right w:val="none" w:color="FFFFFF" w:sz="0"/>
+            </w:tcBorders>
+            <w:tcMar>
+              <w:top w:type="dxa" w:w="20"/>
+              <w:left w:type="dxa" w:w="360"/>
+              <w:bottom w:type="dxa" w:w="20"/>
+              <w:right w:type="dxa" w:w="80"/>
+            </w:tcMar>
+          </w:tcPr>
+          <w:p>
+            <w:r>
+              <w:rPr>
+                <w:rFonts w:ascii="Times New Roman" w:cs="Times New Roman" w:eastAsia="Times New Roman" w:hAnsi="Times New Roman"/>
+                <w:sz w:val="20"/>
+                <w:szCs w:val="20"/>
+              </w:rPr>
+              <w:t xml:space="preserve">A. Visitor</w:t>
+            </w:r>
+          </w:p>
+        </w:tc>
+        <w:tc>
+          <w:tcPr>
+            <w:tcW w:type="dxa" w:w="4680"/>
+            <w:tcBorders>
+              <w:top w:val="none" w:color="FFFFFF" w:sz="0"/>
+              <w:left w:val="none" w:color="FFFFFF" w:sz="0"/>
+              <w:bottom w:val="none" w:color="FFFFFF" w:sz="0"/>
+              <w:right w:val="none" w:color="FFFFFF" w:sz="0"/>
+            </w:tcBorders>
+            <w:tcMar>
+              <w:top w:type="dxa" w:w="20"/>
+              <w:left w:type="dxa" w:w="360"/>
+              <w:bottom w:type="dxa" w:w="20"/>
+              <w:right w:type="dxa" w:w="80"/>
+            </w:tcMar>
+          </w:tcPr>
+          <w:p>
+            <w:r>
+              <w:rPr>
+                <w:rFonts w:ascii="Times New Roman" w:cs="Times New Roman" w:eastAsia="Times New Roman" w:hAnsi="Times New Roman"/>
+                <w:sz w:val="20"/>
+                <w:szCs w:val="20"/>
+              </w:rPr>
+              <w:t xml:space="preserve">C. Competitor</w:t>
+            </w:r>
+          </w:p>
+        </w:tc>
+      </w:tr>
+      <w:tr>
+        <w:tc>
+          <w:tcPr>
+            <w:tcW w:type="dxa" w:w="4680"/>
+            <w:tcBorders>
+              <w:top w:val="none" w:color="FFFFFF" w:sz="0"/>
+              <w:left w:val="none" w:color="FFFFFF" w:sz="0"/>
+              <w:bottom w:val="none" w:color="FFFFFF" w:sz="0"/>
+              <w:right w:val="none" w:color="FFFFFF" w:sz="0"/>
+            </w:tcBorders>
+            <w:tcMar>
+              <w:top w:type="dxa" w:w="20"/>
+              <w:left w:type="dxa" w:w="360"/>
+              <w:bottom w:type="dxa" w:w="20"/>
+              <w:right w:type="dxa" w:w="80"/>
+            </w:tcMar>
+          </w:tcPr>
+          <w:p>
+            <w:r>
+              <w:rPr>
+                <w:rFonts w:ascii="Times New Roman" w:cs="Times New Roman" w:eastAsia="Times New Roman" w:hAnsi="Times New Roman"/>
+                <w:sz w:val="20"/>
+                <w:szCs w:val="20"/>
+              </w:rPr>
+              <w:t xml:space="preserve">B. Exhibitor</w:t>
+            </w:r>
+          </w:p>
+        </w:tc>
+        <w:tc>
+          <w:tcPr>
+            <w:tcW w:type="dxa" w:w="4680"/>
+            <w:tcBorders>
+              <w:top w:val="none" w:color="FFFFFF" w:sz="0"/>
+              <w:left w:val="none" w:color="FFFFFF" w:sz="0"/>
+              <w:bottom w:val="none" w:color="FFFFFF" w:sz="0"/>
+              <w:right w:val="none" w:color="FFFFFF" w:sz="0"/>
+            </w:tcBorders>
+            <w:tcMar>
+              <w:top w:type="dxa" w:w="20"/>
+              <w:left w:type="dxa" w:w="360"/>
+              <w:bottom w:type="dxa" w:w="20"/>
+              <w:right w:type="dxa" w:w="80"/>
+            </w:tcMar>
+          </w:tcPr>
+          <w:p>
+            <w:r>
+              <w:rPr>
+                <w:rFonts w:ascii="Times New Roman" w:cs="Times New Roman" w:eastAsia="Times New Roman" w:hAnsi="Times New Roman"/>
+                <w:sz w:val="20"/>
+                <w:szCs w:val="20"/>
+              </w:rPr>
+              <w:t xml:space="preserve">D. Lead</w:t>
+            </w:r>
+          </w:p>
+        </w:tc>
+      </w:tr>
+    </w:tbl>
+    <w:p>
+      <w:pPr>
+        <w:spacing w:after="120"/>
       </w:pPr>
     </w:p>
     <w:p>
@@ -467,65 +540,138 @@
         <w:t xml:space="preserve">2. A visitor who shows real interest and might become a customer.</w:t>
       </w:r>
     </w:p>
-    <w:p>
-      <w:pPr>
-        <w:spacing w:after="50"/>
-        <w:ind w:left="360"/>
-      </w:pPr>
-      <w:r>
-        <w:rPr>
-          <w:rFonts w:ascii="Times New Roman" w:cs="Times New Roman" w:eastAsia="Times New Roman" w:hAnsi="Times New Roman"/>
-          <w:sz w:val="20"/>
-          <w:szCs w:val="20"/>
-        </w:rPr>
-        <w:t xml:space="preserve">A. Lead</w:t>
-      </w:r>
-    </w:p>
-    <w:p>
-      <w:pPr>
-        <w:spacing w:after="50"/>
-        <w:ind w:left="360"/>
-      </w:pPr>
-      <w:r>
-        <w:rPr>
-          <w:rFonts w:ascii="Times New Roman" w:cs="Times New Roman" w:eastAsia="Times New Roman" w:hAnsi="Times New Roman"/>
-          <w:sz w:val="20"/>
-          <w:szCs w:val="20"/>
-        </w:rPr>
-        <w:t xml:space="preserve">B. Pitch</w:t>
-      </w:r>
-    </w:p>
-    <w:p>
-      <w:pPr>
-        <w:spacing w:after="50"/>
-        <w:ind w:left="360"/>
-      </w:pPr>
-      <w:r>
-        <w:rPr>
-          <w:rFonts w:ascii="Times New Roman" w:cs="Times New Roman" w:eastAsia="Times New Roman" w:hAnsi="Times New Roman"/>
-          <w:sz w:val="20"/>
-          <w:szCs w:val="20"/>
-        </w:rPr>
-        <w:t xml:space="preserve">C. Brochure</w:t>
-      </w:r>
-    </w:p>
-    <w:p>
-      <w:pPr>
-        <w:spacing w:after="50"/>
-        <w:ind w:left="360"/>
-      </w:pPr>
-      <w:r>
-        <w:rPr>
-          <w:rFonts w:ascii="Times New Roman" w:cs="Times New Roman" w:eastAsia="Times New Roman" w:hAnsi="Times New Roman"/>
-          <w:sz w:val="20"/>
-          <w:szCs w:val="20"/>
-        </w:rPr>
-        <w:t xml:space="preserve">D. Target audience</w:t>
-      </w:r>
-    </w:p>
-    <w:p>
-      <w:pPr>
-        <w:spacing w:after="140"/>
+    <w:tbl>
+      <w:tblPr>
+        <w:tblW w:type="dxa" w:w="9360"/>
+        <w:tblBorders>
+          <w:top w:val="single" w:color="auto" w:sz="4"/>
+          <w:left w:val="single" w:color="auto" w:sz="4"/>
+          <w:bottom w:val="single" w:color="auto" w:sz="4"/>
+          <w:right w:val="single" w:color="auto" w:sz="4"/>
+          <w:insideH w:val="single" w:color="auto" w:sz="4"/>
+          <w:insideV w:val="single" w:color="auto" w:sz="4"/>
+        </w:tblBorders>
+      </w:tblPr>
+      <w:tblGrid>
+        <w:gridCol w:w="4680"/>
+        <w:gridCol w:w="4680"/>
+      </w:tblGrid>
+      <w:tr>
+        <w:tc>
+          <w:tcPr>
+            <w:tcW w:type="dxa" w:w="4680"/>
+            <w:tcBorders>
+              <w:top w:val="none" w:color="FFFFFF" w:sz="0"/>
+              <w:left w:val="none" w:color="FFFFFF" w:sz="0"/>
+              <w:bottom w:val="none" w:color="FFFFFF" w:sz="0"/>
+              <w:right w:val="none" w:color="FFFFFF" w:sz="0"/>
+            </w:tcBorders>
+            <w:tcMar>
+              <w:top w:type="dxa" w:w="20"/>
+              <w:left w:type="dxa" w:w="360"/>
+              <w:bottom w:type="dxa" w:w="20"/>
+              <w:right w:type="dxa" w:w="80"/>
+            </w:tcMar>
+          </w:tcPr>
+          <w:p>
+            <w:r>
+              <w:rPr>
+                <w:rFonts w:ascii="Times New Roman" w:cs="Times New Roman" w:eastAsia="Times New Roman" w:hAnsi="Times New Roman"/>
+                <w:sz w:val="20"/>
+                <w:szCs w:val="20"/>
+              </w:rPr>
+              <w:t xml:space="preserve">A. Lead</w:t>
+            </w:r>
+          </w:p>
+        </w:tc>
+        <w:tc>
+          <w:tcPr>
+            <w:tcW w:type="dxa" w:w="4680"/>
+            <w:tcBorders>
+              <w:top w:val="none" w:color="FFFFFF" w:sz="0"/>
+              <w:left w:val="none" w:color="FFFFFF" w:sz="0"/>
+              <w:bottom w:val="none" w:color="FFFFFF" w:sz="0"/>
+              <w:right w:val="none" w:color="FFFFFF" w:sz="0"/>
+            </w:tcBorders>
+            <w:tcMar>
+              <w:top w:type="dxa" w:w="20"/>
+              <w:left w:type="dxa" w:w="360"/>
+              <w:bottom w:type="dxa" w:w="20"/>
+              <w:right w:type="dxa" w:w="80"/>
+            </w:tcMar>
+          </w:tcPr>
+          <w:p>
+            <w:r>
+              <w:rPr>
+                <w:rFonts w:ascii="Times New Roman" w:cs="Times New Roman" w:eastAsia="Times New Roman" w:hAnsi="Times New Roman"/>
+                <w:sz w:val="20"/>
+                <w:szCs w:val="20"/>
+              </w:rPr>
+              <w:t xml:space="preserve">C. Brochure</w:t>
+            </w:r>
+          </w:p>
+        </w:tc>
+      </w:tr>
+      <w:tr>
+        <w:tc>
+          <w:tcPr>
+            <w:tcW w:type="dxa" w:w="4680"/>
+            <w:tcBorders>
+              <w:top w:val="none" w:color="FFFFFF" w:sz="0"/>
+              <w:left w:val="none" w:color="FFFFFF" w:sz="0"/>
+              <w:bottom w:val="none" w:color="FFFFFF" w:sz="0"/>
+              <w:right w:val="none" w:color="FFFFFF" w:sz="0"/>
+            </w:tcBorders>
+            <w:tcMar>
+              <w:top w:type="dxa" w:w="20"/>
+              <w:left w:type="dxa" w:w="360"/>
+              <w:bottom w:type="dxa" w:w="20"/>
+              <w:right w:type="dxa" w:w="80"/>
+            </w:tcMar>
+          </w:tcPr>
+          <w:p>
+            <w:r>
+              <w:rPr>
+                <w:rFonts w:ascii="Times New Roman" w:cs="Times New Roman" w:eastAsia="Times New Roman" w:hAnsi="Times New Roman"/>
+                <w:sz w:val="20"/>
+                <w:szCs w:val="20"/>
+              </w:rPr>
+              <w:t xml:space="preserve">B. Pitch</w:t>
+            </w:r>
+          </w:p>
+        </w:tc>
+        <w:tc>
+          <w:tcPr>
+            <w:tcW w:type="dxa" w:w="4680"/>
+            <w:tcBorders>
+              <w:top w:val="none" w:color="FFFFFF" w:sz="0"/>
+              <w:left w:val="none" w:color="FFFFFF" w:sz="0"/>
+              <w:bottom w:val="none" w:color="FFFFFF" w:sz="0"/>
+              <w:right w:val="none" w:color="FFFFFF" w:sz="0"/>
+            </w:tcBorders>
+            <w:tcMar>
+              <w:top w:type="dxa" w:w="20"/>
+              <w:left w:type="dxa" w:w="360"/>
+              <w:bottom w:type="dxa" w:w="20"/>
+              <w:right w:type="dxa" w:w="80"/>
+            </w:tcMar>
+          </w:tcPr>
+          <w:p>
+            <w:r>
+              <w:rPr>
+                <w:rFonts w:ascii="Times New Roman" w:cs="Times New Roman" w:eastAsia="Times New Roman" w:hAnsi="Times New Roman"/>
+                <w:sz w:val="20"/>
+                <w:szCs w:val="20"/>
+              </w:rPr>
+              <w:t xml:space="preserve">D. Target audience</w:t>
+            </w:r>
+          </w:p>
+        </w:tc>
+      </w:tr>
+    </w:tbl>
+    <w:p>
+      <w:pPr>
+        <w:spacing w:after="120"/>
       </w:pPr>
     </w:p>
     <w:p>
@@ -541,65 +687,138 @@
         <w:t xml:space="preserve">3. A short, clear explanation of a product made to attract interest.</w:t>
       </w:r>
     </w:p>
-    <w:p>
-      <w:pPr>
-        <w:spacing w:after="50"/>
-        <w:ind w:left="360"/>
-      </w:pPr>
-      <w:r>
-        <w:rPr>
-          <w:rFonts w:ascii="Times New Roman" w:cs="Times New Roman" w:eastAsia="Times New Roman" w:hAnsi="Times New Roman"/>
-          <w:sz w:val="20"/>
-          <w:szCs w:val="20"/>
-        </w:rPr>
-        <w:t xml:space="preserve">A. Brochure</w:t>
-      </w:r>
-    </w:p>
-    <w:p>
-      <w:pPr>
-        <w:spacing w:after="50"/>
-        <w:ind w:left="360"/>
-      </w:pPr>
-      <w:r>
-        <w:rPr>
-          <w:rFonts w:ascii="Times New Roman" w:cs="Times New Roman" w:eastAsia="Times New Roman" w:hAnsi="Times New Roman"/>
-          <w:sz w:val="20"/>
-          <w:szCs w:val="20"/>
-        </w:rPr>
-        <w:t xml:space="preserve">B. Follow up</w:t>
-      </w:r>
-    </w:p>
-    <w:p>
-      <w:pPr>
-        <w:spacing w:after="50"/>
-        <w:ind w:left="360"/>
-      </w:pPr>
-      <w:r>
-        <w:rPr>
-          <w:rFonts w:ascii="Times New Roman" w:cs="Times New Roman" w:eastAsia="Times New Roman" w:hAnsi="Times New Roman"/>
-          <w:sz w:val="20"/>
-          <w:szCs w:val="20"/>
-        </w:rPr>
-        <w:t xml:space="preserve">C. Pitch</w:t>
-      </w:r>
-    </w:p>
-    <w:p>
-      <w:pPr>
-        <w:spacing w:after="50"/>
-        <w:ind w:left="360"/>
-      </w:pPr>
-      <w:r>
-        <w:rPr>
-          <w:rFonts w:ascii="Times New Roman" w:cs="Times New Roman" w:eastAsia="Times New Roman" w:hAnsi="Times New Roman"/>
-          <w:sz w:val="20"/>
-          <w:szCs w:val="20"/>
-        </w:rPr>
-        <w:t xml:space="preserve">D. Exhibitor</w:t>
-      </w:r>
-    </w:p>
-    <w:p>
-      <w:pPr>
-        <w:spacing w:after="140"/>
+    <w:tbl>
+      <w:tblPr>
+        <w:tblW w:type="dxa" w:w="9360"/>
+        <w:tblBorders>
+          <w:top w:val="single" w:color="auto" w:sz="4"/>
+          <w:left w:val="single" w:color="auto" w:sz="4"/>
+          <w:bottom w:val="single" w:color="auto" w:sz="4"/>
+          <w:right w:val="single" w:color="auto" w:sz="4"/>
+          <w:insideH w:val="single" w:color="auto" w:sz="4"/>
+          <w:insideV w:val="single" w:color="auto" w:sz="4"/>
+        </w:tblBorders>
+      </w:tblPr>
+      <w:tblGrid>
+        <w:gridCol w:w="4680"/>
+        <w:gridCol w:w="4680"/>
+      </w:tblGrid>
+      <w:tr>
+        <w:tc>
+          <w:tcPr>
+            <w:tcW w:type="dxa" w:w="4680"/>
+            <w:tcBorders>
+              <w:top w:val="none" w:color="FFFFFF" w:sz="0"/>
+              <w:left w:val="none" w:color="FFFFFF" w:sz="0"/>
+              <w:bottom w:val="none" w:color="FFFFFF" w:sz="0"/>
+              <w:right w:val="none" w:color="FFFFFF" w:sz="0"/>
+            </w:tcBorders>
+            <w:tcMar>
+              <w:top w:type="dxa" w:w="20"/>
+              <w:left w:type="dxa" w:w="360"/>
+              <w:bottom w:type="dxa" w:w="20"/>
+              <w:right w:type="dxa" w:w="80"/>
+            </w:tcMar>
+          </w:tcPr>
+          <w:p>
+            <w:r>
+              <w:rPr>
+                <w:rFonts w:ascii="Times New Roman" w:cs="Times New Roman" w:eastAsia="Times New Roman" w:hAnsi="Times New Roman"/>
+                <w:sz w:val="20"/>
+                <w:szCs w:val="20"/>
+              </w:rPr>
+              <w:t xml:space="preserve">A. Brochure</w:t>
+            </w:r>
+          </w:p>
+        </w:tc>
+        <w:tc>
+          <w:tcPr>
+            <w:tcW w:type="dxa" w:w="4680"/>
+            <w:tcBorders>
+              <w:top w:val="none" w:color="FFFFFF" w:sz="0"/>
+              <w:left w:val="none" w:color="FFFFFF" w:sz="0"/>
+              <w:bottom w:val="none" w:color="FFFFFF" w:sz="0"/>
+              <w:right w:val="none" w:color="FFFFFF" w:sz="0"/>
+            </w:tcBorders>
+            <w:tcMar>
+              <w:top w:type="dxa" w:w="20"/>
+              <w:left w:type="dxa" w:w="360"/>
+              <w:bottom w:type="dxa" w:w="20"/>
+              <w:right w:type="dxa" w:w="80"/>
+            </w:tcMar>
+          </w:tcPr>
+          <w:p>
+            <w:r>
+              <w:rPr>
+                <w:rFonts w:ascii="Times New Roman" w:cs="Times New Roman" w:eastAsia="Times New Roman" w:hAnsi="Times New Roman"/>
+                <w:sz w:val="20"/>
+                <w:szCs w:val="20"/>
+              </w:rPr>
+              <w:t xml:space="preserve">C. Pitch</w:t>
+            </w:r>
+          </w:p>
+        </w:tc>
+      </w:tr>
+      <w:tr>
+        <w:tc>
+          <w:tcPr>
+            <w:tcW w:type="dxa" w:w="4680"/>
+            <w:tcBorders>
+              <w:top w:val="none" w:color="FFFFFF" w:sz="0"/>
+              <w:left w:val="none" w:color="FFFFFF" w:sz="0"/>
+              <w:bottom w:val="none" w:color="FFFFFF" w:sz="0"/>
+              <w:right w:val="none" w:color="FFFFFF" w:sz="0"/>
+            </w:tcBorders>
+            <w:tcMar>
+              <w:top w:type="dxa" w:w="20"/>
+              <w:left w:type="dxa" w:w="360"/>
+              <w:bottom w:type="dxa" w:w="20"/>
+              <w:right w:type="dxa" w:w="80"/>
+            </w:tcMar>
+          </w:tcPr>
+          <w:p>
+            <w:r>
+              <w:rPr>
+                <w:rFonts w:ascii="Times New Roman" w:cs="Times New Roman" w:eastAsia="Times New Roman" w:hAnsi="Times New Roman"/>
+                <w:sz w:val="20"/>
+                <w:szCs w:val="20"/>
+              </w:rPr>
+              <w:t xml:space="preserve">B. Follow up</w:t>
+            </w:r>
+          </w:p>
+        </w:tc>
+        <w:tc>
+          <w:tcPr>
+            <w:tcW w:type="dxa" w:w="4680"/>
+            <w:tcBorders>
+              <w:top w:val="none" w:color="FFFFFF" w:sz="0"/>
+              <w:left w:val="none" w:color="FFFFFF" w:sz="0"/>
+              <w:bottom w:val="none" w:color="FFFFFF" w:sz="0"/>
+              <w:right w:val="none" w:color="FFFFFF" w:sz="0"/>
+            </w:tcBorders>
+            <w:tcMar>
+              <w:top w:type="dxa" w:w="20"/>
+              <w:left w:type="dxa" w:w="360"/>
+              <w:bottom w:type="dxa" w:w="20"/>
+              <w:right w:type="dxa" w:w="80"/>
+            </w:tcMar>
+          </w:tcPr>
+          <w:p>
+            <w:r>
+              <w:rPr>
+                <w:rFonts w:ascii="Times New Roman" w:cs="Times New Roman" w:eastAsia="Times New Roman" w:hAnsi="Times New Roman"/>
+                <w:sz w:val="20"/>
+                <w:szCs w:val="20"/>
+              </w:rPr>
+              <w:t xml:space="preserve">D. Exhibitor</w:t>
+            </w:r>
+          </w:p>
+        </w:tc>
+      </w:tr>
+    </w:tbl>
+    <w:p>
+      <w:pPr>
+        <w:spacing w:after="120"/>
       </w:pPr>
     </w:p>
     <w:p>
@@ -615,65 +834,138 @@
         <w:t xml:space="preserve">4. The group of people a product or pitch is designed for.</w:t>
       </w:r>
     </w:p>
-    <w:p>
-      <w:pPr>
-        <w:spacing w:after="50"/>
-        <w:ind w:left="360"/>
-      </w:pPr>
-      <w:r>
-        <w:rPr>
-          <w:rFonts w:ascii="Times New Roman" w:cs="Times New Roman" w:eastAsia="Times New Roman" w:hAnsi="Times New Roman"/>
-          <w:sz w:val="20"/>
-          <w:szCs w:val="20"/>
-        </w:rPr>
-        <w:t xml:space="preserve">A. Competitor</w:t>
-      </w:r>
-    </w:p>
-    <w:p>
-      <w:pPr>
-        <w:spacing w:after="50"/>
-        <w:ind w:left="360"/>
-      </w:pPr>
-      <w:r>
-        <w:rPr>
-          <w:rFonts w:ascii="Times New Roman" w:cs="Times New Roman" w:eastAsia="Times New Roman" w:hAnsi="Times New Roman"/>
-          <w:sz w:val="20"/>
-          <w:szCs w:val="20"/>
-        </w:rPr>
-        <w:t xml:space="preserve">B. Target audience</w:t>
-      </w:r>
-    </w:p>
-    <w:p>
-      <w:pPr>
-        <w:spacing w:after="50"/>
-        <w:ind w:left="360"/>
-      </w:pPr>
-      <w:r>
-        <w:rPr>
-          <w:rFonts w:ascii="Times New Roman" w:cs="Times New Roman" w:eastAsia="Times New Roman" w:hAnsi="Times New Roman"/>
-          <w:sz w:val="20"/>
-          <w:szCs w:val="20"/>
-        </w:rPr>
-        <w:t xml:space="preserve">C. Visitor</w:t>
-      </w:r>
-    </w:p>
-    <w:p>
-      <w:pPr>
-        <w:spacing w:after="50"/>
-        <w:ind w:left="360"/>
-      </w:pPr>
-      <w:r>
-        <w:rPr>
-          <w:rFonts w:ascii="Times New Roman" w:cs="Times New Roman" w:eastAsia="Times New Roman" w:hAnsi="Times New Roman"/>
-          <w:sz w:val="20"/>
-          <w:szCs w:val="20"/>
-        </w:rPr>
-        <w:t xml:space="preserve">D. Lead</w:t>
-      </w:r>
-    </w:p>
-    <w:p>
-      <w:pPr>
-        <w:spacing w:after="140"/>
+    <w:tbl>
+      <w:tblPr>
+        <w:tblW w:type="dxa" w:w="9360"/>
+        <w:tblBorders>
+          <w:top w:val="single" w:color="auto" w:sz="4"/>
+          <w:left w:val="single" w:color="auto" w:sz="4"/>
+          <w:bottom w:val="single" w:color="auto" w:sz="4"/>
+          <w:right w:val="single" w:color="auto" w:sz="4"/>
+          <w:insideH w:val="single" w:color="auto" w:sz="4"/>
+          <w:insideV w:val="single" w:color="auto" w:sz="4"/>
+        </w:tblBorders>
+      </w:tblPr>
+      <w:tblGrid>
+        <w:gridCol w:w="4680"/>
+        <w:gridCol w:w="4680"/>
+      </w:tblGrid>
+      <w:tr>
+        <w:tc>
+          <w:tcPr>
+            <w:tcW w:type="dxa" w:w="4680"/>
+            <w:tcBorders>
+              <w:top w:val="none" w:color="FFFFFF" w:sz="0"/>
+              <w:left w:val="none" w:color="FFFFFF" w:sz="0"/>
+              <w:bottom w:val="none" w:color="FFFFFF" w:sz="0"/>
+              <w:right w:val="none" w:color="FFFFFF" w:sz="0"/>
+            </w:tcBorders>
+            <w:tcMar>
+              <w:top w:type="dxa" w:w="20"/>
+              <w:left w:type="dxa" w:w="360"/>
+              <w:bottom w:type="dxa" w:w="20"/>
+              <w:right w:type="dxa" w:w="80"/>
+            </w:tcMar>
+          </w:tcPr>
+          <w:p>
+            <w:r>
+              <w:rPr>
+                <w:rFonts w:ascii="Times New Roman" w:cs="Times New Roman" w:eastAsia="Times New Roman" w:hAnsi="Times New Roman"/>
+                <w:sz w:val="20"/>
+                <w:szCs w:val="20"/>
+              </w:rPr>
+              <w:t xml:space="preserve">A. Competitor</w:t>
+            </w:r>
+          </w:p>
+        </w:tc>
+        <w:tc>
+          <w:tcPr>
+            <w:tcW w:type="dxa" w:w="4680"/>
+            <w:tcBorders>
+              <w:top w:val="none" w:color="FFFFFF" w:sz="0"/>
+              <w:left w:val="none" w:color="FFFFFF" w:sz="0"/>
+              <w:bottom w:val="none" w:color="FFFFFF" w:sz="0"/>
+              <w:right w:val="none" w:color="FFFFFF" w:sz="0"/>
+            </w:tcBorders>
+            <w:tcMar>
+              <w:top w:type="dxa" w:w="20"/>
+              <w:left w:type="dxa" w:w="360"/>
+              <w:bottom w:type="dxa" w:w="20"/>
+              <w:right w:type="dxa" w:w="80"/>
+            </w:tcMar>
+          </w:tcPr>
+          <w:p>
+            <w:r>
+              <w:rPr>
+                <w:rFonts w:ascii="Times New Roman" w:cs="Times New Roman" w:eastAsia="Times New Roman" w:hAnsi="Times New Roman"/>
+                <w:sz w:val="20"/>
+                <w:szCs w:val="20"/>
+              </w:rPr>
+              <w:t xml:space="preserve">C. Visitor</w:t>
+            </w:r>
+          </w:p>
+        </w:tc>
+      </w:tr>
+      <w:tr>
+        <w:tc>
+          <w:tcPr>
+            <w:tcW w:type="dxa" w:w="4680"/>
+            <w:tcBorders>
+              <w:top w:val="none" w:color="FFFFFF" w:sz="0"/>
+              <w:left w:val="none" w:color="FFFFFF" w:sz="0"/>
+              <w:bottom w:val="none" w:color="FFFFFF" w:sz="0"/>
+              <w:right w:val="none" w:color="FFFFFF" w:sz="0"/>
+            </w:tcBorders>
+            <w:tcMar>
+              <w:top w:type="dxa" w:w="20"/>
+              <w:left w:type="dxa" w:w="360"/>
+              <w:bottom w:type="dxa" w:w="20"/>
+              <w:right w:type="dxa" w:w="80"/>
+            </w:tcMar>
+          </w:tcPr>
+          <w:p>
+            <w:r>
+              <w:rPr>
+                <w:rFonts w:ascii="Times New Roman" w:cs="Times New Roman" w:eastAsia="Times New Roman" w:hAnsi="Times New Roman"/>
+                <w:sz w:val="20"/>
+                <w:szCs w:val="20"/>
+              </w:rPr>
+              <w:t xml:space="preserve">B. Target audience</w:t>
+            </w:r>
+          </w:p>
+        </w:tc>
+        <w:tc>
+          <w:tcPr>
+            <w:tcW w:type="dxa" w:w="4680"/>
+            <w:tcBorders>
+              <w:top w:val="none" w:color="FFFFFF" w:sz="0"/>
+              <w:left w:val="none" w:color="FFFFFF" w:sz="0"/>
+              <w:bottom w:val="none" w:color="FFFFFF" w:sz="0"/>
+              <w:right w:val="none" w:color="FFFFFF" w:sz="0"/>
+            </w:tcBorders>
+            <w:tcMar>
+              <w:top w:type="dxa" w:w="20"/>
+              <w:left w:type="dxa" w:w="360"/>
+              <w:bottom w:type="dxa" w:w="20"/>
+              <w:right w:type="dxa" w:w="80"/>
+            </w:tcMar>
+          </w:tcPr>
+          <w:p>
+            <w:r>
+              <w:rPr>
+                <w:rFonts w:ascii="Times New Roman" w:cs="Times New Roman" w:eastAsia="Times New Roman" w:hAnsi="Times New Roman"/>
+                <w:sz w:val="20"/>
+                <w:szCs w:val="20"/>
+              </w:rPr>
+              <w:t xml:space="preserve">D. Lead</w:t>
+            </w:r>
+          </w:p>
+        </w:tc>
+      </w:tr>
+    </w:tbl>
+    <w:p>
+      <w:pPr>
+        <w:spacing w:after="120"/>
       </w:pPr>
     </w:p>
     <w:p>
@@ -689,65 +981,138 @@
         <w:t xml:space="preserve">5. Another company offering a similar product or service.</w:t>
       </w:r>
     </w:p>
-    <w:p>
-      <w:pPr>
-        <w:spacing w:after="50"/>
-        <w:ind w:left="360"/>
-      </w:pPr>
-      <w:r>
-        <w:rPr>
-          <w:rFonts w:ascii="Times New Roman" w:cs="Times New Roman" w:eastAsia="Times New Roman" w:hAnsi="Times New Roman"/>
-          <w:sz w:val="20"/>
-          <w:szCs w:val="20"/>
-        </w:rPr>
-        <w:t xml:space="preserve">A. Competitor</w:t>
-      </w:r>
-    </w:p>
-    <w:p>
-      <w:pPr>
-        <w:spacing w:after="50"/>
-        <w:ind w:left="360"/>
-      </w:pPr>
-      <w:r>
-        <w:rPr>
-          <w:rFonts w:ascii="Times New Roman" w:cs="Times New Roman" w:eastAsia="Times New Roman" w:hAnsi="Times New Roman"/>
-          <w:sz w:val="20"/>
-          <w:szCs w:val="20"/>
-        </w:rPr>
-        <w:t xml:space="preserve">B. Exhibitor</w:t>
-      </w:r>
-    </w:p>
-    <w:p>
-      <w:pPr>
-        <w:spacing w:after="50"/>
-        <w:ind w:left="360"/>
-      </w:pPr>
-      <w:r>
-        <w:rPr>
-          <w:rFonts w:ascii="Times New Roman" w:cs="Times New Roman" w:eastAsia="Times New Roman" w:hAnsi="Times New Roman"/>
-          <w:sz w:val="20"/>
-          <w:szCs w:val="20"/>
-        </w:rPr>
-        <w:t xml:space="preserve">C. Visitor</w:t>
-      </w:r>
-    </w:p>
-    <w:p>
-      <w:pPr>
-        <w:spacing w:after="50"/>
-        <w:ind w:left="360"/>
-      </w:pPr>
-      <w:r>
-        <w:rPr>
-          <w:rFonts w:ascii="Times New Roman" w:cs="Times New Roman" w:eastAsia="Times New Roman" w:hAnsi="Times New Roman"/>
-          <w:sz w:val="20"/>
-          <w:szCs w:val="20"/>
-        </w:rPr>
-        <w:t xml:space="preserve">D. Target audience</w:t>
-      </w:r>
-    </w:p>
-    <w:p>
-      <w:pPr>
-        <w:spacing w:after="140"/>
+    <w:tbl>
+      <w:tblPr>
+        <w:tblW w:type="dxa" w:w="9360"/>
+        <w:tblBorders>
+          <w:top w:val="single" w:color="auto" w:sz="4"/>
+          <w:left w:val="single" w:color="auto" w:sz="4"/>
+          <w:bottom w:val="single" w:color="auto" w:sz="4"/>
+          <w:right w:val="single" w:color="auto" w:sz="4"/>
+          <w:insideH w:val="single" w:color="auto" w:sz="4"/>
+          <w:insideV w:val="single" w:color="auto" w:sz="4"/>
+        </w:tblBorders>
+      </w:tblPr>
+      <w:tblGrid>
+        <w:gridCol w:w="4680"/>
+        <w:gridCol w:w="4680"/>
+      </w:tblGrid>
+      <w:tr>
+        <w:tc>
+          <w:tcPr>
+            <w:tcW w:type="dxa" w:w="4680"/>
+            <w:tcBorders>
+              <w:top w:val="none" w:color="FFFFFF" w:sz="0"/>
+              <w:left w:val="none" w:color="FFFFFF" w:sz="0"/>
+              <w:bottom w:val="none" w:color="FFFFFF" w:sz="0"/>
+              <w:right w:val="none" w:color="FFFFFF" w:sz="0"/>
+            </w:tcBorders>
+            <w:tcMar>
+              <w:top w:type="dxa" w:w="20"/>
+              <w:left w:type="dxa" w:w="360"/>
+              <w:bottom w:type="dxa" w:w="20"/>
+              <w:right w:type="dxa" w:w="80"/>
+            </w:tcMar>
+          </w:tcPr>
+          <w:p>
+            <w:r>
+              <w:rPr>
+                <w:rFonts w:ascii="Times New Roman" w:cs="Times New Roman" w:eastAsia="Times New Roman" w:hAnsi="Times New Roman"/>
+                <w:sz w:val="20"/>
+                <w:szCs w:val="20"/>
+              </w:rPr>
+              <w:t xml:space="preserve">A. Competitor</w:t>
+            </w:r>
+          </w:p>
+        </w:tc>
+        <w:tc>
+          <w:tcPr>
+            <w:tcW w:type="dxa" w:w="4680"/>
+            <w:tcBorders>
+              <w:top w:val="none" w:color="FFFFFF" w:sz="0"/>
+              <w:left w:val="none" w:color="FFFFFF" w:sz="0"/>
+              <w:bottom w:val="none" w:color="FFFFFF" w:sz="0"/>
+              <w:right w:val="none" w:color="FFFFFF" w:sz="0"/>
+            </w:tcBorders>
+            <w:tcMar>
+              <w:top w:type="dxa" w:w="20"/>
+              <w:left w:type="dxa" w:w="360"/>
+              <w:bottom w:type="dxa" w:w="20"/>
+              <w:right w:type="dxa" w:w="80"/>
+            </w:tcMar>
+          </w:tcPr>
+          <w:p>
+            <w:r>
+              <w:rPr>
+                <w:rFonts w:ascii="Times New Roman" w:cs="Times New Roman" w:eastAsia="Times New Roman" w:hAnsi="Times New Roman"/>
+                <w:sz w:val="20"/>
+                <w:szCs w:val="20"/>
+              </w:rPr>
+              <w:t xml:space="preserve">C. Visitor</w:t>
+            </w:r>
+          </w:p>
+        </w:tc>
+      </w:tr>
+      <w:tr>
+        <w:tc>
+          <w:tcPr>
+            <w:tcW w:type="dxa" w:w="4680"/>
+            <w:tcBorders>
+              <w:top w:val="none" w:color="FFFFFF" w:sz="0"/>
+              <w:left w:val="none" w:color="FFFFFF" w:sz="0"/>
+              <w:bottom w:val="none" w:color="FFFFFF" w:sz="0"/>
+              <w:right w:val="none" w:color="FFFFFF" w:sz="0"/>
+            </w:tcBorders>
+            <w:tcMar>
+              <w:top w:type="dxa" w:w="20"/>
+              <w:left w:type="dxa" w:w="360"/>
+              <w:bottom w:type="dxa" w:w="20"/>
+              <w:right w:type="dxa" w:w="80"/>
+            </w:tcMar>
+          </w:tcPr>
+          <w:p>
+            <w:r>
+              <w:rPr>
+                <w:rFonts w:ascii="Times New Roman" w:cs="Times New Roman" w:eastAsia="Times New Roman" w:hAnsi="Times New Roman"/>
+                <w:sz w:val="20"/>
+                <w:szCs w:val="20"/>
+              </w:rPr>
+              <w:t xml:space="preserve">B. Exhibitor</w:t>
+            </w:r>
+          </w:p>
+        </w:tc>
+        <w:tc>
+          <w:tcPr>
+            <w:tcW w:type="dxa" w:w="4680"/>
+            <w:tcBorders>
+              <w:top w:val="none" w:color="FFFFFF" w:sz="0"/>
+              <w:left w:val="none" w:color="FFFFFF" w:sz="0"/>
+              <w:bottom w:val="none" w:color="FFFFFF" w:sz="0"/>
+              <w:right w:val="none" w:color="FFFFFF" w:sz="0"/>
+            </w:tcBorders>
+            <w:tcMar>
+              <w:top w:type="dxa" w:w="20"/>
+              <w:left w:type="dxa" w:w="360"/>
+              <w:bottom w:type="dxa" w:w="20"/>
+              <w:right w:type="dxa" w:w="80"/>
+            </w:tcMar>
+          </w:tcPr>
+          <w:p>
+            <w:r>
+              <w:rPr>
+                <w:rFonts w:ascii="Times New Roman" w:cs="Times New Roman" w:eastAsia="Times New Roman" w:hAnsi="Times New Roman"/>
+                <w:sz w:val="20"/>
+                <w:szCs w:val="20"/>
+              </w:rPr>
+              <w:t xml:space="preserve">D. Target audience</w:t>
+            </w:r>
+          </w:p>
+        </w:tc>
+      </w:tr>
+    </w:tbl>
+    <w:p>
+      <w:pPr>
+        <w:spacing w:after="120"/>
       </w:pPr>
     </w:p>
     <w:p>
@@ -763,65 +1128,138 @@
         <w:t xml:space="preserve">6. To welcome someone politely at the start of a conversation.</w:t>
       </w:r>
     </w:p>
-    <w:p>
-      <w:pPr>
-        <w:spacing w:after="50"/>
-        <w:ind w:left="360"/>
-      </w:pPr>
-      <w:r>
-        <w:rPr>
-          <w:rFonts w:ascii="Times New Roman" w:cs="Times New Roman" w:eastAsia="Times New Roman" w:hAnsi="Times New Roman"/>
-          <w:sz w:val="20"/>
-          <w:szCs w:val="20"/>
-        </w:rPr>
-        <w:t xml:space="preserve">A. Confirm</w:t>
-      </w:r>
-    </w:p>
-    <w:p>
-      <w:pPr>
-        <w:spacing w:after="50"/>
-        <w:ind w:left="360"/>
-      </w:pPr>
-      <w:r>
-        <w:rPr>
-          <w:rFonts w:ascii="Times New Roman" w:cs="Times New Roman" w:eastAsia="Times New Roman" w:hAnsi="Times New Roman"/>
-          <w:sz w:val="20"/>
-          <w:szCs w:val="20"/>
-        </w:rPr>
-        <w:t xml:space="preserve">B. Transfer</w:t>
-      </w:r>
-    </w:p>
-    <w:p>
-      <w:pPr>
-        <w:spacing w:after="50"/>
-        <w:ind w:left="360"/>
-      </w:pPr>
-      <w:r>
-        <w:rPr>
-          <w:rFonts w:ascii="Times New Roman" w:cs="Times New Roman" w:eastAsia="Times New Roman" w:hAnsi="Times New Roman"/>
-          <w:sz w:val="20"/>
-          <w:szCs w:val="20"/>
-        </w:rPr>
-        <w:t xml:space="preserve">C. Greet</w:t>
-      </w:r>
-    </w:p>
-    <w:p>
-      <w:pPr>
-        <w:spacing w:after="50"/>
-        <w:ind w:left="360"/>
-      </w:pPr>
-      <w:r>
-        <w:rPr>
-          <w:rFonts w:ascii="Times New Roman" w:cs="Times New Roman" w:eastAsia="Times New Roman" w:hAnsi="Times New Roman"/>
-          <w:sz w:val="20"/>
-          <w:szCs w:val="20"/>
-        </w:rPr>
-        <w:t xml:space="preserve">D. Hold</w:t>
-      </w:r>
-    </w:p>
-    <w:p>
-      <w:pPr>
-        <w:spacing w:after="140"/>
+    <w:tbl>
+      <w:tblPr>
+        <w:tblW w:type="dxa" w:w="9360"/>
+        <w:tblBorders>
+          <w:top w:val="single" w:color="auto" w:sz="4"/>
+          <w:left w:val="single" w:color="auto" w:sz="4"/>
+          <w:bottom w:val="single" w:color="auto" w:sz="4"/>
+          <w:right w:val="single" w:color="auto" w:sz="4"/>
+          <w:insideH w:val="single" w:color="auto" w:sz="4"/>
+          <w:insideV w:val="single" w:color="auto" w:sz="4"/>
+        </w:tblBorders>
+      </w:tblPr>
+      <w:tblGrid>
+        <w:gridCol w:w="4680"/>
+        <w:gridCol w:w="4680"/>
+      </w:tblGrid>
+      <w:tr>
+        <w:tc>
+          <w:tcPr>
+            <w:tcW w:type="dxa" w:w="4680"/>
+            <w:tcBorders>
+              <w:top w:val="none" w:color="FFFFFF" w:sz="0"/>
+              <w:left w:val="none" w:color="FFFFFF" w:sz="0"/>
+              <w:bottom w:val="none" w:color="FFFFFF" w:sz="0"/>
+              <w:right w:val="none" w:color="FFFFFF" w:sz="0"/>
+            </w:tcBorders>
+            <w:tcMar>
+              <w:top w:type="dxa" w:w="20"/>
+              <w:left w:type="dxa" w:w="360"/>
+              <w:bottom w:type="dxa" w:w="20"/>
+              <w:right w:type="dxa" w:w="80"/>
+            </w:tcMar>
+          </w:tcPr>
+          <w:p>
+            <w:r>
+              <w:rPr>
+                <w:rFonts w:ascii="Times New Roman" w:cs="Times New Roman" w:eastAsia="Times New Roman" w:hAnsi="Times New Roman"/>
+                <w:sz w:val="20"/>
+                <w:szCs w:val="20"/>
+              </w:rPr>
+              <w:t xml:space="preserve">A. Confirm</w:t>
+            </w:r>
+          </w:p>
+        </w:tc>
+        <w:tc>
+          <w:tcPr>
+            <w:tcW w:type="dxa" w:w="4680"/>
+            <w:tcBorders>
+              <w:top w:val="none" w:color="FFFFFF" w:sz="0"/>
+              <w:left w:val="none" w:color="FFFFFF" w:sz="0"/>
+              <w:bottom w:val="none" w:color="FFFFFF" w:sz="0"/>
+              <w:right w:val="none" w:color="FFFFFF" w:sz="0"/>
+            </w:tcBorders>
+            <w:tcMar>
+              <w:top w:type="dxa" w:w="20"/>
+              <w:left w:type="dxa" w:w="360"/>
+              <w:bottom w:type="dxa" w:w="20"/>
+              <w:right w:type="dxa" w:w="80"/>
+            </w:tcMar>
+          </w:tcPr>
+          <w:p>
+            <w:r>
+              <w:rPr>
+                <w:rFonts w:ascii="Times New Roman" w:cs="Times New Roman" w:eastAsia="Times New Roman" w:hAnsi="Times New Roman"/>
+                <w:sz w:val="20"/>
+                <w:szCs w:val="20"/>
+              </w:rPr>
+              <w:t xml:space="preserve">C. Greet</w:t>
+            </w:r>
+          </w:p>
+        </w:tc>
+      </w:tr>
+      <w:tr>
+        <w:tc>
+          <w:tcPr>
+            <w:tcW w:type="dxa" w:w="4680"/>
+            <w:tcBorders>
+              <w:top w:val="none" w:color="FFFFFF" w:sz="0"/>
+              <w:left w:val="none" w:color="FFFFFF" w:sz="0"/>
+              <w:bottom w:val="none" w:color="FFFFFF" w:sz="0"/>
+              <w:right w:val="none" w:color="FFFFFF" w:sz="0"/>
+            </w:tcBorders>
+            <w:tcMar>
+              <w:top w:type="dxa" w:w="20"/>
+              <w:left w:type="dxa" w:w="360"/>
+              <w:bottom w:type="dxa" w:w="20"/>
+              <w:right w:type="dxa" w:w="80"/>
+            </w:tcMar>
+          </w:tcPr>
+          <w:p>
+            <w:r>
+              <w:rPr>
+                <w:rFonts w:ascii="Times New Roman" w:cs="Times New Roman" w:eastAsia="Times New Roman" w:hAnsi="Times New Roman"/>
+                <w:sz w:val="20"/>
+                <w:szCs w:val="20"/>
+              </w:rPr>
+              <w:t xml:space="preserve">B. Transfer</w:t>
+            </w:r>
+          </w:p>
+        </w:tc>
+        <w:tc>
+          <w:tcPr>
+            <w:tcW w:type="dxa" w:w="4680"/>
+            <w:tcBorders>
+              <w:top w:val="none" w:color="FFFFFF" w:sz="0"/>
+              <w:left w:val="none" w:color="FFFFFF" w:sz="0"/>
+              <w:bottom w:val="none" w:color="FFFFFF" w:sz="0"/>
+              <w:right w:val="none" w:color="FFFFFF" w:sz="0"/>
+            </w:tcBorders>
+            <w:tcMar>
+              <w:top w:type="dxa" w:w="20"/>
+              <w:left w:type="dxa" w:w="360"/>
+              <w:bottom w:type="dxa" w:w="20"/>
+              <w:right w:type="dxa" w:w="80"/>
+            </w:tcMar>
+          </w:tcPr>
+          <w:p>
+            <w:r>
+              <w:rPr>
+                <w:rFonts w:ascii="Times New Roman" w:cs="Times New Roman" w:eastAsia="Times New Roman" w:hAnsi="Times New Roman"/>
+                <w:sz w:val="20"/>
+                <w:szCs w:val="20"/>
+              </w:rPr>
+              <w:t xml:space="preserve">D. Hold</w:t>
+            </w:r>
+          </w:p>
+        </w:tc>
+      </w:tr>
+    </w:tbl>
+    <w:p>
+      <w:pPr>
+        <w:spacing w:after="120"/>
       </w:pPr>
     </w:p>
     <w:p>
@@ -837,65 +1275,138 @@
         <w:t xml:space="preserve">7. To connect a caller to a different person or extension without ending the call.</w:t>
       </w:r>
     </w:p>
-    <w:p>
-      <w:pPr>
-        <w:spacing w:after="50"/>
-        <w:ind w:left="360"/>
-      </w:pPr>
-      <w:r>
-        <w:rPr>
-          <w:rFonts w:ascii="Times New Roman" w:cs="Times New Roman" w:eastAsia="Times New Roman" w:hAnsi="Times New Roman"/>
-          <w:sz w:val="20"/>
-          <w:szCs w:val="20"/>
-        </w:rPr>
-        <w:t xml:space="preserve">A. Direct</w:t>
-      </w:r>
-    </w:p>
-    <w:p>
-      <w:pPr>
-        <w:spacing w:after="50"/>
-        <w:ind w:left="360"/>
-      </w:pPr>
-      <w:r>
-        <w:rPr>
-          <w:rFonts w:ascii="Times New Roman" w:cs="Times New Roman" w:eastAsia="Times New Roman" w:hAnsi="Times New Roman"/>
-          <w:sz w:val="20"/>
-          <w:szCs w:val="20"/>
-        </w:rPr>
-        <w:t xml:space="preserve">B. Transfer</w:t>
-      </w:r>
-    </w:p>
-    <w:p>
-      <w:pPr>
-        <w:spacing w:after="50"/>
-        <w:ind w:left="360"/>
-      </w:pPr>
-      <w:r>
-        <w:rPr>
-          <w:rFonts w:ascii="Times New Roman" w:cs="Times New Roman" w:eastAsia="Times New Roman" w:hAnsi="Times New Roman"/>
-          <w:sz w:val="20"/>
-          <w:szCs w:val="20"/>
-        </w:rPr>
-        <w:t xml:space="preserve">C. Hold</w:t>
-      </w:r>
-    </w:p>
-    <w:p>
-      <w:pPr>
-        <w:spacing w:after="50"/>
-        <w:ind w:left="360"/>
-      </w:pPr>
-      <w:r>
-        <w:rPr>
-          <w:rFonts w:ascii="Times New Roman" w:cs="Times New Roman" w:eastAsia="Times New Roman" w:hAnsi="Times New Roman"/>
-          <w:sz w:val="20"/>
-          <w:szCs w:val="20"/>
-        </w:rPr>
-        <w:t xml:space="preserve">D. Extension</w:t>
-      </w:r>
-    </w:p>
-    <w:p>
-      <w:pPr>
-        <w:spacing w:after="140"/>
+    <w:tbl>
+      <w:tblPr>
+        <w:tblW w:type="dxa" w:w="9360"/>
+        <w:tblBorders>
+          <w:top w:val="single" w:color="auto" w:sz="4"/>
+          <w:left w:val="single" w:color="auto" w:sz="4"/>
+          <w:bottom w:val="single" w:color="auto" w:sz="4"/>
+          <w:right w:val="single" w:color="auto" w:sz="4"/>
+          <w:insideH w:val="single" w:color="auto" w:sz="4"/>
+          <w:insideV w:val="single" w:color="auto" w:sz="4"/>
+        </w:tblBorders>
+      </w:tblPr>
+      <w:tblGrid>
+        <w:gridCol w:w="4680"/>
+        <w:gridCol w:w="4680"/>
+      </w:tblGrid>
+      <w:tr>
+        <w:tc>
+          <w:tcPr>
+            <w:tcW w:type="dxa" w:w="4680"/>
+            <w:tcBorders>
+              <w:top w:val="none" w:color="FFFFFF" w:sz="0"/>
+              <w:left w:val="none" w:color="FFFFFF" w:sz="0"/>
+              <w:bottom w:val="none" w:color="FFFFFF" w:sz="0"/>
+              <w:right w:val="none" w:color="FFFFFF" w:sz="0"/>
+            </w:tcBorders>
+            <w:tcMar>
+              <w:top w:type="dxa" w:w="20"/>
+              <w:left w:type="dxa" w:w="360"/>
+              <w:bottom w:type="dxa" w:w="20"/>
+              <w:right w:type="dxa" w:w="80"/>
+            </w:tcMar>
+          </w:tcPr>
+          <w:p>
+            <w:r>
+              <w:rPr>
+                <w:rFonts w:ascii="Times New Roman" w:cs="Times New Roman" w:eastAsia="Times New Roman" w:hAnsi="Times New Roman"/>
+                <w:sz w:val="20"/>
+                <w:szCs w:val="20"/>
+              </w:rPr>
+              <w:t xml:space="preserve">A. Direct</w:t>
+            </w:r>
+          </w:p>
+        </w:tc>
+        <w:tc>
+          <w:tcPr>
+            <w:tcW w:type="dxa" w:w="4680"/>
+            <w:tcBorders>
+              <w:top w:val="none" w:color="FFFFFF" w:sz="0"/>
+              <w:left w:val="none" w:color="FFFFFF" w:sz="0"/>
+              <w:bottom w:val="none" w:color="FFFFFF" w:sz="0"/>
+              <w:right w:val="none" w:color="FFFFFF" w:sz="0"/>
+            </w:tcBorders>
+            <w:tcMar>
+              <w:top w:type="dxa" w:w="20"/>
+              <w:left w:type="dxa" w:w="360"/>
+              <w:bottom w:type="dxa" w:w="20"/>
+              <w:right w:type="dxa" w:w="80"/>
+            </w:tcMar>
+          </w:tcPr>
+          <w:p>
+            <w:r>
+              <w:rPr>
+                <w:rFonts w:ascii="Times New Roman" w:cs="Times New Roman" w:eastAsia="Times New Roman" w:hAnsi="Times New Roman"/>
+                <w:sz w:val="20"/>
+                <w:szCs w:val="20"/>
+              </w:rPr>
+              <w:t xml:space="preserve">C. Hold</w:t>
+            </w:r>
+          </w:p>
+        </w:tc>
+      </w:tr>
+      <w:tr>
+        <w:tc>
+          <w:tcPr>
+            <w:tcW w:type="dxa" w:w="4680"/>
+            <w:tcBorders>
+              <w:top w:val="none" w:color="FFFFFF" w:sz="0"/>
+              <w:left w:val="none" w:color="FFFFFF" w:sz="0"/>
+              <w:bottom w:val="none" w:color="FFFFFF" w:sz="0"/>
+              <w:right w:val="none" w:color="FFFFFF" w:sz="0"/>
+            </w:tcBorders>
+            <w:tcMar>
+              <w:top w:type="dxa" w:w="20"/>
+              <w:left w:type="dxa" w:w="360"/>
+              <w:bottom w:type="dxa" w:w="20"/>
+              <w:right w:type="dxa" w:w="80"/>
+            </w:tcMar>
+          </w:tcPr>
+          <w:p>
+            <w:r>
+              <w:rPr>
+                <w:rFonts w:ascii="Times New Roman" w:cs="Times New Roman" w:eastAsia="Times New Roman" w:hAnsi="Times New Roman"/>
+                <w:sz w:val="20"/>
+                <w:szCs w:val="20"/>
+              </w:rPr>
+              <w:t xml:space="preserve">B. Transfer</w:t>
+            </w:r>
+          </w:p>
+        </w:tc>
+        <w:tc>
+          <w:tcPr>
+            <w:tcW w:type="dxa" w:w="4680"/>
+            <w:tcBorders>
+              <w:top w:val="none" w:color="FFFFFF" w:sz="0"/>
+              <w:left w:val="none" w:color="FFFFFF" w:sz="0"/>
+              <w:bottom w:val="none" w:color="FFFFFF" w:sz="0"/>
+              <w:right w:val="none" w:color="FFFFFF" w:sz="0"/>
+            </w:tcBorders>
+            <w:tcMar>
+              <w:top w:type="dxa" w:w="20"/>
+              <w:left w:type="dxa" w:w="360"/>
+              <w:bottom w:type="dxa" w:w="20"/>
+              <w:right w:type="dxa" w:w="80"/>
+            </w:tcMar>
+          </w:tcPr>
+          <w:p>
+            <w:r>
+              <w:rPr>
+                <w:rFonts w:ascii="Times New Roman" w:cs="Times New Roman" w:eastAsia="Times New Roman" w:hAnsi="Times New Roman"/>
+                <w:sz w:val="20"/>
+                <w:szCs w:val="20"/>
+              </w:rPr>
+              <w:t xml:space="preserve">D. Extension</w:t>
+            </w:r>
+          </w:p>
+        </w:tc>
+      </w:tr>
+    </w:tbl>
+    <w:p>
+      <w:pPr>
+        <w:spacing w:after="120"/>
       </w:pPr>
     </w:p>
     <w:p>
@@ -911,65 +1422,138 @@
         <w:t xml:space="preserve">8. A short internal phone number connecting directly to one desk or person.</w:t>
       </w:r>
     </w:p>
-    <w:p>
-      <w:pPr>
-        <w:spacing w:after="50"/>
-        <w:ind w:left="360"/>
-      </w:pPr>
-      <w:r>
-        <w:rPr>
-          <w:rFonts w:ascii="Times New Roman" w:cs="Times New Roman" w:eastAsia="Times New Roman" w:hAnsi="Times New Roman"/>
-          <w:sz w:val="20"/>
-          <w:szCs w:val="20"/>
-        </w:rPr>
-        <w:t xml:space="preserve">A. Caller</w:t>
-      </w:r>
-    </w:p>
-    <w:p>
-      <w:pPr>
-        <w:spacing w:after="50"/>
-        <w:ind w:left="360"/>
-      </w:pPr>
-      <w:r>
-        <w:rPr>
-          <w:rFonts w:ascii="Times New Roman" w:cs="Times New Roman" w:eastAsia="Times New Roman" w:hAnsi="Times New Roman"/>
-          <w:sz w:val="20"/>
-          <w:szCs w:val="20"/>
-        </w:rPr>
-        <w:t xml:space="preserve">B. Message</w:t>
-      </w:r>
-    </w:p>
-    <w:p>
-      <w:pPr>
-        <w:spacing w:after="50"/>
-        <w:ind w:left="360"/>
-      </w:pPr>
-      <w:r>
-        <w:rPr>
-          <w:rFonts w:ascii="Times New Roman" w:cs="Times New Roman" w:eastAsia="Times New Roman" w:hAnsi="Times New Roman"/>
-          <w:sz w:val="20"/>
-          <w:szCs w:val="20"/>
-        </w:rPr>
-        <w:t xml:space="preserve">C. Extension</w:t>
-      </w:r>
-    </w:p>
-    <w:p>
-      <w:pPr>
-        <w:spacing w:after="50"/>
-        <w:ind w:left="360"/>
-      </w:pPr>
-      <w:r>
-        <w:rPr>
-          <w:rFonts w:ascii="Times New Roman" w:cs="Times New Roman" w:eastAsia="Times New Roman" w:hAnsi="Times New Roman"/>
-          <w:sz w:val="20"/>
-          <w:szCs w:val="20"/>
-        </w:rPr>
-        <w:t xml:space="preserve">D. Confirm</w:t>
-      </w:r>
-    </w:p>
-    <w:p>
-      <w:pPr>
-        <w:spacing w:after="140"/>
+    <w:tbl>
+      <w:tblPr>
+        <w:tblW w:type="dxa" w:w="9360"/>
+        <w:tblBorders>
+          <w:top w:val="single" w:color="auto" w:sz="4"/>
+          <w:left w:val="single" w:color="auto" w:sz="4"/>
+          <w:bottom w:val="single" w:color="auto" w:sz="4"/>
+          <w:right w:val="single" w:color="auto" w:sz="4"/>
+          <w:insideH w:val="single" w:color="auto" w:sz="4"/>
+          <w:insideV w:val="single" w:color="auto" w:sz="4"/>
+        </w:tblBorders>
+      </w:tblPr>
+      <w:tblGrid>
+        <w:gridCol w:w="4680"/>
+        <w:gridCol w:w="4680"/>
+      </w:tblGrid>
+      <w:tr>
+        <w:tc>
+          <w:tcPr>
+            <w:tcW w:type="dxa" w:w="4680"/>
+            <w:tcBorders>
+              <w:top w:val="none" w:color="FFFFFF" w:sz="0"/>
+              <w:left w:val="none" w:color="FFFFFF" w:sz="0"/>
+              <w:bottom w:val="none" w:color="FFFFFF" w:sz="0"/>
+              <w:right w:val="none" w:color="FFFFFF" w:sz="0"/>
+            </w:tcBorders>
+            <w:tcMar>
+              <w:top w:type="dxa" w:w="20"/>
+              <w:left w:type="dxa" w:w="360"/>
+              <w:bottom w:type="dxa" w:w="20"/>
+              <w:right w:type="dxa" w:w="80"/>
+            </w:tcMar>
+          </w:tcPr>
+          <w:p>
+            <w:r>
+              <w:rPr>
+                <w:rFonts w:ascii="Times New Roman" w:cs="Times New Roman" w:eastAsia="Times New Roman" w:hAnsi="Times New Roman"/>
+                <w:sz w:val="20"/>
+                <w:szCs w:val="20"/>
+              </w:rPr>
+              <w:t xml:space="preserve">A. Caller</w:t>
+            </w:r>
+          </w:p>
+        </w:tc>
+        <w:tc>
+          <w:tcPr>
+            <w:tcW w:type="dxa" w:w="4680"/>
+            <w:tcBorders>
+              <w:top w:val="none" w:color="FFFFFF" w:sz="0"/>
+              <w:left w:val="none" w:color="FFFFFF" w:sz="0"/>
+              <w:bottom w:val="none" w:color="FFFFFF" w:sz="0"/>
+              <w:right w:val="none" w:color="FFFFFF" w:sz="0"/>
+            </w:tcBorders>
+            <w:tcMar>
+              <w:top w:type="dxa" w:w="20"/>
+              <w:left w:type="dxa" w:w="360"/>
+              <w:bottom w:type="dxa" w:w="20"/>
+              <w:right w:type="dxa" w:w="80"/>
+            </w:tcMar>
+          </w:tcPr>
+          <w:p>
+            <w:r>
+              <w:rPr>
+                <w:rFonts w:ascii="Times New Roman" w:cs="Times New Roman" w:eastAsia="Times New Roman" w:hAnsi="Times New Roman"/>
+                <w:sz w:val="20"/>
+                <w:szCs w:val="20"/>
+              </w:rPr>
+              <w:t xml:space="preserve">C. Extension</w:t>
+            </w:r>
+          </w:p>
+        </w:tc>
+      </w:tr>
+      <w:tr>
+        <w:tc>
+          <w:tcPr>
+            <w:tcW w:type="dxa" w:w="4680"/>
+            <w:tcBorders>
+              <w:top w:val="none" w:color="FFFFFF" w:sz="0"/>
+              <w:left w:val="none" w:color="FFFFFF" w:sz="0"/>
+              <w:bottom w:val="none" w:color="FFFFFF" w:sz="0"/>
+              <w:right w:val="none" w:color="FFFFFF" w:sz="0"/>
+            </w:tcBorders>
+            <w:tcMar>
+              <w:top w:type="dxa" w:w="20"/>
+              <w:left w:type="dxa" w:w="360"/>
+              <w:bottom w:type="dxa" w:w="20"/>
+              <w:right w:type="dxa" w:w="80"/>
+            </w:tcMar>
+          </w:tcPr>
+          <w:p>
+            <w:r>
+              <w:rPr>
+                <w:rFonts w:ascii="Times New Roman" w:cs="Times New Roman" w:eastAsia="Times New Roman" w:hAnsi="Times New Roman"/>
+                <w:sz w:val="20"/>
+                <w:szCs w:val="20"/>
+              </w:rPr>
+              <w:t xml:space="preserve">B. Message</w:t>
+            </w:r>
+          </w:p>
+        </w:tc>
+        <w:tc>
+          <w:tcPr>
+            <w:tcW w:type="dxa" w:w="4680"/>
+            <w:tcBorders>
+              <w:top w:val="none" w:color="FFFFFF" w:sz="0"/>
+              <w:left w:val="none" w:color="FFFFFF" w:sz="0"/>
+              <w:bottom w:val="none" w:color="FFFFFF" w:sz="0"/>
+              <w:right w:val="none" w:color="FFFFFF" w:sz="0"/>
+            </w:tcBorders>
+            <w:tcMar>
+              <w:top w:type="dxa" w:w="20"/>
+              <w:left w:type="dxa" w:w="360"/>
+              <w:bottom w:type="dxa" w:w="20"/>
+              <w:right w:type="dxa" w:w="80"/>
+            </w:tcMar>
+          </w:tcPr>
+          <w:p>
+            <w:r>
+              <w:rPr>
+                <w:rFonts w:ascii="Times New Roman" w:cs="Times New Roman" w:eastAsia="Times New Roman" w:hAnsi="Times New Roman"/>
+                <w:sz w:val="20"/>
+                <w:szCs w:val="20"/>
+              </w:rPr>
+              <w:t xml:space="preserve">D. Confirm</w:t>
+            </w:r>
+          </w:p>
+        </w:tc>
+      </w:tr>
+    </w:tbl>
+    <w:p>
+      <w:pPr>
+        <w:spacing w:after="120"/>
       </w:pPr>
     </w:p>
     <w:p>
@@ -985,65 +1569,138 @@
         <w:t xml:space="preserve">9. To say clearly that something is true or correct.</w:t>
       </w:r>
     </w:p>
-    <w:p>
-      <w:pPr>
-        <w:spacing w:after="50"/>
-        <w:ind w:left="360"/>
-      </w:pPr>
-      <w:r>
-        <w:rPr>
-          <w:rFonts w:ascii="Times New Roman" w:cs="Times New Roman" w:eastAsia="Times New Roman" w:hAnsi="Times New Roman"/>
-          <w:sz w:val="20"/>
-          <w:szCs w:val="20"/>
-        </w:rPr>
-        <w:t xml:space="preserve">A. Confirm</w:t>
-      </w:r>
-    </w:p>
-    <w:p>
-      <w:pPr>
-        <w:spacing w:after="50"/>
-        <w:ind w:left="360"/>
-      </w:pPr>
-      <w:r>
-        <w:rPr>
-          <w:rFonts w:ascii="Times New Roman" w:cs="Times New Roman" w:eastAsia="Times New Roman" w:hAnsi="Times New Roman"/>
-          <w:sz w:val="20"/>
-          <w:szCs w:val="20"/>
-        </w:rPr>
-        <w:t xml:space="preserve">B. Introduce</w:t>
-      </w:r>
-    </w:p>
-    <w:p>
-      <w:pPr>
-        <w:spacing w:after="50"/>
-        <w:ind w:left="360"/>
-      </w:pPr>
-      <w:r>
-        <w:rPr>
-          <w:rFonts w:ascii="Times New Roman" w:cs="Times New Roman" w:eastAsia="Times New Roman" w:hAnsi="Times New Roman"/>
-          <w:sz w:val="20"/>
-          <w:szCs w:val="20"/>
-        </w:rPr>
-        <w:t xml:space="preserve">C. Greet</w:t>
-      </w:r>
-    </w:p>
-    <w:p>
-      <w:pPr>
-        <w:spacing w:after="50"/>
-        <w:ind w:left="360"/>
-      </w:pPr>
-      <w:r>
-        <w:rPr>
-          <w:rFonts w:ascii="Times New Roman" w:cs="Times New Roman" w:eastAsia="Times New Roman" w:hAnsi="Times New Roman"/>
-          <w:sz w:val="20"/>
-          <w:szCs w:val="20"/>
-        </w:rPr>
-        <w:t xml:space="preserve">D. Transfer</w:t>
-      </w:r>
-    </w:p>
-    <w:p>
-      <w:pPr>
-        <w:spacing w:after="140"/>
+    <w:tbl>
+      <w:tblPr>
+        <w:tblW w:type="dxa" w:w="9360"/>
+        <w:tblBorders>
+          <w:top w:val="single" w:color="auto" w:sz="4"/>
+          <w:left w:val="single" w:color="auto" w:sz="4"/>
+          <w:bottom w:val="single" w:color="auto" w:sz="4"/>
+          <w:right w:val="single" w:color="auto" w:sz="4"/>
+          <w:insideH w:val="single" w:color="auto" w:sz="4"/>
+          <w:insideV w:val="single" w:color="auto" w:sz="4"/>
+        </w:tblBorders>
+      </w:tblPr>
+      <w:tblGrid>
+        <w:gridCol w:w="4680"/>
+        <w:gridCol w:w="4680"/>
+      </w:tblGrid>
+      <w:tr>
+        <w:tc>
+          <w:tcPr>
+            <w:tcW w:type="dxa" w:w="4680"/>
+            <w:tcBorders>
+              <w:top w:val="none" w:color="FFFFFF" w:sz="0"/>
+              <w:left w:val="none" w:color="FFFFFF" w:sz="0"/>
+              <w:bottom w:val="none" w:color="FFFFFF" w:sz="0"/>
+              <w:right w:val="none" w:color="FFFFFF" w:sz="0"/>
+            </w:tcBorders>
+            <w:tcMar>
+              <w:top w:type="dxa" w:w="20"/>
+              <w:left w:type="dxa" w:w="360"/>
+              <w:bottom w:type="dxa" w:w="20"/>
+              <w:right w:type="dxa" w:w="80"/>
+            </w:tcMar>
+          </w:tcPr>
+          <w:p>
+            <w:r>
+              <w:rPr>
+                <w:rFonts w:ascii="Times New Roman" w:cs="Times New Roman" w:eastAsia="Times New Roman" w:hAnsi="Times New Roman"/>
+                <w:sz w:val="20"/>
+                <w:szCs w:val="20"/>
+              </w:rPr>
+              <w:t xml:space="preserve">A. Confirm</w:t>
+            </w:r>
+          </w:p>
+        </w:tc>
+        <w:tc>
+          <w:tcPr>
+            <w:tcW w:type="dxa" w:w="4680"/>
+            <w:tcBorders>
+              <w:top w:val="none" w:color="FFFFFF" w:sz="0"/>
+              <w:left w:val="none" w:color="FFFFFF" w:sz="0"/>
+              <w:bottom w:val="none" w:color="FFFFFF" w:sz="0"/>
+              <w:right w:val="none" w:color="FFFFFF" w:sz="0"/>
+            </w:tcBorders>
+            <w:tcMar>
+              <w:top w:type="dxa" w:w="20"/>
+              <w:left w:type="dxa" w:w="360"/>
+              <w:bottom w:type="dxa" w:w="20"/>
+              <w:right w:type="dxa" w:w="80"/>
+            </w:tcMar>
+          </w:tcPr>
+          <w:p>
+            <w:r>
+              <w:rPr>
+                <w:rFonts w:ascii="Times New Roman" w:cs="Times New Roman" w:eastAsia="Times New Roman" w:hAnsi="Times New Roman"/>
+                <w:sz w:val="20"/>
+                <w:szCs w:val="20"/>
+              </w:rPr>
+              <w:t xml:space="preserve">C. Greet</w:t>
+            </w:r>
+          </w:p>
+        </w:tc>
+      </w:tr>
+      <w:tr>
+        <w:tc>
+          <w:tcPr>
+            <w:tcW w:type="dxa" w:w="4680"/>
+            <w:tcBorders>
+              <w:top w:val="none" w:color="FFFFFF" w:sz="0"/>
+              <w:left w:val="none" w:color="FFFFFF" w:sz="0"/>
+              <w:bottom w:val="none" w:color="FFFFFF" w:sz="0"/>
+              <w:right w:val="none" w:color="FFFFFF" w:sz="0"/>
+            </w:tcBorders>
+            <w:tcMar>
+              <w:top w:type="dxa" w:w="20"/>
+              <w:left w:type="dxa" w:w="360"/>
+              <w:bottom w:type="dxa" w:w="20"/>
+              <w:right w:type="dxa" w:w="80"/>
+            </w:tcMar>
+          </w:tcPr>
+          <w:p>
+            <w:r>
+              <w:rPr>
+                <w:rFonts w:ascii="Times New Roman" w:cs="Times New Roman" w:eastAsia="Times New Roman" w:hAnsi="Times New Roman"/>
+                <w:sz w:val="20"/>
+                <w:szCs w:val="20"/>
+              </w:rPr>
+              <w:t xml:space="preserve">B. Introduce</w:t>
+            </w:r>
+          </w:p>
+        </w:tc>
+        <w:tc>
+          <w:tcPr>
+            <w:tcW w:type="dxa" w:w="4680"/>
+            <w:tcBorders>
+              <w:top w:val="none" w:color="FFFFFF" w:sz="0"/>
+              <w:left w:val="none" w:color="FFFFFF" w:sz="0"/>
+              <w:bottom w:val="none" w:color="FFFFFF" w:sz="0"/>
+              <w:right w:val="none" w:color="FFFFFF" w:sz="0"/>
+            </w:tcBorders>
+            <w:tcMar>
+              <w:top w:type="dxa" w:w="20"/>
+              <w:left w:type="dxa" w:w="360"/>
+              <w:bottom w:type="dxa" w:w="20"/>
+              <w:right w:type="dxa" w:w="80"/>
+            </w:tcMar>
+          </w:tcPr>
+          <w:p>
+            <w:r>
+              <w:rPr>
+                <w:rFonts w:ascii="Times New Roman" w:cs="Times New Roman" w:eastAsia="Times New Roman" w:hAnsi="Times New Roman"/>
+                <w:sz w:val="20"/>
+                <w:szCs w:val="20"/>
+              </w:rPr>
+              <w:t xml:space="preserve">D. Transfer</w:t>
+            </w:r>
+          </w:p>
+        </w:tc>
+      </w:tr>
+    </w:tbl>
+    <w:p>
+      <w:pPr>
+        <w:spacing w:after="120"/>
       </w:pPr>
     </w:p>
     <w:p>
@@ -1059,65 +1716,138 @@
         <w:t xml:space="preserve">10. Information you write down and pass on for someone else.</w:t>
       </w:r>
     </w:p>
-    <w:p>
-      <w:pPr>
-        <w:spacing w:after="50"/>
-        <w:ind w:left="360"/>
-      </w:pPr>
-      <w:r>
-        <w:rPr>
-          <w:rFonts w:ascii="Times New Roman" w:cs="Times New Roman" w:eastAsia="Times New Roman" w:hAnsi="Times New Roman"/>
-          <w:sz w:val="20"/>
-          <w:szCs w:val="20"/>
-        </w:rPr>
-        <w:t xml:space="preserve">A. Caller</w:t>
-      </w:r>
-    </w:p>
-    <w:p>
-      <w:pPr>
-        <w:spacing w:after="50"/>
-        <w:ind w:left="360"/>
-      </w:pPr>
-      <w:r>
-        <w:rPr>
-          <w:rFonts w:ascii="Times New Roman" w:cs="Times New Roman" w:eastAsia="Times New Roman" w:hAnsi="Times New Roman"/>
-          <w:sz w:val="20"/>
-          <w:szCs w:val="20"/>
-        </w:rPr>
-        <w:t xml:space="preserve">B. Message</w:t>
-      </w:r>
-    </w:p>
-    <w:p>
-      <w:pPr>
-        <w:spacing w:after="50"/>
-        <w:ind w:left="360"/>
-      </w:pPr>
-      <w:r>
-        <w:rPr>
-          <w:rFonts w:ascii="Times New Roman" w:cs="Times New Roman" w:eastAsia="Times New Roman" w:hAnsi="Times New Roman"/>
-          <w:sz w:val="20"/>
-          <w:szCs w:val="20"/>
-        </w:rPr>
-        <w:t xml:space="preserve">C. Hold</w:t>
-      </w:r>
-    </w:p>
-    <w:p>
-      <w:pPr>
-        <w:spacing w:after="50"/>
-        <w:ind w:left="360"/>
-      </w:pPr>
-      <w:r>
-        <w:rPr>
-          <w:rFonts w:ascii="Times New Roman" w:cs="Times New Roman" w:eastAsia="Times New Roman" w:hAnsi="Times New Roman"/>
-          <w:sz w:val="20"/>
-          <w:szCs w:val="20"/>
-        </w:rPr>
-        <w:t xml:space="preserve">D. Extension</w:t>
-      </w:r>
-    </w:p>
-    <w:p>
-      <w:pPr>
-        <w:spacing w:after="140"/>
+    <w:tbl>
+      <w:tblPr>
+        <w:tblW w:type="dxa" w:w="9360"/>
+        <w:tblBorders>
+          <w:top w:val="single" w:color="auto" w:sz="4"/>
+          <w:left w:val="single" w:color="auto" w:sz="4"/>
+          <w:bottom w:val="single" w:color="auto" w:sz="4"/>
+          <w:right w:val="single" w:color="auto" w:sz="4"/>
+          <w:insideH w:val="single" w:color="auto" w:sz="4"/>
+          <w:insideV w:val="single" w:color="auto" w:sz="4"/>
+        </w:tblBorders>
+      </w:tblPr>
+      <w:tblGrid>
+        <w:gridCol w:w="4680"/>
+        <w:gridCol w:w="4680"/>
+      </w:tblGrid>
+      <w:tr>
+        <w:tc>
+          <w:tcPr>
+            <w:tcW w:type="dxa" w:w="4680"/>
+            <w:tcBorders>
+              <w:top w:val="none" w:color="FFFFFF" w:sz="0"/>
+              <w:left w:val="none" w:color="FFFFFF" w:sz="0"/>
+              <w:bottom w:val="none" w:color="FFFFFF" w:sz="0"/>
+              <w:right w:val="none" w:color="FFFFFF" w:sz="0"/>
+            </w:tcBorders>
+            <w:tcMar>
+              <w:top w:type="dxa" w:w="20"/>
+              <w:left w:type="dxa" w:w="360"/>
+              <w:bottom w:type="dxa" w:w="20"/>
+              <w:right w:type="dxa" w:w="80"/>
+            </w:tcMar>
+          </w:tcPr>
+          <w:p>
+            <w:r>
+              <w:rPr>
+                <w:rFonts w:ascii="Times New Roman" w:cs="Times New Roman" w:eastAsia="Times New Roman" w:hAnsi="Times New Roman"/>
+                <w:sz w:val="20"/>
+                <w:szCs w:val="20"/>
+              </w:rPr>
+              <w:t xml:space="preserve">A. Caller</w:t>
+            </w:r>
+          </w:p>
+        </w:tc>
+        <w:tc>
+          <w:tcPr>
+            <w:tcW w:type="dxa" w:w="4680"/>
+            <w:tcBorders>
+              <w:top w:val="none" w:color="FFFFFF" w:sz="0"/>
+              <w:left w:val="none" w:color="FFFFFF" w:sz="0"/>
+              <w:bottom w:val="none" w:color="FFFFFF" w:sz="0"/>
+              <w:right w:val="none" w:color="FFFFFF" w:sz="0"/>
+            </w:tcBorders>
+            <w:tcMar>
+              <w:top w:type="dxa" w:w="20"/>
+              <w:left w:type="dxa" w:w="360"/>
+              <w:bottom w:type="dxa" w:w="20"/>
+              <w:right w:type="dxa" w:w="80"/>
+            </w:tcMar>
+          </w:tcPr>
+          <w:p>
+            <w:r>
+              <w:rPr>
+                <w:rFonts w:ascii="Times New Roman" w:cs="Times New Roman" w:eastAsia="Times New Roman" w:hAnsi="Times New Roman"/>
+                <w:sz w:val="20"/>
+                <w:szCs w:val="20"/>
+              </w:rPr>
+              <w:t xml:space="preserve">C. Hold</w:t>
+            </w:r>
+          </w:p>
+        </w:tc>
+      </w:tr>
+      <w:tr>
+        <w:tc>
+          <w:tcPr>
+            <w:tcW w:type="dxa" w:w="4680"/>
+            <w:tcBorders>
+              <w:top w:val="none" w:color="FFFFFF" w:sz="0"/>
+              <w:left w:val="none" w:color="FFFFFF" w:sz="0"/>
+              <w:bottom w:val="none" w:color="FFFFFF" w:sz="0"/>
+              <w:right w:val="none" w:color="FFFFFF" w:sz="0"/>
+            </w:tcBorders>
+            <w:tcMar>
+              <w:top w:type="dxa" w:w="20"/>
+              <w:left w:type="dxa" w:w="360"/>
+              <w:bottom w:type="dxa" w:w="20"/>
+              <w:right w:type="dxa" w:w="80"/>
+            </w:tcMar>
+          </w:tcPr>
+          <w:p>
+            <w:r>
+              <w:rPr>
+                <w:rFonts w:ascii="Times New Roman" w:cs="Times New Roman" w:eastAsia="Times New Roman" w:hAnsi="Times New Roman"/>
+                <w:sz w:val="20"/>
+                <w:szCs w:val="20"/>
+              </w:rPr>
+              <w:t xml:space="preserve">B. Message</w:t>
+            </w:r>
+          </w:p>
+        </w:tc>
+        <w:tc>
+          <w:tcPr>
+            <w:tcW w:type="dxa" w:w="4680"/>
+            <w:tcBorders>
+              <w:top w:val="none" w:color="FFFFFF" w:sz="0"/>
+              <w:left w:val="none" w:color="FFFFFF" w:sz="0"/>
+              <w:bottom w:val="none" w:color="FFFFFF" w:sz="0"/>
+              <w:right w:val="none" w:color="FFFFFF" w:sz="0"/>
+            </w:tcBorders>
+            <w:tcMar>
+              <w:top w:type="dxa" w:w="20"/>
+              <w:left w:type="dxa" w:w="360"/>
+              <w:bottom w:type="dxa" w:w="20"/>
+              <w:right w:type="dxa" w:w="80"/>
+            </w:tcMar>
+          </w:tcPr>
+          <w:p>
+            <w:r>
+              <w:rPr>
+                <w:rFonts w:ascii="Times New Roman" w:cs="Times New Roman" w:eastAsia="Times New Roman" w:hAnsi="Times New Roman"/>
+                <w:sz w:val="20"/>
+                <w:szCs w:val="20"/>
+              </w:rPr>
+              <w:t xml:space="preserve">D. Extension</w:t>
+            </w:r>
+          </w:p>
+        </w:tc>
+      </w:tr>
+    </w:tbl>
+    <w:p>
+      <w:pPr>
+        <w:spacing w:after="120"/>
       </w:pPr>
     </w:p>
     <w:p>
@@ -1136,7 +1866,7 @@
           <w:sz w:val="27"/>
           <w:szCs w:val="27"/>
         </w:rPr>
-        <w:t xml:space="preserve">Part II — True or False (Units 9–11)</w:t>
+        <w:t xml:space="preserve">Part II: True or False</w:t>
       </w:r>
     </w:p>
     <w:p>
@@ -1152,7 +1882,7 @@
           <w:sz w:val="19"/>
           <w:szCs w:val="19"/>
         </w:rPr>
-        <w:t xml:space="preserve">10 items × 1 point = 10 points</w:t>
+        <w:t xml:space="preserve">10 points</w:t>
       </w:r>
     </w:p>
     <w:p>
@@ -1168,295 +1898,815 @@
         <w:t xml:space="preserve">Write TRUE or FALSE on the line for each statement.</w:t>
       </w:r>
     </w:p>
-    <w:p>
-      <w:pPr>
-        <w:spacing w:after="130"/>
-      </w:pPr>
-      <w:r>
-        <w:rPr>
-          <w:rFonts w:ascii="Times New Roman" w:cs="Times New Roman" w:eastAsia="Times New Roman" w:hAnsi="Times New Roman"/>
-          <w:sz w:val="20"/>
-          <w:szCs w:val="20"/>
-        </w:rPr>
-        <w:t xml:space="preserve">1. </w:t>
-      </w:r>
-      <w:r>
-        <w:rPr>
-          <w:rFonts w:ascii="Times New Roman" w:cs="Times New Roman" w:eastAsia="Times New Roman" w:hAnsi="Times New Roman"/>
-          <w:sz w:val="20"/>
-          <w:szCs w:val="20"/>
-        </w:rPr>
-        <w:t xml:space="preserve">A "lead" is a visitor who shows real interest and might become a customer.</w:t>
-      </w:r>
-      <w:r>
-        <w:rPr>
-          <w:rFonts w:ascii="Times New Roman" w:cs="Times New Roman" w:eastAsia="Times New Roman" w:hAnsi="Times New Roman"/>
-          <w:sz w:val="20"/>
-          <w:szCs w:val="20"/>
-        </w:rPr>
-        <w:t xml:space="preserve">     _______________</w:t>
-      </w:r>
-    </w:p>
-    <w:p>
-      <w:pPr>
-        <w:spacing w:after="130"/>
-      </w:pPr>
-      <w:r>
-        <w:rPr>
-          <w:rFonts w:ascii="Times New Roman" w:cs="Times New Roman" w:eastAsia="Times New Roman" w:hAnsi="Times New Roman"/>
-          <w:sz w:val="20"/>
-          <w:szCs w:val="20"/>
-        </w:rPr>
-        <w:t xml:space="preserve">2. </w:t>
-      </w:r>
-      <w:r>
-        <w:rPr>
-          <w:rFonts w:ascii="Times New Roman" w:cs="Times New Roman" w:eastAsia="Times New Roman" w:hAnsi="Times New Roman"/>
-          <w:sz w:val="20"/>
-          <w:szCs w:val="20"/>
-        </w:rPr>
-        <w:t xml:space="preserve">If a visitor walks past your booth without stopping, the best first step is to say nothing and wait.</w:t>
-      </w:r>
-      <w:r>
-        <w:rPr>
-          <w:rFonts w:ascii="Times New Roman" w:cs="Times New Roman" w:eastAsia="Times New Roman" w:hAnsi="Times New Roman"/>
-          <w:sz w:val="20"/>
-          <w:szCs w:val="20"/>
-        </w:rPr>
-        <w:t xml:space="preserve">     _______________</w:t>
-      </w:r>
-    </w:p>
-    <w:p>
-      <w:pPr>
-        <w:spacing w:after="130"/>
-      </w:pPr>
-      <w:r>
-        <w:rPr>
-          <w:rFonts w:ascii="Times New Roman" w:cs="Times New Roman" w:eastAsia="Times New Roman" w:hAnsi="Times New Roman"/>
-          <w:sz w:val="20"/>
-          <w:szCs w:val="20"/>
-        </w:rPr>
-        <w:t xml:space="preserve">3. </w:t>
-      </w:r>
-      <w:r>
-        <w:rPr>
-          <w:rFonts w:ascii="Times New Roman" w:cs="Times New Roman" w:eastAsia="Times New Roman" w:hAnsi="Times New Roman"/>
-          <w:sz w:val="20"/>
-          <w:szCs w:val="20"/>
-        </w:rPr>
-        <w:t xml:space="preserve">A brochure and a badge scanner are the same thing.</w:t>
-      </w:r>
-      <w:r>
-        <w:rPr>
-          <w:rFonts w:ascii="Times New Roman" w:cs="Times New Roman" w:eastAsia="Times New Roman" w:hAnsi="Times New Roman"/>
-          <w:sz w:val="20"/>
-          <w:szCs w:val="20"/>
-        </w:rPr>
-        <w:t xml:space="preserve">     _______________</w:t>
-      </w:r>
-    </w:p>
-    <w:p>
-      <w:pPr>
-        <w:spacing w:after="130"/>
-      </w:pPr>
-      <w:r>
-        <w:rPr>
-          <w:rFonts w:ascii="Times New Roman" w:cs="Times New Roman" w:eastAsia="Times New Roman" w:hAnsi="Times New Roman"/>
-          <w:sz w:val="20"/>
-          <w:szCs w:val="20"/>
-        </w:rPr>
-        <w:t xml:space="preserve">4. </w:t>
-      </w:r>
-      <w:r>
-        <w:rPr>
-          <w:rFonts w:ascii="Times New Roman" w:cs="Times New Roman" w:eastAsia="Times New Roman" w:hAnsi="Times New Roman"/>
-          <w:sz w:val="20"/>
-          <w:szCs w:val="20"/>
-        </w:rPr>
-        <w:t xml:space="preserve">Giving your "pitch" means making a short, clear explanation of your product.</w:t>
-      </w:r>
-      <w:r>
-        <w:rPr>
-          <w:rFonts w:ascii="Times New Roman" w:cs="Times New Roman" w:eastAsia="Times New Roman" w:hAnsi="Times New Roman"/>
-          <w:sz w:val="20"/>
-          <w:szCs w:val="20"/>
-        </w:rPr>
-        <w:t xml:space="preserve">     _______________</w:t>
-      </w:r>
-    </w:p>
-    <w:p>
-      <w:pPr>
-        <w:spacing w:after="130"/>
-      </w:pPr>
-      <w:r>
-        <w:rPr>
-          <w:rFonts w:ascii="Times New Roman" w:cs="Times New Roman" w:eastAsia="Times New Roman" w:hAnsi="Times New Roman"/>
-          <w:sz w:val="20"/>
-          <w:szCs w:val="20"/>
-        </w:rPr>
-        <w:t xml:space="preserve">5. </w:t>
-      </w:r>
-      <w:r>
-        <w:rPr>
-          <w:rFonts w:ascii="Times New Roman" w:cs="Times New Roman" w:eastAsia="Times New Roman" w:hAnsi="Times New Roman"/>
-          <w:sz w:val="20"/>
-          <w:szCs w:val="20"/>
-        </w:rPr>
-        <w:t xml:space="preserve">The first step of a professional phone call is to ask for the caller’s name before saying anything else.</w:t>
-      </w:r>
-      <w:r>
-        <w:rPr>
-          <w:rFonts w:ascii="Times New Roman" w:cs="Times New Roman" w:eastAsia="Times New Roman" w:hAnsi="Times New Roman"/>
-          <w:sz w:val="20"/>
-          <w:szCs w:val="20"/>
-        </w:rPr>
-        <w:t xml:space="preserve">     _______________</w:t>
-      </w:r>
-    </w:p>
-    <w:p>
-      <w:pPr>
-        <w:spacing w:after="130"/>
-      </w:pPr>
-      <w:r>
-        <w:rPr>
-          <w:rFonts w:ascii="Times New Roman" w:cs="Times New Roman" w:eastAsia="Times New Roman" w:hAnsi="Times New Roman"/>
-          <w:sz w:val="20"/>
-          <w:szCs w:val="20"/>
-        </w:rPr>
-        <w:t xml:space="preserve">6. </w:t>
-      </w:r>
-      <w:r>
-        <w:rPr>
-          <w:rFonts w:ascii="Times New Roman" w:cs="Times New Roman" w:eastAsia="Times New Roman" w:hAnsi="Times New Roman"/>
-          <w:sz w:val="20"/>
-          <w:szCs w:val="20"/>
-        </w:rPr>
-        <w:t xml:space="preserve">If a staff member does not know the answer, it is best to guess so the caller does not wait.</w:t>
-      </w:r>
-      <w:r>
-        <w:rPr>
-          <w:rFonts w:ascii="Times New Roman" w:cs="Times New Roman" w:eastAsia="Times New Roman" w:hAnsi="Times New Roman"/>
-          <w:sz w:val="20"/>
-          <w:szCs w:val="20"/>
-        </w:rPr>
-        <w:t xml:space="preserve">     _______________</w:t>
-      </w:r>
-    </w:p>
-    <w:p>
-      <w:pPr>
-        <w:spacing w:after="130"/>
-      </w:pPr>
-      <w:r>
-        <w:rPr>
-          <w:rFonts w:ascii="Times New Roman" w:cs="Times New Roman" w:eastAsia="Times New Roman" w:hAnsi="Times New Roman"/>
-          <w:sz w:val="20"/>
-          <w:szCs w:val="20"/>
-        </w:rPr>
-        <w:t xml:space="preserve">7. </w:t>
-      </w:r>
-      <w:r>
-        <w:rPr>
-          <w:rFonts w:ascii="Times New Roman" w:cs="Times New Roman" w:eastAsia="Times New Roman" w:hAnsi="Times New Roman"/>
-          <w:sz w:val="20"/>
-          <w:szCs w:val="20"/>
-        </w:rPr>
-        <w:t xml:space="preserve">Taking a message means writing down the caller’s name, number, request, and a callback time.</w:t>
-      </w:r>
-      <w:r>
-        <w:rPr>
-          <w:rFonts w:ascii="Times New Roman" w:cs="Times New Roman" w:eastAsia="Times New Roman" w:hAnsi="Times New Roman"/>
-          <w:sz w:val="20"/>
-          <w:szCs w:val="20"/>
-        </w:rPr>
-        <w:t xml:space="preserve">     _______________</w:t>
-      </w:r>
-    </w:p>
-    <w:p>
-      <w:pPr>
-        <w:spacing w:after="130"/>
-      </w:pPr>
-      <w:r>
-        <w:rPr>
-          <w:rFonts w:ascii="Times New Roman" w:cs="Times New Roman" w:eastAsia="Times New Roman" w:hAnsi="Times New Roman"/>
-          <w:sz w:val="20"/>
-          <w:szCs w:val="20"/>
-        </w:rPr>
-        <w:t xml:space="preserve">8. </w:t>
-      </w:r>
-      <w:r>
-        <w:rPr>
-          <w:rFonts w:ascii="Times New Roman" w:cs="Times New Roman" w:eastAsia="Times New Roman" w:hAnsi="Times New Roman"/>
-          <w:sz w:val="20"/>
-          <w:szCs w:val="20"/>
-        </w:rPr>
-        <w:t xml:space="preserve">A professional phone call should close with a clear confirmation and a thank-you to the caller.</w:t>
-      </w:r>
-      <w:r>
-        <w:rPr>
-          <w:rFonts w:ascii="Times New Roman" w:cs="Times New Roman" w:eastAsia="Times New Roman" w:hAnsi="Times New Roman"/>
-          <w:sz w:val="20"/>
-          <w:szCs w:val="20"/>
-        </w:rPr>
-        <w:t xml:space="preserve">     _______________</w:t>
-      </w:r>
-    </w:p>
-    <w:p>
-      <w:pPr>
-        <w:spacing w:after="130"/>
-      </w:pPr>
-      <w:r>
-        <w:rPr>
-          <w:rFonts w:ascii="Times New Roman" w:cs="Times New Roman" w:eastAsia="Times New Roman" w:hAnsi="Times New Roman"/>
-          <w:sz w:val="20"/>
-          <w:szCs w:val="20"/>
-        </w:rPr>
-        <w:t xml:space="preserve">9. </w:t>
-      </w:r>
-      <w:r>
-        <w:rPr>
-          <w:rFonts w:ascii="Times New Roman" w:cs="Times New Roman" w:eastAsia="Times New Roman" w:hAnsi="Times New Roman"/>
-          <w:sz w:val="20"/>
-          <w:szCs w:val="20"/>
-        </w:rPr>
-        <w:t xml:space="preserve">The correct order for a professional apology is SORRY → REASON → SOLUTION.</w:t>
-      </w:r>
-      <w:r>
-        <w:rPr>
-          <w:rFonts w:ascii="Times New Roman" w:cs="Times New Roman" w:eastAsia="Times New Roman" w:hAnsi="Times New Roman"/>
-          <w:sz w:val="20"/>
-          <w:szCs w:val="20"/>
-        </w:rPr>
-        <w:t xml:space="preserve">     _______________</w:t>
-      </w:r>
-    </w:p>
-    <w:p>
-      <w:pPr>
-        <w:spacing w:after="130"/>
-      </w:pPr>
-      <w:r>
-        <w:rPr>
-          <w:rFonts w:ascii="Times New Roman" w:cs="Times New Roman" w:eastAsia="Times New Roman" w:hAnsi="Times New Roman"/>
-          <w:sz w:val="20"/>
-          <w:szCs w:val="20"/>
-        </w:rPr>
-        <w:t xml:space="preserve">10. </w:t>
-      </w:r>
-      <w:r>
-        <w:rPr>
-          <w:rFonts w:ascii="Times New Roman" w:cs="Times New Roman" w:eastAsia="Times New Roman" w:hAnsi="Times New Roman"/>
-          <w:sz w:val="20"/>
-          <w:szCs w:val="20"/>
-        </w:rPr>
-        <w:t xml:space="preserve">The most professional way to refuse a request is to say, "No, that’s not possible."</w:t>
-      </w:r>
-      <w:r>
-        <w:rPr>
-          <w:rFonts w:ascii="Times New Roman" w:cs="Times New Roman" w:eastAsia="Times New Roman" w:hAnsi="Times New Roman"/>
-          <w:sz w:val="20"/>
-          <w:szCs w:val="20"/>
-        </w:rPr>
-        <w:t xml:space="preserve">     _______________</w:t>
-      </w:r>
+    <w:tbl>
+      <w:tblPr>
+        <w:tblW w:type="dxa" w:w="9360"/>
+        <w:tblBorders>
+          <w:top w:val="single" w:color="auto" w:sz="4"/>
+          <w:left w:val="single" w:color="auto" w:sz="4"/>
+          <w:bottom w:val="single" w:color="auto" w:sz="4"/>
+          <w:right w:val="single" w:color="auto" w:sz="4"/>
+          <w:insideH w:val="single" w:color="auto" w:sz="4"/>
+          <w:insideV w:val="single" w:color="auto" w:sz="4"/>
+        </w:tblBorders>
+      </w:tblPr>
+      <w:tblGrid>
+        <w:gridCol w:w="7360"/>
+        <w:gridCol w:w="2000"/>
+      </w:tblGrid>
+      <w:tr>
+        <w:tc>
+          <w:tcPr>
+            <w:tcW w:type="dxa" w:w="7360"/>
+            <w:tcBorders>
+              <w:top w:val="none" w:color="FFFFFF" w:sz="0"/>
+              <w:left w:val="none" w:color="FFFFFF" w:sz="0"/>
+              <w:bottom w:val="none" w:color="FFFFFF" w:sz="0"/>
+              <w:right w:val="none" w:color="FFFFFF" w:sz="0"/>
+            </w:tcBorders>
+            <w:tcMar>
+              <w:top w:type="dxa" w:w="40"/>
+              <w:left w:type="dxa" w:w="0"/>
+              <w:bottom w:type="dxa" w:w="40"/>
+              <w:right w:type="dxa" w:w="160"/>
+            </w:tcMar>
+          </w:tcPr>
+          <w:p>
+            <w:r>
+              <w:rPr>
+                <w:rFonts w:ascii="Times New Roman" w:cs="Times New Roman" w:eastAsia="Times New Roman" w:hAnsi="Times New Roman"/>
+                <w:sz w:val="20"/>
+                <w:szCs w:val="20"/>
+              </w:rPr>
+              <w:t xml:space="preserve">1. A "lead" is a visitor who shows real interest and might become a customer.</w:t>
+            </w:r>
+          </w:p>
+        </w:tc>
+        <w:tc>
+          <w:tcPr>
+            <w:tcW w:type="dxa" w:w="2000"/>
+            <w:tcBorders>
+              <w:top w:val="none" w:color="FFFFFF" w:sz="0"/>
+              <w:left w:val="none" w:color="FFFFFF" w:sz="0"/>
+              <w:bottom w:val="none" w:color="FFFFFF" w:sz="0"/>
+              <w:right w:val="none" w:color="FFFFFF" w:sz="0"/>
+            </w:tcBorders>
+            <w:tcMar>
+              <w:top w:type="dxa" w:w="40"/>
+              <w:left w:type="dxa" w:w="0"/>
+              <w:bottom w:type="dxa" w:w="40"/>
+              <w:right w:type="dxa" w:w="0"/>
+            </w:tcMar>
+          </w:tcPr>
+          <w:p>
+            <w:pPr>
+              <w:jc w:val="right"/>
+            </w:pPr>
+            <w:r>
+              <w:rPr>
+                <w:rFonts w:ascii="Times New Roman" w:cs="Times New Roman" w:eastAsia="Times New Roman" w:hAnsi="Times New Roman"/>
+                <w:sz w:val="20"/>
+                <w:szCs w:val="20"/>
+              </w:rPr>
+              <w:t xml:space="preserve">_______________</w:t>
+            </w:r>
+          </w:p>
+        </w:tc>
+      </w:tr>
+    </w:tbl>
+    <w:p>
+      <w:pPr>
+        <w:spacing w:after="90"/>
+      </w:pPr>
+    </w:p>
+    <w:tbl>
+      <w:tblPr>
+        <w:tblW w:type="dxa" w:w="9360"/>
+        <w:tblBorders>
+          <w:top w:val="single" w:color="auto" w:sz="4"/>
+          <w:left w:val="single" w:color="auto" w:sz="4"/>
+          <w:bottom w:val="single" w:color="auto" w:sz="4"/>
+          <w:right w:val="single" w:color="auto" w:sz="4"/>
+          <w:insideH w:val="single" w:color="auto" w:sz="4"/>
+          <w:insideV w:val="single" w:color="auto" w:sz="4"/>
+        </w:tblBorders>
+      </w:tblPr>
+      <w:tblGrid>
+        <w:gridCol w:w="7360"/>
+        <w:gridCol w:w="2000"/>
+      </w:tblGrid>
+      <w:tr>
+        <w:tc>
+          <w:tcPr>
+            <w:tcW w:type="dxa" w:w="7360"/>
+            <w:tcBorders>
+              <w:top w:val="none" w:color="FFFFFF" w:sz="0"/>
+              <w:left w:val="none" w:color="FFFFFF" w:sz="0"/>
+              <w:bottom w:val="none" w:color="FFFFFF" w:sz="0"/>
+              <w:right w:val="none" w:color="FFFFFF" w:sz="0"/>
+            </w:tcBorders>
+            <w:tcMar>
+              <w:top w:type="dxa" w:w="40"/>
+              <w:left w:type="dxa" w:w="0"/>
+              <w:bottom w:type="dxa" w:w="40"/>
+              <w:right w:type="dxa" w:w="160"/>
+            </w:tcMar>
+          </w:tcPr>
+          <w:p>
+            <w:r>
+              <w:rPr>
+                <w:rFonts w:ascii="Times New Roman" w:cs="Times New Roman" w:eastAsia="Times New Roman" w:hAnsi="Times New Roman"/>
+                <w:sz w:val="20"/>
+                <w:szCs w:val="20"/>
+              </w:rPr>
+              <w:t xml:space="preserve">2. If a visitor walks past your booth without stopping, the best first step is to say nothing and wait.</w:t>
+            </w:r>
+          </w:p>
+        </w:tc>
+        <w:tc>
+          <w:tcPr>
+            <w:tcW w:type="dxa" w:w="2000"/>
+            <w:tcBorders>
+              <w:top w:val="none" w:color="FFFFFF" w:sz="0"/>
+              <w:left w:val="none" w:color="FFFFFF" w:sz="0"/>
+              <w:bottom w:val="none" w:color="FFFFFF" w:sz="0"/>
+              <w:right w:val="none" w:color="FFFFFF" w:sz="0"/>
+            </w:tcBorders>
+            <w:tcMar>
+              <w:top w:type="dxa" w:w="40"/>
+              <w:left w:type="dxa" w:w="0"/>
+              <w:bottom w:type="dxa" w:w="40"/>
+              <w:right w:type="dxa" w:w="0"/>
+            </w:tcMar>
+          </w:tcPr>
+          <w:p>
+            <w:pPr>
+              <w:jc w:val="right"/>
+            </w:pPr>
+            <w:r>
+              <w:rPr>
+                <w:rFonts w:ascii="Times New Roman" w:cs="Times New Roman" w:eastAsia="Times New Roman" w:hAnsi="Times New Roman"/>
+                <w:sz w:val="20"/>
+                <w:szCs w:val="20"/>
+              </w:rPr>
+              <w:t xml:space="preserve">_______________</w:t>
+            </w:r>
+          </w:p>
+        </w:tc>
+      </w:tr>
+    </w:tbl>
+    <w:p>
+      <w:pPr>
+        <w:spacing w:after="90"/>
+      </w:pPr>
+    </w:p>
+    <w:tbl>
+      <w:tblPr>
+        <w:tblW w:type="dxa" w:w="9360"/>
+        <w:tblBorders>
+          <w:top w:val="single" w:color="auto" w:sz="4"/>
+          <w:left w:val="single" w:color="auto" w:sz="4"/>
+          <w:bottom w:val="single" w:color="auto" w:sz="4"/>
+          <w:right w:val="single" w:color="auto" w:sz="4"/>
+          <w:insideH w:val="single" w:color="auto" w:sz="4"/>
+          <w:insideV w:val="single" w:color="auto" w:sz="4"/>
+        </w:tblBorders>
+      </w:tblPr>
+      <w:tblGrid>
+        <w:gridCol w:w="7360"/>
+        <w:gridCol w:w="2000"/>
+      </w:tblGrid>
+      <w:tr>
+        <w:tc>
+          <w:tcPr>
+            <w:tcW w:type="dxa" w:w="7360"/>
+            <w:tcBorders>
+              <w:top w:val="none" w:color="FFFFFF" w:sz="0"/>
+              <w:left w:val="none" w:color="FFFFFF" w:sz="0"/>
+              <w:bottom w:val="none" w:color="FFFFFF" w:sz="0"/>
+              <w:right w:val="none" w:color="FFFFFF" w:sz="0"/>
+            </w:tcBorders>
+            <w:tcMar>
+              <w:top w:type="dxa" w:w="40"/>
+              <w:left w:type="dxa" w:w="0"/>
+              <w:bottom w:type="dxa" w:w="40"/>
+              <w:right w:type="dxa" w:w="160"/>
+            </w:tcMar>
+          </w:tcPr>
+          <w:p>
+            <w:r>
+              <w:rPr>
+                <w:rFonts w:ascii="Times New Roman" w:cs="Times New Roman" w:eastAsia="Times New Roman" w:hAnsi="Times New Roman"/>
+                <w:sz w:val="20"/>
+                <w:szCs w:val="20"/>
+              </w:rPr>
+              <w:t xml:space="preserve">3. A brochure and a badge scanner are the same thing.</w:t>
+            </w:r>
+          </w:p>
+        </w:tc>
+        <w:tc>
+          <w:tcPr>
+            <w:tcW w:type="dxa" w:w="2000"/>
+            <w:tcBorders>
+              <w:top w:val="none" w:color="FFFFFF" w:sz="0"/>
+              <w:left w:val="none" w:color="FFFFFF" w:sz="0"/>
+              <w:bottom w:val="none" w:color="FFFFFF" w:sz="0"/>
+              <w:right w:val="none" w:color="FFFFFF" w:sz="0"/>
+            </w:tcBorders>
+            <w:tcMar>
+              <w:top w:type="dxa" w:w="40"/>
+              <w:left w:type="dxa" w:w="0"/>
+              <w:bottom w:type="dxa" w:w="40"/>
+              <w:right w:type="dxa" w:w="0"/>
+            </w:tcMar>
+          </w:tcPr>
+          <w:p>
+            <w:pPr>
+              <w:jc w:val="right"/>
+            </w:pPr>
+            <w:r>
+              <w:rPr>
+                <w:rFonts w:ascii="Times New Roman" w:cs="Times New Roman" w:eastAsia="Times New Roman" w:hAnsi="Times New Roman"/>
+                <w:sz w:val="20"/>
+                <w:szCs w:val="20"/>
+              </w:rPr>
+              <w:t xml:space="preserve">_______________</w:t>
+            </w:r>
+          </w:p>
+        </w:tc>
+      </w:tr>
+    </w:tbl>
+    <w:p>
+      <w:pPr>
+        <w:spacing w:after="90"/>
+      </w:pPr>
+    </w:p>
+    <w:tbl>
+      <w:tblPr>
+        <w:tblW w:type="dxa" w:w="9360"/>
+        <w:tblBorders>
+          <w:top w:val="single" w:color="auto" w:sz="4"/>
+          <w:left w:val="single" w:color="auto" w:sz="4"/>
+          <w:bottom w:val="single" w:color="auto" w:sz="4"/>
+          <w:right w:val="single" w:color="auto" w:sz="4"/>
+          <w:insideH w:val="single" w:color="auto" w:sz="4"/>
+          <w:insideV w:val="single" w:color="auto" w:sz="4"/>
+        </w:tblBorders>
+      </w:tblPr>
+      <w:tblGrid>
+        <w:gridCol w:w="7360"/>
+        <w:gridCol w:w="2000"/>
+      </w:tblGrid>
+      <w:tr>
+        <w:tc>
+          <w:tcPr>
+            <w:tcW w:type="dxa" w:w="7360"/>
+            <w:tcBorders>
+              <w:top w:val="none" w:color="FFFFFF" w:sz="0"/>
+              <w:left w:val="none" w:color="FFFFFF" w:sz="0"/>
+              <w:bottom w:val="none" w:color="FFFFFF" w:sz="0"/>
+              <w:right w:val="none" w:color="FFFFFF" w:sz="0"/>
+            </w:tcBorders>
+            <w:tcMar>
+              <w:top w:type="dxa" w:w="40"/>
+              <w:left w:type="dxa" w:w="0"/>
+              <w:bottom w:type="dxa" w:w="40"/>
+              <w:right w:type="dxa" w:w="160"/>
+            </w:tcMar>
+          </w:tcPr>
+          <w:p>
+            <w:r>
+              <w:rPr>
+                <w:rFonts w:ascii="Times New Roman" w:cs="Times New Roman" w:eastAsia="Times New Roman" w:hAnsi="Times New Roman"/>
+                <w:sz w:val="20"/>
+                <w:szCs w:val="20"/>
+              </w:rPr>
+              <w:t xml:space="preserve">4. Giving your "pitch" means making a short, clear explanation of your product.</w:t>
+            </w:r>
+          </w:p>
+        </w:tc>
+        <w:tc>
+          <w:tcPr>
+            <w:tcW w:type="dxa" w:w="2000"/>
+            <w:tcBorders>
+              <w:top w:val="none" w:color="FFFFFF" w:sz="0"/>
+              <w:left w:val="none" w:color="FFFFFF" w:sz="0"/>
+              <w:bottom w:val="none" w:color="FFFFFF" w:sz="0"/>
+              <w:right w:val="none" w:color="FFFFFF" w:sz="0"/>
+            </w:tcBorders>
+            <w:tcMar>
+              <w:top w:type="dxa" w:w="40"/>
+              <w:left w:type="dxa" w:w="0"/>
+              <w:bottom w:type="dxa" w:w="40"/>
+              <w:right w:type="dxa" w:w="0"/>
+            </w:tcMar>
+          </w:tcPr>
+          <w:p>
+            <w:pPr>
+              <w:jc w:val="right"/>
+            </w:pPr>
+            <w:r>
+              <w:rPr>
+                <w:rFonts w:ascii="Times New Roman" w:cs="Times New Roman" w:eastAsia="Times New Roman" w:hAnsi="Times New Roman"/>
+                <w:sz w:val="20"/>
+                <w:szCs w:val="20"/>
+              </w:rPr>
+              <w:t xml:space="preserve">_______________</w:t>
+            </w:r>
+          </w:p>
+        </w:tc>
+      </w:tr>
+    </w:tbl>
+    <w:p>
+      <w:pPr>
+        <w:spacing w:after="90"/>
+      </w:pPr>
+    </w:p>
+    <w:tbl>
+      <w:tblPr>
+        <w:tblW w:type="dxa" w:w="9360"/>
+        <w:tblBorders>
+          <w:top w:val="single" w:color="auto" w:sz="4"/>
+          <w:left w:val="single" w:color="auto" w:sz="4"/>
+          <w:bottom w:val="single" w:color="auto" w:sz="4"/>
+          <w:right w:val="single" w:color="auto" w:sz="4"/>
+          <w:insideH w:val="single" w:color="auto" w:sz="4"/>
+          <w:insideV w:val="single" w:color="auto" w:sz="4"/>
+        </w:tblBorders>
+      </w:tblPr>
+      <w:tblGrid>
+        <w:gridCol w:w="7360"/>
+        <w:gridCol w:w="2000"/>
+      </w:tblGrid>
+      <w:tr>
+        <w:tc>
+          <w:tcPr>
+            <w:tcW w:type="dxa" w:w="7360"/>
+            <w:tcBorders>
+              <w:top w:val="none" w:color="FFFFFF" w:sz="0"/>
+              <w:left w:val="none" w:color="FFFFFF" w:sz="0"/>
+              <w:bottom w:val="none" w:color="FFFFFF" w:sz="0"/>
+              <w:right w:val="none" w:color="FFFFFF" w:sz="0"/>
+            </w:tcBorders>
+            <w:tcMar>
+              <w:top w:type="dxa" w:w="40"/>
+              <w:left w:type="dxa" w:w="0"/>
+              <w:bottom w:type="dxa" w:w="40"/>
+              <w:right w:type="dxa" w:w="160"/>
+            </w:tcMar>
+          </w:tcPr>
+          <w:p>
+            <w:r>
+              <w:rPr>
+                <w:rFonts w:ascii="Times New Roman" w:cs="Times New Roman" w:eastAsia="Times New Roman" w:hAnsi="Times New Roman"/>
+                <w:sz w:val="20"/>
+                <w:szCs w:val="20"/>
+              </w:rPr>
+              <w:t xml:space="preserve">5. The first step of a professional phone call is to ask for the caller’s name before saying anything else.</w:t>
+            </w:r>
+          </w:p>
+        </w:tc>
+        <w:tc>
+          <w:tcPr>
+            <w:tcW w:type="dxa" w:w="2000"/>
+            <w:tcBorders>
+              <w:top w:val="none" w:color="FFFFFF" w:sz="0"/>
+              <w:left w:val="none" w:color="FFFFFF" w:sz="0"/>
+              <w:bottom w:val="none" w:color="FFFFFF" w:sz="0"/>
+              <w:right w:val="none" w:color="FFFFFF" w:sz="0"/>
+            </w:tcBorders>
+            <w:tcMar>
+              <w:top w:type="dxa" w:w="40"/>
+              <w:left w:type="dxa" w:w="0"/>
+              <w:bottom w:type="dxa" w:w="40"/>
+              <w:right w:type="dxa" w:w="0"/>
+            </w:tcMar>
+          </w:tcPr>
+          <w:p>
+            <w:pPr>
+              <w:jc w:val="right"/>
+            </w:pPr>
+            <w:r>
+              <w:rPr>
+                <w:rFonts w:ascii="Times New Roman" w:cs="Times New Roman" w:eastAsia="Times New Roman" w:hAnsi="Times New Roman"/>
+                <w:sz w:val="20"/>
+                <w:szCs w:val="20"/>
+              </w:rPr>
+              <w:t xml:space="preserve">_______________</w:t>
+            </w:r>
+          </w:p>
+        </w:tc>
+      </w:tr>
+    </w:tbl>
+    <w:p>
+      <w:pPr>
+        <w:spacing w:after="90"/>
+      </w:pPr>
+    </w:p>
+    <w:tbl>
+      <w:tblPr>
+        <w:tblW w:type="dxa" w:w="9360"/>
+        <w:tblBorders>
+          <w:top w:val="single" w:color="auto" w:sz="4"/>
+          <w:left w:val="single" w:color="auto" w:sz="4"/>
+          <w:bottom w:val="single" w:color="auto" w:sz="4"/>
+          <w:right w:val="single" w:color="auto" w:sz="4"/>
+          <w:insideH w:val="single" w:color="auto" w:sz="4"/>
+          <w:insideV w:val="single" w:color="auto" w:sz="4"/>
+        </w:tblBorders>
+      </w:tblPr>
+      <w:tblGrid>
+        <w:gridCol w:w="7360"/>
+        <w:gridCol w:w="2000"/>
+      </w:tblGrid>
+      <w:tr>
+        <w:tc>
+          <w:tcPr>
+            <w:tcW w:type="dxa" w:w="7360"/>
+            <w:tcBorders>
+              <w:top w:val="none" w:color="FFFFFF" w:sz="0"/>
+              <w:left w:val="none" w:color="FFFFFF" w:sz="0"/>
+              <w:bottom w:val="none" w:color="FFFFFF" w:sz="0"/>
+              <w:right w:val="none" w:color="FFFFFF" w:sz="0"/>
+            </w:tcBorders>
+            <w:tcMar>
+              <w:top w:type="dxa" w:w="40"/>
+              <w:left w:type="dxa" w:w="0"/>
+              <w:bottom w:type="dxa" w:w="40"/>
+              <w:right w:type="dxa" w:w="160"/>
+            </w:tcMar>
+          </w:tcPr>
+          <w:p>
+            <w:r>
+              <w:rPr>
+                <w:rFonts w:ascii="Times New Roman" w:cs="Times New Roman" w:eastAsia="Times New Roman" w:hAnsi="Times New Roman"/>
+                <w:sz w:val="20"/>
+                <w:szCs w:val="20"/>
+              </w:rPr>
+              <w:t xml:space="preserve">6. If a staff member does not know the answer, it is best to guess so the caller does not wait.</w:t>
+            </w:r>
+          </w:p>
+        </w:tc>
+        <w:tc>
+          <w:tcPr>
+            <w:tcW w:type="dxa" w:w="2000"/>
+            <w:tcBorders>
+              <w:top w:val="none" w:color="FFFFFF" w:sz="0"/>
+              <w:left w:val="none" w:color="FFFFFF" w:sz="0"/>
+              <w:bottom w:val="none" w:color="FFFFFF" w:sz="0"/>
+              <w:right w:val="none" w:color="FFFFFF" w:sz="0"/>
+            </w:tcBorders>
+            <w:tcMar>
+              <w:top w:type="dxa" w:w="40"/>
+              <w:left w:type="dxa" w:w="0"/>
+              <w:bottom w:type="dxa" w:w="40"/>
+              <w:right w:type="dxa" w:w="0"/>
+            </w:tcMar>
+          </w:tcPr>
+          <w:p>
+            <w:pPr>
+              <w:jc w:val="right"/>
+            </w:pPr>
+            <w:r>
+              <w:rPr>
+                <w:rFonts w:ascii="Times New Roman" w:cs="Times New Roman" w:eastAsia="Times New Roman" w:hAnsi="Times New Roman"/>
+                <w:sz w:val="20"/>
+                <w:szCs w:val="20"/>
+              </w:rPr>
+              <w:t xml:space="preserve">_______________</w:t>
+            </w:r>
+          </w:p>
+        </w:tc>
+      </w:tr>
+    </w:tbl>
+    <w:p>
+      <w:pPr>
+        <w:spacing w:after="90"/>
+      </w:pPr>
+    </w:p>
+    <w:tbl>
+      <w:tblPr>
+        <w:tblW w:type="dxa" w:w="9360"/>
+        <w:tblBorders>
+          <w:top w:val="single" w:color="auto" w:sz="4"/>
+          <w:left w:val="single" w:color="auto" w:sz="4"/>
+          <w:bottom w:val="single" w:color="auto" w:sz="4"/>
+          <w:right w:val="single" w:color="auto" w:sz="4"/>
+          <w:insideH w:val="single" w:color="auto" w:sz="4"/>
+          <w:insideV w:val="single" w:color="auto" w:sz="4"/>
+        </w:tblBorders>
+      </w:tblPr>
+      <w:tblGrid>
+        <w:gridCol w:w="7360"/>
+        <w:gridCol w:w="2000"/>
+      </w:tblGrid>
+      <w:tr>
+        <w:tc>
+          <w:tcPr>
+            <w:tcW w:type="dxa" w:w="7360"/>
+            <w:tcBorders>
+              <w:top w:val="none" w:color="FFFFFF" w:sz="0"/>
+              <w:left w:val="none" w:color="FFFFFF" w:sz="0"/>
+              <w:bottom w:val="none" w:color="FFFFFF" w:sz="0"/>
+              <w:right w:val="none" w:color="FFFFFF" w:sz="0"/>
+            </w:tcBorders>
+            <w:tcMar>
+              <w:top w:type="dxa" w:w="40"/>
+              <w:left w:type="dxa" w:w="0"/>
+              <w:bottom w:type="dxa" w:w="40"/>
+              <w:right w:type="dxa" w:w="160"/>
+            </w:tcMar>
+          </w:tcPr>
+          <w:p>
+            <w:r>
+              <w:rPr>
+                <w:rFonts w:ascii="Times New Roman" w:cs="Times New Roman" w:eastAsia="Times New Roman" w:hAnsi="Times New Roman"/>
+                <w:sz w:val="20"/>
+                <w:szCs w:val="20"/>
+              </w:rPr>
+              <w:t xml:space="preserve">7. Taking a message means writing down the caller’s name, number, request, and a callback time.</w:t>
+            </w:r>
+          </w:p>
+        </w:tc>
+        <w:tc>
+          <w:tcPr>
+            <w:tcW w:type="dxa" w:w="2000"/>
+            <w:tcBorders>
+              <w:top w:val="none" w:color="FFFFFF" w:sz="0"/>
+              <w:left w:val="none" w:color="FFFFFF" w:sz="0"/>
+              <w:bottom w:val="none" w:color="FFFFFF" w:sz="0"/>
+              <w:right w:val="none" w:color="FFFFFF" w:sz="0"/>
+            </w:tcBorders>
+            <w:tcMar>
+              <w:top w:type="dxa" w:w="40"/>
+              <w:left w:type="dxa" w:w="0"/>
+              <w:bottom w:type="dxa" w:w="40"/>
+              <w:right w:type="dxa" w:w="0"/>
+            </w:tcMar>
+          </w:tcPr>
+          <w:p>
+            <w:pPr>
+              <w:jc w:val="right"/>
+            </w:pPr>
+            <w:r>
+              <w:rPr>
+                <w:rFonts w:ascii="Times New Roman" w:cs="Times New Roman" w:eastAsia="Times New Roman" w:hAnsi="Times New Roman"/>
+                <w:sz w:val="20"/>
+                <w:szCs w:val="20"/>
+              </w:rPr>
+              <w:t xml:space="preserve">_______________</w:t>
+            </w:r>
+          </w:p>
+        </w:tc>
+      </w:tr>
+    </w:tbl>
+    <w:p>
+      <w:pPr>
+        <w:spacing w:after="90"/>
+      </w:pPr>
+    </w:p>
+    <w:tbl>
+      <w:tblPr>
+        <w:tblW w:type="dxa" w:w="9360"/>
+        <w:tblBorders>
+          <w:top w:val="single" w:color="auto" w:sz="4"/>
+          <w:left w:val="single" w:color="auto" w:sz="4"/>
+          <w:bottom w:val="single" w:color="auto" w:sz="4"/>
+          <w:right w:val="single" w:color="auto" w:sz="4"/>
+          <w:insideH w:val="single" w:color="auto" w:sz="4"/>
+          <w:insideV w:val="single" w:color="auto" w:sz="4"/>
+        </w:tblBorders>
+      </w:tblPr>
+      <w:tblGrid>
+        <w:gridCol w:w="7360"/>
+        <w:gridCol w:w="2000"/>
+      </w:tblGrid>
+      <w:tr>
+        <w:tc>
+          <w:tcPr>
+            <w:tcW w:type="dxa" w:w="7360"/>
+            <w:tcBorders>
+              <w:top w:val="none" w:color="FFFFFF" w:sz="0"/>
+              <w:left w:val="none" w:color="FFFFFF" w:sz="0"/>
+              <w:bottom w:val="none" w:color="FFFFFF" w:sz="0"/>
+              <w:right w:val="none" w:color="FFFFFF" w:sz="0"/>
+            </w:tcBorders>
+            <w:tcMar>
+              <w:top w:type="dxa" w:w="40"/>
+              <w:left w:type="dxa" w:w="0"/>
+              <w:bottom w:type="dxa" w:w="40"/>
+              <w:right w:type="dxa" w:w="160"/>
+            </w:tcMar>
+          </w:tcPr>
+          <w:p>
+            <w:r>
+              <w:rPr>
+                <w:rFonts w:ascii="Times New Roman" w:cs="Times New Roman" w:eastAsia="Times New Roman" w:hAnsi="Times New Roman"/>
+                <w:sz w:val="20"/>
+                <w:szCs w:val="20"/>
+              </w:rPr>
+              <w:t xml:space="preserve">8. A professional phone call should close with a clear confirmation and a thank-you to the caller.</w:t>
+            </w:r>
+          </w:p>
+        </w:tc>
+        <w:tc>
+          <w:tcPr>
+            <w:tcW w:type="dxa" w:w="2000"/>
+            <w:tcBorders>
+              <w:top w:val="none" w:color="FFFFFF" w:sz="0"/>
+              <w:left w:val="none" w:color="FFFFFF" w:sz="0"/>
+              <w:bottom w:val="none" w:color="FFFFFF" w:sz="0"/>
+              <w:right w:val="none" w:color="FFFFFF" w:sz="0"/>
+            </w:tcBorders>
+            <w:tcMar>
+              <w:top w:type="dxa" w:w="40"/>
+              <w:left w:type="dxa" w:w="0"/>
+              <w:bottom w:type="dxa" w:w="40"/>
+              <w:right w:type="dxa" w:w="0"/>
+            </w:tcMar>
+          </w:tcPr>
+          <w:p>
+            <w:pPr>
+              <w:jc w:val="right"/>
+            </w:pPr>
+            <w:r>
+              <w:rPr>
+                <w:rFonts w:ascii="Times New Roman" w:cs="Times New Roman" w:eastAsia="Times New Roman" w:hAnsi="Times New Roman"/>
+                <w:sz w:val="20"/>
+                <w:szCs w:val="20"/>
+              </w:rPr>
+              <w:t xml:space="preserve">_______________</w:t>
+            </w:r>
+          </w:p>
+        </w:tc>
+      </w:tr>
+    </w:tbl>
+    <w:p>
+      <w:pPr>
+        <w:spacing w:after="90"/>
+      </w:pPr>
+    </w:p>
+    <w:tbl>
+      <w:tblPr>
+        <w:tblW w:type="dxa" w:w="9360"/>
+        <w:tblBorders>
+          <w:top w:val="single" w:color="auto" w:sz="4"/>
+          <w:left w:val="single" w:color="auto" w:sz="4"/>
+          <w:bottom w:val="single" w:color="auto" w:sz="4"/>
+          <w:right w:val="single" w:color="auto" w:sz="4"/>
+          <w:insideH w:val="single" w:color="auto" w:sz="4"/>
+          <w:insideV w:val="single" w:color="auto" w:sz="4"/>
+        </w:tblBorders>
+      </w:tblPr>
+      <w:tblGrid>
+        <w:gridCol w:w="7360"/>
+        <w:gridCol w:w="2000"/>
+      </w:tblGrid>
+      <w:tr>
+        <w:tc>
+          <w:tcPr>
+            <w:tcW w:type="dxa" w:w="7360"/>
+            <w:tcBorders>
+              <w:top w:val="none" w:color="FFFFFF" w:sz="0"/>
+              <w:left w:val="none" w:color="FFFFFF" w:sz="0"/>
+              <w:bottom w:val="none" w:color="FFFFFF" w:sz="0"/>
+              <w:right w:val="none" w:color="FFFFFF" w:sz="0"/>
+            </w:tcBorders>
+            <w:tcMar>
+              <w:top w:type="dxa" w:w="40"/>
+              <w:left w:type="dxa" w:w="0"/>
+              <w:bottom w:type="dxa" w:w="40"/>
+              <w:right w:type="dxa" w:w="160"/>
+            </w:tcMar>
+          </w:tcPr>
+          <w:p>
+            <w:r>
+              <w:rPr>
+                <w:rFonts w:ascii="Times New Roman" w:cs="Times New Roman" w:eastAsia="Times New Roman" w:hAnsi="Times New Roman"/>
+                <w:sz w:val="20"/>
+                <w:szCs w:val="20"/>
+              </w:rPr>
+              <w:t xml:space="preserve">9. The correct order for a professional apology is SORRY → REASON → SOLUTION.</w:t>
+            </w:r>
+          </w:p>
+        </w:tc>
+        <w:tc>
+          <w:tcPr>
+            <w:tcW w:type="dxa" w:w="2000"/>
+            <w:tcBorders>
+              <w:top w:val="none" w:color="FFFFFF" w:sz="0"/>
+              <w:left w:val="none" w:color="FFFFFF" w:sz="0"/>
+              <w:bottom w:val="none" w:color="FFFFFF" w:sz="0"/>
+              <w:right w:val="none" w:color="FFFFFF" w:sz="0"/>
+            </w:tcBorders>
+            <w:tcMar>
+              <w:top w:type="dxa" w:w="40"/>
+              <w:left w:type="dxa" w:w="0"/>
+              <w:bottom w:type="dxa" w:w="40"/>
+              <w:right w:type="dxa" w:w="0"/>
+            </w:tcMar>
+          </w:tcPr>
+          <w:p>
+            <w:pPr>
+              <w:jc w:val="right"/>
+            </w:pPr>
+            <w:r>
+              <w:rPr>
+                <w:rFonts w:ascii="Times New Roman" w:cs="Times New Roman" w:eastAsia="Times New Roman" w:hAnsi="Times New Roman"/>
+                <w:sz w:val="20"/>
+                <w:szCs w:val="20"/>
+              </w:rPr>
+              <w:t xml:space="preserve">_______________</w:t>
+            </w:r>
+          </w:p>
+        </w:tc>
+      </w:tr>
+    </w:tbl>
+    <w:p>
+      <w:pPr>
+        <w:spacing w:after="90"/>
+      </w:pPr>
+    </w:p>
+    <w:tbl>
+      <w:tblPr>
+        <w:tblW w:type="dxa" w:w="9360"/>
+        <w:tblBorders>
+          <w:top w:val="single" w:color="auto" w:sz="4"/>
+          <w:left w:val="single" w:color="auto" w:sz="4"/>
+          <w:bottom w:val="single" w:color="auto" w:sz="4"/>
+          <w:right w:val="single" w:color="auto" w:sz="4"/>
+          <w:insideH w:val="single" w:color="auto" w:sz="4"/>
+          <w:insideV w:val="single" w:color="auto" w:sz="4"/>
+        </w:tblBorders>
+      </w:tblPr>
+      <w:tblGrid>
+        <w:gridCol w:w="7360"/>
+        <w:gridCol w:w="2000"/>
+      </w:tblGrid>
+      <w:tr>
+        <w:tc>
+          <w:tcPr>
+            <w:tcW w:type="dxa" w:w="7360"/>
+            <w:tcBorders>
+              <w:top w:val="none" w:color="FFFFFF" w:sz="0"/>
+              <w:left w:val="none" w:color="FFFFFF" w:sz="0"/>
+              <w:bottom w:val="none" w:color="FFFFFF" w:sz="0"/>
+              <w:right w:val="none" w:color="FFFFFF" w:sz="0"/>
+            </w:tcBorders>
+            <w:tcMar>
+              <w:top w:type="dxa" w:w="40"/>
+              <w:left w:type="dxa" w:w="0"/>
+              <w:bottom w:type="dxa" w:w="40"/>
+              <w:right w:type="dxa" w:w="160"/>
+            </w:tcMar>
+          </w:tcPr>
+          <w:p>
+            <w:r>
+              <w:rPr>
+                <w:rFonts w:ascii="Times New Roman" w:cs="Times New Roman" w:eastAsia="Times New Roman" w:hAnsi="Times New Roman"/>
+                <w:sz w:val="20"/>
+                <w:szCs w:val="20"/>
+              </w:rPr>
+              <w:t xml:space="preserve">10. The most professional way to refuse a request is to say, "No, that’s not possible."</w:t>
+            </w:r>
+          </w:p>
+        </w:tc>
+        <w:tc>
+          <w:tcPr>
+            <w:tcW w:type="dxa" w:w="2000"/>
+            <w:tcBorders>
+              <w:top w:val="none" w:color="FFFFFF" w:sz="0"/>
+              <w:left w:val="none" w:color="FFFFFF" w:sz="0"/>
+              <w:bottom w:val="none" w:color="FFFFFF" w:sz="0"/>
+              <w:right w:val="none" w:color="FFFFFF" w:sz="0"/>
+            </w:tcBorders>
+            <w:tcMar>
+              <w:top w:type="dxa" w:w="40"/>
+              <w:left w:type="dxa" w:w="0"/>
+              <w:bottom w:type="dxa" w:w="40"/>
+              <w:right w:type="dxa" w:w="0"/>
+            </w:tcMar>
+          </w:tcPr>
+          <w:p>
+            <w:pPr>
+              <w:jc w:val="right"/>
+            </w:pPr>
+            <w:r>
+              <w:rPr>
+                <w:rFonts w:ascii="Times New Roman" w:cs="Times New Roman" w:eastAsia="Times New Roman" w:hAnsi="Times New Roman"/>
+                <w:sz w:val="20"/>
+                <w:szCs w:val="20"/>
+              </w:rPr>
+              <w:t xml:space="preserve">_______________</w:t>
+            </w:r>
+          </w:p>
+        </w:tc>
+      </w:tr>
+    </w:tbl>
+    <w:p>
+      <w:pPr>
+        <w:spacing w:after="90"/>
+      </w:pPr>
     </w:p>
     <w:p>
       <w:pPr>
@@ -1475,7 +2725,7 @@
           <w:sz w:val="27"/>
           <w:szCs w:val="27"/>
         </w:rPr>
-        <w:t xml:space="preserve">Part III — Taking Notes (Unit 10)</w:t>
+        <w:t xml:space="preserve">Part III: Taking Notes</w:t>
       </w:r>
     </w:p>
     <w:p>
@@ -1491,7 +2741,7 @@
           <w:sz w:val="19"/>
           <w:szCs w:val="19"/>
         </w:rPr>
-        <w:t xml:space="preserve">2 items × 3 points = 6 points</w:t>
+        <w:t xml:space="preserve">6 points</w:t>
       </w:r>
     </w:p>
     <w:p>
@@ -1504,7 +2754,7 @@
           <w:sz w:val="20"/>
           <w:szCs w:val="20"/>
         </w:rPr>
-        <w:t xml:space="preserve">Read each phone call below. Write short notes only, not full sentences. Include: the caller’s name and company, their phone number, what they are asking for, and the callback time.</w:t>
+        <w:t xml:space="preserve">Read each phone call below. Write the short notes that you need to take.</w:t>
       </w:r>
     </w:p>
     <w:p>
@@ -2041,7 +3291,7 @@
           <w:sz w:val="27"/>
           <w:szCs w:val="27"/>
         </w:rPr>
-        <w:t xml:space="preserve">Part IV — Put the Sentence in Order (Unit 11)</w:t>
+        <w:t xml:space="preserve">Part IV: Put the Sentence in Order</w:t>
       </w:r>
     </w:p>
     <w:p>
@@ -2057,7 +3307,7 @@
           <w:sz w:val="19"/>
           <w:szCs w:val="19"/>
         </w:rPr>
-        <w:t xml:space="preserve">3 items × 2 points = 6 points</w:t>
+        <w:t xml:space="preserve">6 points</w:t>
       </w:r>
     </w:p>
     <w:p>
@@ -2498,7 +3748,7 @@
           <w:sz w:val="27"/>
           <w:szCs w:val="27"/>
         </w:rPr>
-        <w:t xml:space="preserve">Part V — Essay (Units 9–11)</w:t>
+        <w:t xml:space="preserve">Part V: Essay</w:t>
       </w:r>
     </w:p>
     <w:p>
@@ -2514,7 +3764,7 @@
           <w:sz w:val="19"/>
           <w:szCs w:val="19"/>
         </w:rPr>
-        <w:t xml:space="preserve">2 items × 4 points = 8 points</w:t>
+        <w:t xml:space="preserve">8 points</w:t>
       </w:r>
     </w:p>
     <w:p>

</xml_diff>

<commit_message>
Compress Long Quiz to 3 pages plus a separate answer key page
Tightened spacing throughout (margins, headers, line gaps), dropped
one blank writing line from each essay and the taking-notes sections,
and swapped the boxed "End of Quiz" closer for plain text. Student
quiz is now exactly 3 pages; the teacher-only answer key stays on
its own 4th page.

Co-Authored-By: Claude Sonnet 5 <noreply@anthropic.com>
</commit_message>
<xml_diff>
--- a/_deliverables/MICE-LongQuiz-Units9-11.docx
+++ b/_deliverables/MICE-LongQuiz-Units9-11.docx
@@ -74,9 +74,9 @@
             <w:tcW w:type="dxa" w:w="9360"/>
             <w:shd w:fill="EAF0F6" w:val="clear"/>
             <w:tcMar>
-              <w:top w:type="dxa" w:w="140"/>
+              <w:top w:type="dxa" w:w="90"/>
               <w:left w:type="dxa" w:w="160"/>
-              <w:bottom w:type="dxa" w:w="140"/>
+              <w:bottom w:type="dxa" w:w="90"/>
               <w:right w:type="dxa" w:w="160"/>
             </w:tcMar>
           </w:tcPr>
@@ -101,7 +101,7 @@
     </w:tbl>
     <w:p>
       <w:pPr>
-        <w:spacing w:after="200"/>
+        <w:spacing w:after="80"/>
       </w:pPr>
     </w:p>
     <w:tbl>
@@ -313,12 +313,12 @@
     </w:tbl>
     <w:p>
       <w:pPr>
-        <w:spacing w:after="220"/>
-      </w:pPr>
-    </w:p>
-    <w:p>
-      <w:pPr>
-        <w:spacing w:after="140" w:before="0"/>
+        <w:spacing w:after="80"/>
+      </w:pPr>
+    </w:p>
+    <w:p>
+      <w:pPr>
+        <w:spacing w:after="80" w:before="0"/>
       </w:pPr>
       <w:r>
         <w:rPr>
@@ -337,7 +337,7 @@
         <w:pBdr>
           <w:bottom w:val="single" w:color="163B65" w:sz="8" w:space="4"/>
         </w:pBdr>
-        <w:spacing w:after="130" w:before="280"/>
+        <w:spacing w:after="90" w:before="100"/>
       </w:pPr>
       <w:r>
         <w:rPr>
@@ -345,15 +345,15 @@
           <w:b/>
           <w:bCs/>
           <w:color w:val="163B65"/>
-          <w:sz w:val="27"/>
-          <w:szCs w:val="27"/>
+          <w:sz w:val="26"/>
+          <w:szCs w:val="26"/>
         </w:rPr>
         <w:t xml:space="preserve">Part I: Vocabulary</w:t>
       </w:r>
     </w:p>
     <w:p>
       <w:pPr>
-        <w:spacing w:after="100" w:before="0"/>
+        <w:spacing w:after="50" w:before="0"/>
       </w:pPr>
       <w:r>
         <w:rPr>
@@ -369,7 +369,7 @@
     </w:p>
     <w:p>
       <w:pPr>
-        <w:spacing w:after="160" w:before="0"/>
+        <w:spacing w:after="70" w:before="0"/>
       </w:pPr>
       <w:r>
         <w:rPr>
@@ -382,7 +382,7 @@
     </w:p>
     <w:p>
       <w:pPr>
-        <w:spacing w:after="60" w:before="0"/>
+        <w:spacing w:after="30" w:before="0"/>
       </w:pPr>
       <w:r>
         <w:rPr>
@@ -406,32 +406,34 @@
         </w:tblBorders>
       </w:tblPr>
       <w:tblGrid>
-        <w:gridCol w:w="4680"/>
-        <w:gridCol w:w="4680"/>
+        <w:gridCol w:w="2100"/>
+        <w:gridCol w:w="2100"/>
+        <w:gridCol w:w="2500"/>
+        <w:gridCol w:w="2660"/>
       </w:tblGrid>
       <w:tr>
         <w:tc>
           <w:tcPr>
-            <w:tcW w:type="dxa" w:w="4680"/>
-            <w:tcBorders>
-              <w:top w:val="none" w:color="FFFFFF" w:sz="0"/>
-              <w:left w:val="none" w:color="FFFFFF" w:sz="0"/>
-              <w:bottom w:val="none" w:color="FFFFFF" w:sz="0"/>
-              <w:right w:val="none" w:color="FFFFFF" w:sz="0"/>
-            </w:tcBorders>
-            <w:tcMar>
-              <w:top w:type="dxa" w:w="20"/>
+            <w:tcW w:type="dxa" w:w="2100"/>
+            <w:tcBorders>
+              <w:top w:val="none" w:color="FFFFFF" w:sz="0"/>
+              <w:left w:val="none" w:color="FFFFFF" w:sz="0"/>
+              <w:bottom w:val="none" w:color="FFFFFF" w:sz="0"/>
+              <w:right w:val="none" w:color="FFFFFF" w:sz="0"/>
+            </w:tcBorders>
+            <w:tcMar>
+              <w:top w:type="dxa" w:w="10"/>
               <w:left w:type="dxa" w:w="360"/>
-              <w:bottom w:type="dxa" w:w="20"/>
-              <w:right w:type="dxa" w:w="80"/>
-            </w:tcMar>
-          </w:tcPr>
-          <w:p>
-            <w:r>
-              <w:rPr>
-                <w:rFonts w:ascii="Times New Roman" w:cs="Times New Roman" w:eastAsia="Times New Roman" w:hAnsi="Times New Roman"/>
-                <w:sz w:val="20"/>
-                <w:szCs w:val="20"/>
+              <w:bottom w:type="dxa" w:w="10"/>
+              <w:right w:type="dxa" w:w="40"/>
+            </w:tcMar>
+          </w:tcPr>
+          <w:p>
+            <w:r>
+              <w:rPr>
+                <w:rFonts w:ascii="Times New Roman" w:cs="Times New Roman" w:eastAsia="Times New Roman" w:hAnsi="Times New Roman"/>
+                <w:sz w:val="19"/>
+                <w:szCs w:val="19"/>
               </w:rPr>
               <w:t xml:space="preserve">A. Visitor</w:t>
             </w:r>
@@ -439,82 +441,80 @@
         </w:tc>
         <w:tc>
           <w:tcPr>
-            <w:tcW w:type="dxa" w:w="4680"/>
-            <w:tcBorders>
-              <w:top w:val="none" w:color="FFFFFF" w:sz="0"/>
-              <w:left w:val="none" w:color="FFFFFF" w:sz="0"/>
-              <w:bottom w:val="none" w:color="FFFFFF" w:sz="0"/>
-              <w:right w:val="none" w:color="FFFFFF" w:sz="0"/>
-            </w:tcBorders>
-            <w:tcMar>
-              <w:top w:type="dxa" w:w="20"/>
+            <w:tcW w:type="dxa" w:w="2100"/>
+            <w:tcBorders>
+              <w:top w:val="none" w:color="FFFFFF" w:sz="0"/>
+              <w:left w:val="none" w:color="FFFFFF" w:sz="0"/>
+              <w:bottom w:val="none" w:color="FFFFFF" w:sz="0"/>
+              <w:right w:val="none" w:color="FFFFFF" w:sz="0"/>
+            </w:tcBorders>
+            <w:tcMar>
+              <w:top w:type="dxa" w:w="10"/>
               <w:left w:type="dxa" w:w="360"/>
-              <w:bottom w:type="dxa" w:w="20"/>
-              <w:right w:type="dxa" w:w="80"/>
-            </w:tcMar>
-          </w:tcPr>
-          <w:p>
-            <w:r>
-              <w:rPr>
-                <w:rFonts w:ascii="Times New Roman" w:cs="Times New Roman" w:eastAsia="Times New Roman" w:hAnsi="Times New Roman"/>
-                <w:sz w:val="20"/>
-                <w:szCs w:val="20"/>
+              <w:bottom w:type="dxa" w:w="10"/>
+              <w:right w:type="dxa" w:w="40"/>
+            </w:tcMar>
+          </w:tcPr>
+          <w:p>
+            <w:r>
+              <w:rPr>
+                <w:rFonts w:ascii="Times New Roman" w:cs="Times New Roman" w:eastAsia="Times New Roman" w:hAnsi="Times New Roman"/>
+                <w:sz w:val="19"/>
+                <w:szCs w:val="19"/>
+              </w:rPr>
+              <w:t xml:space="preserve">B. Exhibitor</w:t>
+            </w:r>
+          </w:p>
+        </w:tc>
+        <w:tc>
+          <w:tcPr>
+            <w:tcW w:type="dxa" w:w="2500"/>
+            <w:tcBorders>
+              <w:top w:val="none" w:color="FFFFFF" w:sz="0"/>
+              <w:left w:val="none" w:color="FFFFFF" w:sz="0"/>
+              <w:bottom w:val="none" w:color="FFFFFF" w:sz="0"/>
+              <w:right w:val="none" w:color="FFFFFF" w:sz="0"/>
+            </w:tcBorders>
+            <w:tcMar>
+              <w:top w:type="dxa" w:w="10"/>
+              <w:left w:type="dxa" w:w="360"/>
+              <w:bottom w:type="dxa" w:w="10"/>
+              <w:right w:type="dxa" w:w="40"/>
+            </w:tcMar>
+          </w:tcPr>
+          <w:p>
+            <w:r>
+              <w:rPr>
+                <w:rFonts w:ascii="Times New Roman" w:cs="Times New Roman" w:eastAsia="Times New Roman" w:hAnsi="Times New Roman"/>
+                <w:sz w:val="19"/>
+                <w:szCs w:val="19"/>
               </w:rPr>
               <w:t xml:space="preserve">C. Competitor</w:t>
             </w:r>
           </w:p>
         </w:tc>
-      </w:tr>
-      <w:tr>
-        <w:tc>
-          <w:tcPr>
-            <w:tcW w:type="dxa" w:w="4680"/>
-            <w:tcBorders>
-              <w:top w:val="none" w:color="FFFFFF" w:sz="0"/>
-              <w:left w:val="none" w:color="FFFFFF" w:sz="0"/>
-              <w:bottom w:val="none" w:color="FFFFFF" w:sz="0"/>
-              <w:right w:val="none" w:color="FFFFFF" w:sz="0"/>
-            </w:tcBorders>
-            <w:tcMar>
-              <w:top w:type="dxa" w:w="20"/>
+        <w:tc>
+          <w:tcPr>
+            <w:tcW w:type="dxa" w:w="2660"/>
+            <w:tcBorders>
+              <w:top w:val="none" w:color="FFFFFF" w:sz="0"/>
+              <w:left w:val="none" w:color="FFFFFF" w:sz="0"/>
+              <w:bottom w:val="none" w:color="FFFFFF" w:sz="0"/>
+              <w:right w:val="none" w:color="FFFFFF" w:sz="0"/>
+            </w:tcBorders>
+            <w:tcMar>
+              <w:top w:type="dxa" w:w="10"/>
               <w:left w:type="dxa" w:w="360"/>
-              <w:bottom w:type="dxa" w:w="20"/>
-              <w:right w:type="dxa" w:w="80"/>
-            </w:tcMar>
-          </w:tcPr>
-          <w:p>
-            <w:r>
-              <w:rPr>
-                <w:rFonts w:ascii="Times New Roman" w:cs="Times New Roman" w:eastAsia="Times New Roman" w:hAnsi="Times New Roman"/>
-                <w:sz w:val="20"/>
-                <w:szCs w:val="20"/>
-              </w:rPr>
-              <w:t xml:space="preserve">B. Exhibitor</w:t>
-            </w:r>
-          </w:p>
-        </w:tc>
-        <w:tc>
-          <w:tcPr>
-            <w:tcW w:type="dxa" w:w="4680"/>
-            <w:tcBorders>
-              <w:top w:val="none" w:color="FFFFFF" w:sz="0"/>
-              <w:left w:val="none" w:color="FFFFFF" w:sz="0"/>
-              <w:bottom w:val="none" w:color="FFFFFF" w:sz="0"/>
-              <w:right w:val="none" w:color="FFFFFF" w:sz="0"/>
-            </w:tcBorders>
-            <w:tcMar>
-              <w:top w:type="dxa" w:w="20"/>
-              <w:left w:type="dxa" w:w="360"/>
-              <w:bottom w:type="dxa" w:w="20"/>
-              <w:right w:type="dxa" w:w="80"/>
-            </w:tcMar>
-          </w:tcPr>
-          <w:p>
-            <w:r>
-              <w:rPr>
-                <w:rFonts w:ascii="Times New Roman" w:cs="Times New Roman" w:eastAsia="Times New Roman" w:hAnsi="Times New Roman"/>
-                <w:sz w:val="20"/>
-                <w:szCs w:val="20"/>
+              <w:bottom w:type="dxa" w:w="10"/>
+              <w:right w:type="dxa" w:w="40"/>
+            </w:tcMar>
+          </w:tcPr>
+          <w:p>
+            <w:r>
+              <w:rPr>
+                <w:rFonts w:ascii="Times New Roman" w:cs="Times New Roman" w:eastAsia="Times New Roman" w:hAnsi="Times New Roman"/>
+                <w:sz w:val="19"/>
+                <w:szCs w:val="19"/>
               </w:rPr>
               <w:t xml:space="preserve">D. Lead</w:t>
             </w:r>
@@ -524,12 +524,12 @@
     </w:tbl>
     <w:p>
       <w:pPr>
-        <w:spacing w:after="120"/>
-      </w:pPr>
-    </w:p>
-    <w:p>
-      <w:pPr>
-        <w:spacing w:after="60" w:before="0"/>
+        <w:spacing w:after="40"/>
+      </w:pPr>
+    </w:p>
+    <w:p>
+      <w:pPr>
+        <w:spacing w:after="30" w:before="0"/>
       </w:pPr>
       <w:r>
         <w:rPr>
@@ -553,32 +553,34 @@
         </w:tblBorders>
       </w:tblPr>
       <w:tblGrid>
-        <w:gridCol w:w="4680"/>
-        <w:gridCol w:w="4680"/>
+        <w:gridCol w:w="2100"/>
+        <w:gridCol w:w="2100"/>
+        <w:gridCol w:w="2500"/>
+        <w:gridCol w:w="2660"/>
       </w:tblGrid>
       <w:tr>
         <w:tc>
           <w:tcPr>
-            <w:tcW w:type="dxa" w:w="4680"/>
-            <w:tcBorders>
-              <w:top w:val="none" w:color="FFFFFF" w:sz="0"/>
-              <w:left w:val="none" w:color="FFFFFF" w:sz="0"/>
-              <w:bottom w:val="none" w:color="FFFFFF" w:sz="0"/>
-              <w:right w:val="none" w:color="FFFFFF" w:sz="0"/>
-            </w:tcBorders>
-            <w:tcMar>
-              <w:top w:type="dxa" w:w="20"/>
+            <w:tcW w:type="dxa" w:w="2100"/>
+            <w:tcBorders>
+              <w:top w:val="none" w:color="FFFFFF" w:sz="0"/>
+              <w:left w:val="none" w:color="FFFFFF" w:sz="0"/>
+              <w:bottom w:val="none" w:color="FFFFFF" w:sz="0"/>
+              <w:right w:val="none" w:color="FFFFFF" w:sz="0"/>
+            </w:tcBorders>
+            <w:tcMar>
+              <w:top w:type="dxa" w:w="10"/>
               <w:left w:type="dxa" w:w="360"/>
-              <w:bottom w:type="dxa" w:w="20"/>
-              <w:right w:type="dxa" w:w="80"/>
-            </w:tcMar>
-          </w:tcPr>
-          <w:p>
-            <w:r>
-              <w:rPr>
-                <w:rFonts w:ascii="Times New Roman" w:cs="Times New Roman" w:eastAsia="Times New Roman" w:hAnsi="Times New Roman"/>
-                <w:sz w:val="20"/>
-                <w:szCs w:val="20"/>
+              <w:bottom w:type="dxa" w:w="10"/>
+              <w:right w:type="dxa" w:w="40"/>
+            </w:tcMar>
+          </w:tcPr>
+          <w:p>
+            <w:r>
+              <w:rPr>
+                <w:rFonts w:ascii="Times New Roman" w:cs="Times New Roman" w:eastAsia="Times New Roman" w:hAnsi="Times New Roman"/>
+                <w:sz w:val="19"/>
+                <w:szCs w:val="19"/>
               </w:rPr>
               <w:t xml:space="preserve">A. Lead</w:t>
             </w:r>
@@ -586,82 +588,80 @@
         </w:tc>
         <w:tc>
           <w:tcPr>
-            <w:tcW w:type="dxa" w:w="4680"/>
-            <w:tcBorders>
-              <w:top w:val="none" w:color="FFFFFF" w:sz="0"/>
-              <w:left w:val="none" w:color="FFFFFF" w:sz="0"/>
-              <w:bottom w:val="none" w:color="FFFFFF" w:sz="0"/>
-              <w:right w:val="none" w:color="FFFFFF" w:sz="0"/>
-            </w:tcBorders>
-            <w:tcMar>
-              <w:top w:type="dxa" w:w="20"/>
+            <w:tcW w:type="dxa" w:w="2100"/>
+            <w:tcBorders>
+              <w:top w:val="none" w:color="FFFFFF" w:sz="0"/>
+              <w:left w:val="none" w:color="FFFFFF" w:sz="0"/>
+              <w:bottom w:val="none" w:color="FFFFFF" w:sz="0"/>
+              <w:right w:val="none" w:color="FFFFFF" w:sz="0"/>
+            </w:tcBorders>
+            <w:tcMar>
+              <w:top w:type="dxa" w:w="10"/>
               <w:left w:type="dxa" w:w="360"/>
-              <w:bottom w:type="dxa" w:w="20"/>
-              <w:right w:type="dxa" w:w="80"/>
-            </w:tcMar>
-          </w:tcPr>
-          <w:p>
-            <w:r>
-              <w:rPr>
-                <w:rFonts w:ascii="Times New Roman" w:cs="Times New Roman" w:eastAsia="Times New Roman" w:hAnsi="Times New Roman"/>
-                <w:sz w:val="20"/>
-                <w:szCs w:val="20"/>
+              <w:bottom w:type="dxa" w:w="10"/>
+              <w:right w:type="dxa" w:w="40"/>
+            </w:tcMar>
+          </w:tcPr>
+          <w:p>
+            <w:r>
+              <w:rPr>
+                <w:rFonts w:ascii="Times New Roman" w:cs="Times New Roman" w:eastAsia="Times New Roman" w:hAnsi="Times New Roman"/>
+                <w:sz w:val="19"/>
+                <w:szCs w:val="19"/>
+              </w:rPr>
+              <w:t xml:space="preserve">B. Pitch</w:t>
+            </w:r>
+          </w:p>
+        </w:tc>
+        <w:tc>
+          <w:tcPr>
+            <w:tcW w:type="dxa" w:w="2500"/>
+            <w:tcBorders>
+              <w:top w:val="none" w:color="FFFFFF" w:sz="0"/>
+              <w:left w:val="none" w:color="FFFFFF" w:sz="0"/>
+              <w:bottom w:val="none" w:color="FFFFFF" w:sz="0"/>
+              <w:right w:val="none" w:color="FFFFFF" w:sz="0"/>
+            </w:tcBorders>
+            <w:tcMar>
+              <w:top w:type="dxa" w:w="10"/>
+              <w:left w:type="dxa" w:w="360"/>
+              <w:bottom w:type="dxa" w:w="10"/>
+              <w:right w:type="dxa" w:w="40"/>
+            </w:tcMar>
+          </w:tcPr>
+          <w:p>
+            <w:r>
+              <w:rPr>
+                <w:rFonts w:ascii="Times New Roman" w:cs="Times New Roman" w:eastAsia="Times New Roman" w:hAnsi="Times New Roman"/>
+                <w:sz w:val="19"/>
+                <w:szCs w:val="19"/>
               </w:rPr>
               <w:t xml:space="preserve">C. Brochure</w:t>
             </w:r>
           </w:p>
         </w:tc>
-      </w:tr>
-      <w:tr>
-        <w:tc>
-          <w:tcPr>
-            <w:tcW w:type="dxa" w:w="4680"/>
-            <w:tcBorders>
-              <w:top w:val="none" w:color="FFFFFF" w:sz="0"/>
-              <w:left w:val="none" w:color="FFFFFF" w:sz="0"/>
-              <w:bottom w:val="none" w:color="FFFFFF" w:sz="0"/>
-              <w:right w:val="none" w:color="FFFFFF" w:sz="0"/>
-            </w:tcBorders>
-            <w:tcMar>
-              <w:top w:type="dxa" w:w="20"/>
+        <w:tc>
+          <w:tcPr>
+            <w:tcW w:type="dxa" w:w="2660"/>
+            <w:tcBorders>
+              <w:top w:val="none" w:color="FFFFFF" w:sz="0"/>
+              <w:left w:val="none" w:color="FFFFFF" w:sz="0"/>
+              <w:bottom w:val="none" w:color="FFFFFF" w:sz="0"/>
+              <w:right w:val="none" w:color="FFFFFF" w:sz="0"/>
+            </w:tcBorders>
+            <w:tcMar>
+              <w:top w:type="dxa" w:w="10"/>
               <w:left w:type="dxa" w:w="360"/>
-              <w:bottom w:type="dxa" w:w="20"/>
-              <w:right w:type="dxa" w:w="80"/>
-            </w:tcMar>
-          </w:tcPr>
-          <w:p>
-            <w:r>
-              <w:rPr>
-                <w:rFonts w:ascii="Times New Roman" w:cs="Times New Roman" w:eastAsia="Times New Roman" w:hAnsi="Times New Roman"/>
-                <w:sz w:val="20"/>
-                <w:szCs w:val="20"/>
-              </w:rPr>
-              <w:t xml:space="preserve">B. Pitch</w:t>
-            </w:r>
-          </w:p>
-        </w:tc>
-        <w:tc>
-          <w:tcPr>
-            <w:tcW w:type="dxa" w:w="4680"/>
-            <w:tcBorders>
-              <w:top w:val="none" w:color="FFFFFF" w:sz="0"/>
-              <w:left w:val="none" w:color="FFFFFF" w:sz="0"/>
-              <w:bottom w:val="none" w:color="FFFFFF" w:sz="0"/>
-              <w:right w:val="none" w:color="FFFFFF" w:sz="0"/>
-            </w:tcBorders>
-            <w:tcMar>
-              <w:top w:type="dxa" w:w="20"/>
-              <w:left w:type="dxa" w:w="360"/>
-              <w:bottom w:type="dxa" w:w="20"/>
-              <w:right w:type="dxa" w:w="80"/>
-            </w:tcMar>
-          </w:tcPr>
-          <w:p>
-            <w:r>
-              <w:rPr>
-                <w:rFonts w:ascii="Times New Roman" w:cs="Times New Roman" w:eastAsia="Times New Roman" w:hAnsi="Times New Roman"/>
-                <w:sz w:val="20"/>
-                <w:szCs w:val="20"/>
+              <w:bottom w:type="dxa" w:w="10"/>
+              <w:right w:type="dxa" w:w="40"/>
+            </w:tcMar>
+          </w:tcPr>
+          <w:p>
+            <w:r>
+              <w:rPr>
+                <w:rFonts w:ascii="Times New Roman" w:cs="Times New Roman" w:eastAsia="Times New Roman" w:hAnsi="Times New Roman"/>
+                <w:sz w:val="19"/>
+                <w:szCs w:val="19"/>
               </w:rPr>
               <w:t xml:space="preserve">D. Target audience</w:t>
             </w:r>
@@ -671,12 +671,12 @@
     </w:tbl>
     <w:p>
       <w:pPr>
-        <w:spacing w:after="120"/>
-      </w:pPr>
-    </w:p>
-    <w:p>
-      <w:pPr>
-        <w:spacing w:after="60" w:before="0"/>
+        <w:spacing w:after="40"/>
+      </w:pPr>
+    </w:p>
+    <w:p>
+      <w:pPr>
+        <w:spacing w:after="30" w:before="0"/>
       </w:pPr>
       <w:r>
         <w:rPr>
@@ -700,32 +700,34 @@
         </w:tblBorders>
       </w:tblPr>
       <w:tblGrid>
-        <w:gridCol w:w="4680"/>
-        <w:gridCol w:w="4680"/>
+        <w:gridCol w:w="2100"/>
+        <w:gridCol w:w="2100"/>
+        <w:gridCol w:w="2500"/>
+        <w:gridCol w:w="2660"/>
       </w:tblGrid>
       <w:tr>
         <w:tc>
           <w:tcPr>
-            <w:tcW w:type="dxa" w:w="4680"/>
-            <w:tcBorders>
-              <w:top w:val="none" w:color="FFFFFF" w:sz="0"/>
-              <w:left w:val="none" w:color="FFFFFF" w:sz="0"/>
-              <w:bottom w:val="none" w:color="FFFFFF" w:sz="0"/>
-              <w:right w:val="none" w:color="FFFFFF" w:sz="0"/>
-            </w:tcBorders>
-            <w:tcMar>
-              <w:top w:type="dxa" w:w="20"/>
+            <w:tcW w:type="dxa" w:w="2100"/>
+            <w:tcBorders>
+              <w:top w:val="none" w:color="FFFFFF" w:sz="0"/>
+              <w:left w:val="none" w:color="FFFFFF" w:sz="0"/>
+              <w:bottom w:val="none" w:color="FFFFFF" w:sz="0"/>
+              <w:right w:val="none" w:color="FFFFFF" w:sz="0"/>
+            </w:tcBorders>
+            <w:tcMar>
+              <w:top w:type="dxa" w:w="10"/>
               <w:left w:type="dxa" w:w="360"/>
-              <w:bottom w:type="dxa" w:w="20"/>
-              <w:right w:type="dxa" w:w="80"/>
-            </w:tcMar>
-          </w:tcPr>
-          <w:p>
-            <w:r>
-              <w:rPr>
-                <w:rFonts w:ascii="Times New Roman" w:cs="Times New Roman" w:eastAsia="Times New Roman" w:hAnsi="Times New Roman"/>
-                <w:sz w:val="20"/>
-                <w:szCs w:val="20"/>
+              <w:bottom w:type="dxa" w:w="10"/>
+              <w:right w:type="dxa" w:w="40"/>
+            </w:tcMar>
+          </w:tcPr>
+          <w:p>
+            <w:r>
+              <w:rPr>
+                <w:rFonts w:ascii="Times New Roman" w:cs="Times New Roman" w:eastAsia="Times New Roman" w:hAnsi="Times New Roman"/>
+                <w:sz w:val="19"/>
+                <w:szCs w:val="19"/>
               </w:rPr>
               <w:t xml:space="preserve">A. Brochure</w:t>
             </w:r>
@@ -733,82 +735,80 @@
         </w:tc>
         <w:tc>
           <w:tcPr>
-            <w:tcW w:type="dxa" w:w="4680"/>
-            <w:tcBorders>
-              <w:top w:val="none" w:color="FFFFFF" w:sz="0"/>
-              <w:left w:val="none" w:color="FFFFFF" w:sz="0"/>
-              <w:bottom w:val="none" w:color="FFFFFF" w:sz="0"/>
-              <w:right w:val="none" w:color="FFFFFF" w:sz="0"/>
-            </w:tcBorders>
-            <w:tcMar>
-              <w:top w:type="dxa" w:w="20"/>
+            <w:tcW w:type="dxa" w:w="2100"/>
+            <w:tcBorders>
+              <w:top w:val="none" w:color="FFFFFF" w:sz="0"/>
+              <w:left w:val="none" w:color="FFFFFF" w:sz="0"/>
+              <w:bottom w:val="none" w:color="FFFFFF" w:sz="0"/>
+              <w:right w:val="none" w:color="FFFFFF" w:sz="0"/>
+            </w:tcBorders>
+            <w:tcMar>
+              <w:top w:type="dxa" w:w="10"/>
               <w:left w:type="dxa" w:w="360"/>
-              <w:bottom w:type="dxa" w:w="20"/>
-              <w:right w:type="dxa" w:w="80"/>
-            </w:tcMar>
-          </w:tcPr>
-          <w:p>
-            <w:r>
-              <w:rPr>
-                <w:rFonts w:ascii="Times New Roman" w:cs="Times New Roman" w:eastAsia="Times New Roman" w:hAnsi="Times New Roman"/>
-                <w:sz w:val="20"/>
-                <w:szCs w:val="20"/>
+              <w:bottom w:type="dxa" w:w="10"/>
+              <w:right w:type="dxa" w:w="40"/>
+            </w:tcMar>
+          </w:tcPr>
+          <w:p>
+            <w:r>
+              <w:rPr>
+                <w:rFonts w:ascii="Times New Roman" w:cs="Times New Roman" w:eastAsia="Times New Roman" w:hAnsi="Times New Roman"/>
+                <w:sz w:val="19"/>
+                <w:szCs w:val="19"/>
+              </w:rPr>
+              <w:t xml:space="preserve">B. Follow up</w:t>
+            </w:r>
+          </w:p>
+        </w:tc>
+        <w:tc>
+          <w:tcPr>
+            <w:tcW w:type="dxa" w:w="2500"/>
+            <w:tcBorders>
+              <w:top w:val="none" w:color="FFFFFF" w:sz="0"/>
+              <w:left w:val="none" w:color="FFFFFF" w:sz="0"/>
+              <w:bottom w:val="none" w:color="FFFFFF" w:sz="0"/>
+              <w:right w:val="none" w:color="FFFFFF" w:sz="0"/>
+            </w:tcBorders>
+            <w:tcMar>
+              <w:top w:type="dxa" w:w="10"/>
+              <w:left w:type="dxa" w:w="360"/>
+              <w:bottom w:type="dxa" w:w="10"/>
+              <w:right w:type="dxa" w:w="40"/>
+            </w:tcMar>
+          </w:tcPr>
+          <w:p>
+            <w:r>
+              <w:rPr>
+                <w:rFonts w:ascii="Times New Roman" w:cs="Times New Roman" w:eastAsia="Times New Roman" w:hAnsi="Times New Roman"/>
+                <w:sz w:val="19"/>
+                <w:szCs w:val="19"/>
               </w:rPr>
               <w:t xml:space="preserve">C. Pitch</w:t>
             </w:r>
           </w:p>
         </w:tc>
-      </w:tr>
-      <w:tr>
-        <w:tc>
-          <w:tcPr>
-            <w:tcW w:type="dxa" w:w="4680"/>
-            <w:tcBorders>
-              <w:top w:val="none" w:color="FFFFFF" w:sz="0"/>
-              <w:left w:val="none" w:color="FFFFFF" w:sz="0"/>
-              <w:bottom w:val="none" w:color="FFFFFF" w:sz="0"/>
-              <w:right w:val="none" w:color="FFFFFF" w:sz="0"/>
-            </w:tcBorders>
-            <w:tcMar>
-              <w:top w:type="dxa" w:w="20"/>
+        <w:tc>
+          <w:tcPr>
+            <w:tcW w:type="dxa" w:w="2660"/>
+            <w:tcBorders>
+              <w:top w:val="none" w:color="FFFFFF" w:sz="0"/>
+              <w:left w:val="none" w:color="FFFFFF" w:sz="0"/>
+              <w:bottom w:val="none" w:color="FFFFFF" w:sz="0"/>
+              <w:right w:val="none" w:color="FFFFFF" w:sz="0"/>
+            </w:tcBorders>
+            <w:tcMar>
+              <w:top w:type="dxa" w:w="10"/>
               <w:left w:type="dxa" w:w="360"/>
-              <w:bottom w:type="dxa" w:w="20"/>
-              <w:right w:type="dxa" w:w="80"/>
-            </w:tcMar>
-          </w:tcPr>
-          <w:p>
-            <w:r>
-              <w:rPr>
-                <w:rFonts w:ascii="Times New Roman" w:cs="Times New Roman" w:eastAsia="Times New Roman" w:hAnsi="Times New Roman"/>
-                <w:sz w:val="20"/>
-                <w:szCs w:val="20"/>
-              </w:rPr>
-              <w:t xml:space="preserve">B. Follow up</w:t>
-            </w:r>
-          </w:p>
-        </w:tc>
-        <w:tc>
-          <w:tcPr>
-            <w:tcW w:type="dxa" w:w="4680"/>
-            <w:tcBorders>
-              <w:top w:val="none" w:color="FFFFFF" w:sz="0"/>
-              <w:left w:val="none" w:color="FFFFFF" w:sz="0"/>
-              <w:bottom w:val="none" w:color="FFFFFF" w:sz="0"/>
-              <w:right w:val="none" w:color="FFFFFF" w:sz="0"/>
-            </w:tcBorders>
-            <w:tcMar>
-              <w:top w:type="dxa" w:w="20"/>
-              <w:left w:type="dxa" w:w="360"/>
-              <w:bottom w:type="dxa" w:w="20"/>
-              <w:right w:type="dxa" w:w="80"/>
-            </w:tcMar>
-          </w:tcPr>
-          <w:p>
-            <w:r>
-              <w:rPr>
-                <w:rFonts w:ascii="Times New Roman" w:cs="Times New Roman" w:eastAsia="Times New Roman" w:hAnsi="Times New Roman"/>
-                <w:sz w:val="20"/>
-                <w:szCs w:val="20"/>
+              <w:bottom w:type="dxa" w:w="10"/>
+              <w:right w:type="dxa" w:w="40"/>
+            </w:tcMar>
+          </w:tcPr>
+          <w:p>
+            <w:r>
+              <w:rPr>
+                <w:rFonts w:ascii="Times New Roman" w:cs="Times New Roman" w:eastAsia="Times New Roman" w:hAnsi="Times New Roman"/>
+                <w:sz w:val="19"/>
+                <w:szCs w:val="19"/>
               </w:rPr>
               <w:t xml:space="preserve">D. Exhibitor</w:t>
             </w:r>
@@ -818,12 +818,12 @@
     </w:tbl>
     <w:p>
       <w:pPr>
-        <w:spacing w:after="120"/>
-      </w:pPr>
-    </w:p>
-    <w:p>
-      <w:pPr>
-        <w:spacing w:after="60" w:before="0"/>
+        <w:spacing w:after="40"/>
+      </w:pPr>
+    </w:p>
+    <w:p>
+      <w:pPr>
+        <w:spacing w:after="30" w:before="0"/>
       </w:pPr>
       <w:r>
         <w:rPr>
@@ -847,32 +847,34 @@
         </w:tblBorders>
       </w:tblPr>
       <w:tblGrid>
-        <w:gridCol w:w="4680"/>
-        <w:gridCol w:w="4680"/>
+        <w:gridCol w:w="2100"/>
+        <w:gridCol w:w="2100"/>
+        <w:gridCol w:w="2500"/>
+        <w:gridCol w:w="2660"/>
       </w:tblGrid>
       <w:tr>
         <w:tc>
           <w:tcPr>
-            <w:tcW w:type="dxa" w:w="4680"/>
-            <w:tcBorders>
-              <w:top w:val="none" w:color="FFFFFF" w:sz="0"/>
-              <w:left w:val="none" w:color="FFFFFF" w:sz="0"/>
-              <w:bottom w:val="none" w:color="FFFFFF" w:sz="0"/>
-              <w:right w:val="none" w:color="FFFFFF" w:sz="0"/>
-            </w:tcBorders>
-            <w:tcMar>
-              <w:top w:type="dxa" w:w="20"/>
+            <w:tcW w:type="dxa" w:w="2100"/>
+            <w:tcBorders>
+              <w:top w:val="none" w:color="FFFFFF" w:sz="0"/>
+              <w:left w:val="none" w:color="FFFFFF" w:sz="0"/>
+              <w:bottom w:val="none" w:color="FFFFFF" w:sz="0"/>
+              <w:right w:val="none" w:color="FFFFFF" w:sz="0"/>
+            </w:tcBorders>
+            <w:tcMar>
+              <w:top w:type="dxa" w:w="10"/>
               <w:left w:type="dxa" w:w="360"/>
-              <w:bottom w:type="dxa" w:w="20"/>
-              <w:right w:type="dxa" w:w="80"/>
-            </w:tcMar>
-          </w:tcPr>
-          <w:p>
-            <w:r>
-              <w:rPr>
-                <w:rFonts w:ascii="Times New Roman" w:cs="Times New Roman" w:eastAsia="Times New Roman" w:hAnsi="Times New Roman"/>
-                <w:sz w:val="20"/>
-                <w:szCs w:val="20"/>
+              <w:bottom w:type="dxa" w:w="10"/>
+              <w:right w:type="dxa" w:w="40"/>
+            </w:tcMar>
+          </w:tcPr>
+          <w:p>
+            <w:r>
+              <w:rPr>
+                <w:rFonts w:ascii="Times New Roman" w:cs="Times New Roman" w:eastAsia="Times New Roman" w:hAnsi="Times New Roman"/>
+                <w:sz w:val="19"/>
+                <w:szCs w:val="19"/>
               </w:rPr>
               <w:t xml:space="preserve">A. Competitor</w:t>
             </w:r>
@@ -880,82 +882,80 @@
         </w:tc>
         <w:tc>
           <w:tcPr>
-            <w:tcW w:type="dxa" w:w="4680"/>
-            <w:tcBorders>
-              <w:top w:val="none" w:color="FFFFFF" w:sz="0"/>
-              <w:left w:val="none" w:color="FFFFFF" w:sz="0"/>
-              <w:bottom w:val="none" w:color="FFFFFF" w:sz="0"/>
-              <w:right w:val="none" w:color="FFFFFF" w:sz="0"/>
-            </w:tcBorders>
-            <w:tcMar>
-              <w:top w:type="dxa" w:w="20"/>
+            <w:tcW w:type="dxa" w:w="2100"/>
+            <w:tcBorders>
+              <w:top w:val="none" w:color="FFFFFF" w:sz="0"/>
+              <w:left w:val="none" w:color="FFFFFF" w:sz="0"/>
+              <w:bottom w:val="none" w:color="FFFFFF" w:sz="0"/>
+              <w:right w:val="none" w:color="FFFFFF" w:sz="0"/>
+            </w:tcBorders>
+            <w:tcMar>
+              <w:top w:type="dxa" w:w="10"/>
               <w:left w:type="dxa" w:w="360"/>
-              <w:bottom w:type="dxa" w:w="20"/>
-              <w:right w:type="dxa" w:w="80"/>
-            </w:tcMar>
-          </w:tcPr>
-          <w:p>
-            <w:r>
-              <w:rPr>
-                <w:rFonts w:ascii="Times New Roman" w:cs="Times New Roman" w:eastAsia="Times New Roman" w:hAnsi="Times New Roman"/>
-                <w:sz w:val="20"/>
-                <w:szCs w:val="20"/>
+              <w:bottom w:type="dxa" w:w="10"/>
+              <w:right w:type="dxa" w:w="40"/>
+            </w:tcMar>
+          </w:tcPr>
+          <w:p>
+            <w:r>
+              <w:rPr>
+                <w:rFonts w:ascii="Times New Roman" w:cs="Times New Roman" w:eastAsia="Times New Roman" w:hAnsi="Times New Roman"/>
+                <w:sz w:val="19"/>
+                <w:szCs w:val="19"/>
+              </w:rPr>
+              <w:t xml:space="preserve">B. Target audience</w:t>
+            </w:r>
+          </w:p>
+        </w:tc>
+        <w:tc>
+          <w:tcPr>
+            <w:tcW w:type="dxa" w:w="2500"/>
+            <w:tcBorders>
+              <w:top w:val="none" w:color="FFFFFF" w:sz="0"/>
+              <w:left w:val="none" w:color="FFFFFF" w:sz="0"/>
+              <w:bottom w:val="none" w:color="FFFFFF" w:sz="0"/>
+              <w:right w:val="none" w:color="FFFFFF" w:sz="0"/>
+            </w:tcBorders>
+            <w:tcMar>
+              <w:top w:type="dxa" w:w="10"/>
+              <w:left w:type="dxa" w:w="360"/>
+              <w:bottom w:type="dxa" w:w="10"/>
+              <w:right w:type="dxa" w:w="40"/>
+            </w:tcMar>
+          </w:tcPr>
+          <w:p>
+            <w:r>
+              <w:rPr>
+                <w:rFonts w:ascii="Times New Roman" w:cs="Times New Roman" w:eastAsia="Times New Roman" w:hAnsi="Times New Roman"/>
+                <w:sz w:val="19"/>
+                <w:szCs w:val="19"/>
               </w:rPr>
               <w:t xml:space="preserve">C. Visitor</w:t>
             </w:r>
           </w:p>
         </w:tc>
-      </w:tr>
-      <w:tr>
-        <w:tc>
-          <w:tcPr>
-            <w:tcW w:type="dxa" w:w="4680"/>
-            <w:tcBorders>
-              <w:top w:val="none" w:color="FFFFFF" w:sz="0"/>
-              <w:left w:val="none" w:color="FFFFFF" w:sz="0"/>
-              <w:bottom w:val="none" w:color="FFFFFF" w:sz="0"/>
-              <w:right w:val="none" w:color="FFFFFF" w:sz="0"/>
-            </w:tcBorders>
-            <w:tcMar>
-              <w:top w:type="dxa" w:w="20"/>
+        <w:tc>
+          <w:tcPr>
+            <w:tcW w:type="dxa" w:w="2660"/>
+            <w:tcBorders>
+              <w:top w:val="none" w:color="FFFFFF" w:sz="0"/>
+              <w:left w:val="none" w:color="FFFFFF" w:sz="0"/>
+              <w:bottom w:val="none" w:color="FFFFFF" w:sz="0"/>
+              <w:right w:val="none" w:color="FFFFFF" w:sz="0"/>
+            </w:tcBorders>
+            <w:tcMar>
+              <w:top w:type="dxa" w:w="10"/>
               <w:left w:type="dxa" w:w="360"/>
-              <w:bottom w:type="dxa" w:w="20"/>
-              <w:right w:type="dxa" w:w="80"/>
-            </w:tcMar>
-          </w:tcPr>
-          <w:p>
-            <w:r>
-              <w:rPr>
-                <w:rFonts w:ascii="Times New Roman" w:cs="Times New Roman" w:eastAsia="Times New Roman" w:hAnsi="Times New Roman"/>
-                <w:sz w:val="20"/>
-                <w:szCs w:val="20"/>
-              </w:rPr>
-              <w:t xml:space="preserve">B. Target audience</w:t>
-            </w:r>
-          </w:p>
-        </w:tc>
-        <w:tc>
-          <w:tcPr>
-            <w:tcW w:type="dxa" w:w="4680"/>
-            <w:tcBorders>
-              <w:top w:val="none" w:color="FFFFFF" w:sz="0"/>
-              <w:left w:val="none" w:color="FFFFFF" w:sz="0"/>
-              <w:bottom w:val="none" w:color="FFFFFF" w:sz="0"/>
-              <w:right w:val="none" w:color="FFFFFF" w:sz="0"/>
-            </w:tcBorders>
-            <w:tcMar>
-              <w:top w:type="dxa" w:w="20"/>
-              <w:left w:type="dxa" w:w="360"/>
-              <w:bottom w:type="dxa" w:w="20"/>
-              <w:right w:type="dxa" w:w="80"/>
-            </w:tcMar>
-          </w:tcPr>
-          <w:p>
-            <w:r>
-              <w:rPr>
-                <w:rFonts w:ascii="Times New Roman" w:cs="Times New Roman" w:eastAsia="Times New Roman" w:hAnsi="Times New Roman"/>
-                <w:sz w:val="20"/>
-                <w:szCs w:val="20"/>
+              <w:bottom w:type="dxa" w:w="10"/>
+              <w:right w:type="dxa" w:w="40"/>
+            </w:tcMar>
+          </w:tcPr>
+          <w:p>
+            <w:r>
+              <w:rPr>
+                <w:rFonts w:ascii="Times New Roman" w:cs="Times New Roman" w:eastAsia="Times New Roman" w:hAnsi="Times New Roman"/>
+                <w:sz w:val="19"/>
+                <w:szCs w:val="19"/>
               </w:rPr>
               <w:t xml:space="preserve">D. Lead</w:t>
             </w:r>
@@ -965,12 +965,12 @@
     </w:tbl>
     <w:p>
       <w:pPr>
-        <w:spacing w:after="120"/>
-      </w:pPr>
-    </w:p>
-    <w:p>
-      <w:pPr>
-        <w:spacing w:after="60" w:before="0"/>
+        <w:spacing w:after="40"/>
+      </w:pPr>
+    </w:p>
+    <w:p>
+      <w:pPr>
+        <w:spacing w:after="30" w:before="0"/>
       </w:pPr>
       <w:r>
         <w:rPr>
@@ -994,32 +994,34 @@
         </w:tblBorders>
       </w:tblPr>
       <w:tblGrid>
-        <w:gridCol w:w="4680"/>
-        <w:gridCol w:w="4680"/>
+        <w:gridCol w:w="2100"/>
+        <w:gridCol w:w="2100"/>
+        <w:gridCol w:w="2500"/>
+        <w:gridCol w:w="2660"/>
       </w:tblGrid>
       <w:tr>
         <w:tc>
           <w:tcPr>
-            <w:tcW w:type="dxa" w:w="4680"/>
-            <w:tcBorders>
-              <w:top w:val="none" w:color="FFFFFF" w:sz="0"/>
-              <w:left w:val="none" w:color="FFFFFF" w:sz="0"/>
-              <w:bottom w:val="none" w:color="FFFFFF" w:sz="0"/>
-              <w:right w:val="none" w:color="FFFFFF" w:sz="0"/>
-            </w:tcBorders>
-            <w:tcMar>
-              <w:top w:type="dxa" w:w="20"/>
+            <w:tcW w:type="dxa" w:w="2100"/>
+            <w:tcBorders>
+              <w:top w:val="none" w:color="FFFFFF" w:sz="0"/>
+              <w:left w:val="none" w:color="FFFFFF" w:sz="0"/>
+              <w:bottom w:val="none" w:color="FFFFFF" w:sz="0"/>
+              <w:right w:val="none" w:color="FFFFFF" w:sz="0"/>
+            </w:tcBorders>
+            <w:tcMar>
+              <w:top w:type="dxa" w:w="10"/>
               <w:left w:type="dxa" w:w="360"/>
-              <w:bottom w:type="dxa" w:w="20"/>
-              <w:right w:type="dxa" w:w="80"/>
-            </w:tcMar>
-          </w:tcPr>
-          <w:p>
-            <w:r>
-              <w:rPr>
-                <w:rFonts w:ascii="Times New Roman" w:cs="Times New Roman" w:eastAsia="Times New Roman" w:hAnsi="Times New Roman"/>
-                <w:sz w:val="20"/>
-                <w:szCs w:val="20"/>
+              <w:bottom w:type="dxa" w:w="10"/>
+              <w:right w:type="dxa" w:w="40"/>
+            </w:tcMar>
+          </w:tcPr>
+          <w:p>
+            <w:r>
+              <w:rPr>
+                <w:rFonts w:ascii="Times New Roman" w:cs="Times New Roman" w:eastAsia="Times New Roman" w:hAnsi="Times New Roman"/>
+                <w:sz w:val="19"/>
+                <w:szCs w:val="19"/>
               </w:rPr>
               <w:t xml:space="preserve">A. Competitor</w:t>
             </w:r>
@@ -1027,82 +1029,80 @@
         </w:tc>
         <w:tc>
           <w:tcPr>
-            <w:tcW w:type="dxa" w:w="4680"/>
-            <w:tcBorders>
-              <w:top w:val="none" w:color="FFFFFF" w:sz="0"/>
-              <w:left w:val="none" w:color="FFFFFF" w:sz="0"/>
-              <w:bottom w:val="none" w:color="FFFFFF" w:sz="0"/>
-              <w:right w:val="none" w:color="FFFFFF" w:sz="0"/>
-            </w:tcBorders>
-            <w:tcMar>
-              <w:top w:type="dxa" w:w="20"/>
+            <w:tcW w:type="dxa" w:w="2100"/>
+            <w:tcBorders>
+              <w:top w:val="none" w:color="FFFFFF" w:sz="0"/>
+              <w:left w:val="none" w:color="FFFFFF" w:sz="0"/>
+              <w:bottom w:val="none" w:color="FFFFFF" w:sz="0"/>
+              <w:right w:val="none" w:color="FFFFFF" w:sz="0"/>
+            </w:tcBorders>
+            <w:tcMar>
+              <w:top w:type="dxa" w:w="10"/>
               <w:left w:type="dxa" w:w="360"/>
-              <w:bottom w:type="dxa" w:w="20"/>
-              <w:right w:type="dxa" w:w="80"/>
-            </w:tcMar>
-          </w:tcPr>
-          <w:p>
-            <w:r>
-              <w:rPr>
-                <w:rFonts w:ascii="Times New Roman" w:cs="Times New Roman" w:eastAsia="Times New Roman" w:hAnsi="Times New Roman"/>
-                <w:sz w:val="20"/>
-                <w:szCs w:val="20"/>
+              <w:bottom w:type="dxa" w:w="10"/>
+              <w:right w:type="dxa" w:w="40"/>
+            </w:tcMar>
+          </w:tcPr>
+          <w:p>
+            <w:r>
+              <w:rPr>
+                <w:rFonts w:ascii="Times New Roman" w:cs="Times New Roman" w:eastAsia="Times New Roman" w:hAnsi="Times New Roman"/>
+                <w:sz w:val="19"/>
+                <w:szCs w:val="19"/>
+              </w:rPr>
+              <w:t xml:space="preserve">B. Exhibitor</w:t>
+            </w:r>
+          </w:p>
+        </w:tc>
+        <w:tc>
+          <w:tcPr>
+            <w:tcW w:type="dxa" w:w="2500"/>
+            <w:tcBorders>
+              <w:top w:val="none" w:color="FFFFFF" w:sz="0"/>
+              <w:left w:val="none" w:color="FFFFFF" w:sz="0"/>
+              <w:bottom w:val="none" w:color="FFFFFF" w:sz="0"/>
+              <w:right w:val="none" w:color="FFFFFF" w:sz="0"/>
+            </w:tcBorders>
+            <w:tcMar>
+              <w:top w:type="dxa" w:w="10"/>
+              <w:left w:type="dxa" w:w="360"/>
+              <w:bottom w:type="dxa" w:w="10"/>
+              <w:right w:type="dxa" w:w="40"/>
+            </w:tcMar>
+          </w:tcPr>
+          <w:p>
+            <w:r>
+              <w:rPr>
+                <w:rFonts w:ascii="Times New Roman" w:cs="Times New Roman" w:eastAsia="Times New Roman" w:hAnsi="Times New Roman"/>
+                <w:sz w:val="19"/>
+                <w:szCs w:val="19"/>
               </w:rPr>
               <w:t xml:space="preserve">C. Visitor</w:t>
             </w:r>
           </w:p>
         </w:tc>
-      </w:tr>
-      <w:tr>
-        <w:tc>
-          <w:tcPr>
-            <w:tcW w:type="dxa" w:w="4680"/>
-            <w:tcBorders>
-              <w:top w:val="none" w:color="FFFFFF" w:sz="0"/>
-              <w:left w:val="none" w:color="FFFFFF" w:sz="0"/>
-              <w:bottom w:val="none" w:color="FFFFFF" w:sz="0"/>
-              <w:right w:val="none" w:color="FFFFFF" w:sz="0"/>
-            </w:tcBorders>
-            <w:tcMar>
-              <w:top w:type="dxa" w:w="20"/>
+        <w:tc>
+          <w:tcPr>
+            <w:tcW w:type="dxa" w:w="2660"/>
+            <w:tcBorders>
+              <w:top w:val="none" w:color="FFFFFF" w:sz="0"/>
+              <w:left w:val="none" w:color="FFFFFF" w:sz="0"/>
+              <w:bottom w:val="none" w:color="FFFFFF" w:sz="0"/>
+              <w:right w:val="none" w:color="FFFFFF" w:sz="0"/>
+            </w:tcBorders>
+            <w:tcMar>
+              <w:top w:type="dxa" w:w="10"/>
               <w:left w:type="dxa" w:w="360"/>
-              <w:bottom w:type="dxa" w:w="20"/>
-              <w:right w:type="dxa" w:w="80"/>
-            </w:tcMar>
-          </w:tcPr>
-          <w:p>
-            <w:r>
-              <w:rPr>
-                <w:rFonts w:ascii="Times New Roman" w:cs="Times New Roman" w:eastAsia="Times New Roman" w:hAnsi="Times New Roman"/>
-                <w:sz w:val="20"/>
-                <w:szCs w:val="20"/>
-              </w:rPr>
-              <w:t xml:space="preserve">B. Exhibitor</w:t>
-            </w:r>
-          </w:p>
-        </w:tc>
-        <w:tc>
-          <w:tcPr>
-            <w:tcW w:type="dxa" w:w="4680"/>
-            <w:tcBorders>
-              <w:top w:val="none" w:color="FFFFFF" w:sz="0"/>
-              <w:left w:val="none" w:color="FFFFFF" w:sz="0"/>
-              <w:bottom w:val="none" w:color="FFFFFF" w:sz="0"/>
-              <w:right w:val="none" w:color="FFFFFF" w:sz="0"/>
-            </w:tcBorders>
-            <w:tcMar>
-              <w:top w:type="dxa" w:w="20"/>
-              <w:left w:type="dxa" w:w="360"/>
-              <w:bottom w:type="dxa" w:w="20"/>
-              <w:right w:type="dxa" w:w="80"/>
-            </w:tcMar>
-          </w:tcPr>
-          <w:p>
-            <w:r>
-              <w:rPr>
-                <w:rFonts w:ascii="Times New Roman" w:cs="Times New Roman" w:eastAsia="Times New Roman" w:hAnsi="Times New Roman"/>
-                <w:sz w:val="20"/>
-                <w:szCs w:val="20"/>
+              <w:bottom w:type="dxa" w:w="10"/>
+              <w:right w:type="dxa" w:w="40"/>
+            </w:tcMar>
+          </w:tcPr>
+          <w:p>
+            <w:r>
+              <w:rPr>
+                <w:rFonts w:ascii="Times New Roman" w:cs="Times New Roman" w:eastAsia="Times New Roman" w:hAnsi="Times New Roman"/>
+                <w:sz w:val="19"/>
+                <w:szCs w:val="19"/>
               </w:rPr>
               <w:t xml:space="preserve">D. Target audience</w:t>
             </w:r>
@@ -1112,12 +1112,12 @@
     </w:tbl>
     <w:p>
       <w:pPr>
-        <w:spacing w:after="120"/>
-      </w:pPr>
-    </w:p>
-    <w:p>
-      <w:pPr>
-        <w:spacing w:after="60" w:before="0"/>
+        <w:spacing w:after="40"/>
+      </w:pPr>
+    </w:p>
+    <w:p>
+      <w:pPr>
+        <w:spacing w:after="30" w:before="0"/>
       </w:pPr>
       <w:r>
         <w:rPr>
@@ -1141,32 +1141,34 @@
         </w:tblBorders>
       </w:tblPr>
       <w:tblGrid>
-        <w:gridCol w:w="4680"/>
-        <w:gridCol w:w="4680"/>
+        <w:gridCol w:w="2100"/>
+        <w:gridCol w:w="2100"/>
+        <w:gridCol w:w="2500"/>
+        <w:gridCol w:w="2660"/>
       </w:tblGrid>
       <w:tr>
         <w:tc>
           <w:tcPr>
-            <w:tcW w:type="dxa" w:w="4680"/>
-            <w:tcBorders>
-              <w:top w:val="none" w:color="FFFFFF" w:sz="0"/>
-              <w:left w:val="none" w:color="FFFFFF" w:sz="0"/>
-              <w:bottom w:val="none" w:color="FFFFFF" w:sz="0"/>
-              <w:right w:val="none" w:color="FFFFFF" w:sz="0"/>
-            </w:tcBorders>
-            <w:tcMar>
-              <w:top w:type="dxa" w:w="20"/>
+            <w:tcW w:type="dxa" w:w="2100"/>
+            <w:tcBorders>
+              <w:top w:val="none" w:color="FFFFFF" w:sz="0"/>
+              <w:left w:val="none" w:color="FFFFFF" w:sz="0"/>
+              <w:bottom w:val="none" w:color="FFFFFF" w:sz="0"/>
+              <w:right w:val="none" w:color="FFFFFF" w:sz="0"/>
+            </w:tcBorders>
+            <w:tcMar>
+              <w:top w:type="dxa" w:w="10"/>
               <w:left w:type="dxa" w:w="360"/>
-              <w:bottom w:type="dxa" w:w="20"/>
-              <w:right w:type="dxa" w:w="80"/>
-            </w:tcMar>
-          </w:tcPr>
-          <w:p>
-            <w:r>
-              <w:rPr>
-                <w:rFonts w:ascii="Times New Roman" w:cs="Times New Roman" w:eastAsia="Times New Roman" w:hAnsi="Times New Roman"/>
-                <w:sz w:val="20"/>
-                <w:szCs w:val="20"/>
+              <w:bottom w:type="dxa" w:w="10"/>
+              <w:right w:type="dxa" w:w="40"/>
+            </w:tcMar>
+          </w:tcPr>
+          <w:p>
+            <w:r>
+              <w:rPr>
+                <w:rFonts w:ascii="Times New Roman" w:cs="Times New Roman" w:eastAsia="Times New Roman" w:hAnsi="Times New Roman"/>
+                <w:sz w:val="19"/>
+                <w:szCs w:val="19"/>
               </w:rPr>
               <w:t xml:space="preserve">A. Confirm</w:t>
             </w:r>
@@ -1174,82 +1176,80 @@
         </w:tc>
         <w:tc>
           <w:tcPr>
-            <w:tcW w:type="dxa" w:w="4680"/>
-            <w:tcBorders>
-              <w:top w:val="none" w:color="FFFFFF" w:sz="0"/>
-              <w:left w:val="none" w:color="FFFFFF" w:sz="0"/>
-              <w:bottom w:val="none" w:color="FFFFFF" w:sz="0"/>
-              <w:right w:val="none" w:color="FFFFFF" w:sz="0"/>
-            </w:tcBorders>
-            <w:tcMar>
-              <w:top w:type="dxa" w:w="20"/>
+            <w:tcW w:type="dxa" w:w="2100"/>
+            <w:tcBorders>
+              <w:top w:val="none" w:color="FFFFFF" w:sz="0"/>
+              <w:left w:val="none" w:color="FFFFFF" w:sz="0"/>
+              <w:bottom w:val="none" w:color="FFFFFF" w:sz="0"/>
+              <w:right w:val="none" w:color="FFFFFF" w:sz="0"/>
+            </w:tcBorders>
+            <w:tcMar>
+              <w:top w:type="dxa" w:w="10"/>
               <w:left w:type="dxa" w:w="360"/>
-              <w:bottom w:type="dxa" w:w="20"/>
-              <w:right w:type="dxa" w:w="80"/>
-            </w:tcMar>
-          </w:tcPr>
-          <w:p>
-            <w:r>
-              <w:rPr>
-                <w:rFonts w:ascii="Times New Roman" w:cs="Times New Roman" w:eastAsia="Times New Roman" w:hAnsi="Times New Roman"/>
-                <w:sz w:val="20"/>
-                <w:szCs w:val="20"/>
+              <w:bottom w:type="dxa" w:w="10"/>
+              <w:right w:type="dxa" w:w="40"/>
+            </w:tcMar>
+          </w:tcPr>
+          <w:p>
+            <w:r>
+              <w:rPr>
+                <w:rFonts w:ascii="Times New Roman" w:cs="Times New Roman" w:eastAsia="Times New Roman" w:hAnsi="Times New Roman"/>
+                <w:sz w:val="19"/>
+                <w:szCs w:val="19"/>
+              </w:rPr>
+              <w:t xml:space="preserve">B. Transfer</w:t>
+            </w:r>
+          </w:p>
+        </w:tc>
+        <w:tc>
+          <w:tcPr>
+            <w:tcW w:type="dxa" w:w="2500"/>
+            <w:tcBorders>
+              <w:top w:val="none" w:color="FFFFFF" w:sz="0"/>
+              <w:left w:val="none" w:color="FFFFFF" w:sz="0"/>
+              <w:bottom w:val="none" w:color="FFFFFF" w:sz="0"/>
+              <w:right w:val="none" w:color="FFFFFF" w:sz="0"/>
+            </w:tcBorders>
+            <w:tcMar>
+              <w:top w:type="dxa" w:w="10"/>
+              <w:left w:type="dxa" w:w="360"/>
+              <w:bottom w:type="dxa" w:w="10"/>
+              <w:right w:type="dxa" w:w="40"/>
+            </w:tcMar>
+          </w:tcPr>
+          <w:p>
+            <w:r>
+              <w:rPr>
+                <w:rFonts w:ascii="Times New Roman" w:cs="Times New Roman" w:eastAsia="Times New Roman" w:hAnsi="Times New Roman"/>
+                <w:sz w:val="19"/>
+                <w:szCs w:val="19"/>
               </w:rPr>
               <w:t xml:space="preserve">C. Greet</w:t>
             </w:r>
           </w:p>
         </w:tc>
-      </w:tr>
-      <w:tr>
-        <w:tc>
-          <w:tcPr>
-            <w:tcW w:type="dxa" w:w="4680"/>
-            <w:tcBorders>
-              <w:top w:val="none" w:color="FFFFFF" w:sz="0"/>
-              <w:left w:val="none" w:color="FFFFFF" w:sz="0"/>
-              <w:bottom w:val="none" w:color="FFFFFF" w:sz="0"/>
-              <w:right w:val="none" w:color="FFFFFF" w:sz="0"/>
-            </w:tcBorders>
-            <w:tcMar>
-              <w:top w:type="dxa" w:w="20"/>
+        <w:tc>
+          <w:tcPr>
+            <w:tcW w:type="dxa" w:w="2660"/>
+            <w:tcBorders>
+              <w:top w:val="none" w:color="FFFFFF" w:sz="0"/>
+              <w:left w:val="none" w:color="FFFFFF" w:sz="0"/>
+              <w:bottom w:val="none" w:color="FFFFFF" w:sz="0"/>
+              <w:right w:val="none" w:color="FFFFFF" w:sz="0"/>
+            </w:tcBorders>
+            <w:tcMar>
+              <w:top w:type="dxa" w:w="10"/>
               <w:left w:type="dxa" w:w="360"/>
-              <w:bottom w:type="dxa" w:w="20"/>
-              <w:right w:type="dxa" w:w="80"/>
-            </w:tcMar>
-          </w:tcPr>
-          <w:p>
-            <w:r>
-              <w:rPr>
-                <w:rFonts w:ascii="Times New Roman" w:cs="Times New Roman" w:eastAsia="Times New Roman" w:hAnsi="Times New Roman"/>
-                <w:sz w:val="20"/>
-                <w:szCs w:val="20"/>
-              </w:rPr>
-              <w:t xml:space="preserve">B. Transfer</w:t>
-            </w:r>
-          </w:p>
-        </w:tc>
-        <w:tc>
-          <w:tcPr>
-            <w:tcW w:type="dxa" w:w="4680"/>
-            <w:tcBorders>
-              <w:top w:val="none" w:color="FFFFFF" w:sz="0"/>
-              <w:left w:val="none" w:color="FFFFFF" w:sz="0"/>
-              <w:bottom w:val="none" w:color="FFFFFF" w:sz="0"/>
-              <w:right w:val="none" w:color="FFFFFF" w:sz="0"/>
-            </w:tcBorders>
-            <w:tcMar>
-              <w:top w:type="dxa" w:w="20"/>
-              <w:left w:type="dxa" w:w="360"/>
-              <w:bottom w:type="dxa" w:w="20"/>
-              <w:right w:type="dxa" w:w="80"/>
-            </w:tcMar>
-          </w:tcPr>
-          <w:p>
-            <w:r>
-              <w:rPr>
-                <w:rFonts w:ascii="Times New Roman" w:cs="Times New Roman" w:eastAsia="Times New Roman" w:hAnsi="Times New Roman"/>
-                <w:sz w:val="20"/>
-                <w:szCs w:val="20"/>
+              <w:bottom w:type="dxa" w:w="10"/>
+              <w:right w:type="dxa" w:w="40"/>
+            </w:tcMar>
+          </w:tcPr>
+          <w:p>
+            <w:r>
+              <w:rPr>
+                <w:rFonts w:ascii="Times New Roman" w:cs="Times New Roman" w:eastAsia="Times New Roman" w:hAnsi="Times New Roman"/>
+                <w:sz w:val="19"/>
+                <w:szCs w:val="19"/>
               </w:rPr>
               <w:t xml:space="preserve">D. Hold</w:t>
             </w:r>
@@ -1259,12 +1259,12 @@
     </w:tbl>
     <w:p>
       <w:pPr>
-        <w:spacing w:after="120"/>
-      </w:pPr>
-    </w:p>
-    <w:p>
-      <w:pPr>
-        <w:spacing w:after="60" w:before="0"/>
+        <w:spacing w:after="40"/>
+      </w:pPr>
+    </w:p>
+    <w:p>
+      <w:pPr>
+        <w:spacing w:after="30" w:before="0"/>
       </w:pPr>
       <w:r>
         <w:rPr>
@@ -1288,32 +1288,34 @@
         </w:tblBorders>
       </w:tblPr>
       <w:tblGrid>
-        <w:gridCol w:w="4680"/>
-        <w:gridCol w:w="4680"/>
+        <w:gridCol w:w="2100"/>
+        <w:gridCol w:w="2100"/>
+        <w:gridCol w:w="2500"/>
+        <w:gridCol w:w="2660"/>
       </w:tblGrid>
       <w:tr>
         <w:tc>
           <w:tcPr>
-            <w:tcW w:type="dxa" w:w="4680"/>
-            <w:tcBorders>
-              <w:top w:val="none" w:color="FFFFFF" w:sz="0"/>
-              <w:left w:val="none" w:color="FFFFFF" w:sz="0"/>
-              <w:bottom w:val="none" w:color="FFFFFF" w:sz="0"/>
-              <w:right w:val="none" w:color="FFFFFF" w:sz="0"/>
-            </w:tcBorders>
-            <w:tcMar>
-              <w:top w:type="dxa" w:w="20"/>
+            <w:tcW w:type="dxa" w:w="2100"/>
+            <w:tcBorders>
+              <w:top w:val="none" w:color="FFFFFF" w:sz="0"/>
+              <w:left w:val="none" w:color="FFFFFF" w:sz="0"/>
+              <w:bottom w:val="none" w:color="FFFFFF" w:sz="0"/>
+              <w:right w:val="none" w:color="FFFFFF" w:sz="0"/>
+            </w:tcBorders>
+            <w:tcMar>
+              <w:top w:type="dxa" w:w="10"/>
               <w:left w:type="dxa" w:w="360"/>
-              <w:bottom w:type="dxa" w:w="20"/>
-              <w:right w:type="dxa" w:w="80"/>
-            </w:tcMar>
-          </w:tcPr>
-          <w:p>
-            <w:r>
-              <w:rPr>
-                <w:rFonts w:ascii="Times New Roman" w:cs="Times New Roman" w:eastAsia="Times New Roman" w:hAnsi="Times New Roman"/>
-                <w:sz w:val="20"/>
-                <w:szCs w:val="20"/>
+              <w:bottom w:type="dxa" w:w="10"/>
+              <w:right w:type="dxa" w:w="40"/>
+            </w:tcMar>
+          </w:tcPr>
+          <w:p>
+            <w:r>
+              <w:rPr>
+                <w:rFonts w:ascii="Times New Roman" w:cs="Times New Roman" w:eastAsia="Times New Roman" w:hAnsi="Times New Roman"/>
+                <w:sz w:val="19"/>
+                <w:szCs w:val="19"/>
               </w:rPr>
               <w:t xml:space="preserve">A. Direct</w:t>
             </w:r>
@@ -1321,82 +1323,80 @@
         </w:tc>
         <w:tc>
           <w:tcPr>
-            <w:tcW w:type="dxa" w:w="4680"/>
-            <w:tcBorders>
-              <w:top w:val="none" w:color="FFFFFF" w:sz="0"/>
-              <w:left w:val="none" w:color="FFFFFF" w:sz="0"/>
-              <w:bottom w:val="none" w:color="FFFFFF" w:sz="0"/>
-              <w:right w:val="none" w:color="FFFFFF" w:sz="0"/>
-            </w:tcBorders>
-            <w:tcMar>
-              <w:top w:type="dxa" w:w="20"/>
+            <w:tcW w:type="dxa" w:w="2100"/>
+            <w:tcBorders>
+              <w:top w:val="none" w:color="FFFFFF" w:sz="0"/>
+              <w:left w:val="none" w:color="FFFFFF" w:sz="0"/>
+              <w:bottom w:val="none" w:color="FFFFFF" w:sz="0"/>
+              <w:right w:val="none" w:color="FFFFFF" w:sz="0"/>
+            </w:tcBorders>
+            <w:tcMar>
+              <w:top w:type="dxa" w:w="10"/>
               <w:left w:type="dxa" w:w="360"/>
-              <w:bottom w:type="dxa" w:w="20"/>
-              <w:right w:type="dxa" w:w="80"/>
-            </w:tcMar>
-          </w:tcPr>
-          <w:p>
-            <w:r>
-              <w:rPr>
-                <w:rFonts w:ascii="Times New Roman" w:cs="Times New Roman" w:eastAsia="Times New Roman" w:hAnsi="Times New Roman"/>
-                <w:sz w:val="20"/>
-                <w:szCs w:val="20"/>
+              <w:bottom w:type="dxa" w:w="10"/>
+              <w:right w:type="dxa" w:w="40"/>
+            </w:tcMar>
+          </w:tcPr>
+          <w:p>
+            <w:r>
+              <w:rPr>
+                <w:rFonts w:ascii="Times New Roman" w:cs="Times New Roman" w:eastAsia="Times New Roman" w:hAnsi="Times New Roman"/>
+                <w:sz w:val="19"/>
+                <w:szCs w:val="19"/>
+              </w:rPr>
+              <w:t xml:space="preserve">B. Transfer</w:t>
+            </w:r>
+          </w:p>
+        </w:tc>
+        <w:tc>
+          <w:tcPr>
+            <w:tcW w:type="dxa" w:w="2500"/>
+            <w:tcBorders>
+              <w:top w:val="none" w:color="FFFFFF" w:sz="0"/>
+              <w:left w:val="none" w:color="FFFFFF" w:sz="0"/>
+              <w:bottom w:val="none" w:color="FFFFFF" w:sz="0"/>
+              <w:right w:val="none" w:color="FFFFFF" w:sz="0"/>
+            </w:tcBorders>
+            <w:tcMar>
+              <w:top w:type="dxa" w:w="10"/>
+              <w:left w:type="dxa" w:w="360"/>
+              <w:bottom w:type="dxa" w:w="10"/>
+              <w:right w:type="dxa" w:w="40"/>
+            </w:tcMar>
+          </w:tcPr>
+          <w:p>
+            <w:r>
+              <w:rPr>
+                <w:rFonts w:ascii="Times New Roman" w:cs="Times New Roman" w:eastAsia="Times New Roman" w:hAnsi="Times New Roman"/>
+                <w:sz w:val="19"/>
+                <w:szCs w:val="19"/>
               </w:rPr>
               <w:t xml:space="preserve">C. Hold</w:t>
             </w:r>
           </w:p>
         </w:tc>
-      </w:tr>
-      <w:tr>
-        <w:tc>
-          <w:tcPr>
-            <w:tcW w:type="dxa" w:w="4680"/>
-            <w:tcBorders>
-              <w:top w:val="none" w:color="FFFFFF" w:sz="0"/>
-              <w:left w:val="none" w:color="FFFFFF" w:sz="0"/>
-              <w:bottom w:val="none" w:color="FFFFFF" w:sz="0"/>
-              <w:right w:val="none" w:color="FFFFFF" w:sz="0"/>
-            </w:tcBorders>
-            <w:tcMar>
-              <w:top w:type="dxa" w:w="20"/>
+        <w:tc>
+          <w:tcPr>
+            <w:tcW w:type="dxa" w:w="2660"/>
+            <w:tcBorders>
+              <w:top w:val="none" w:color="FFFFFF" w:sz="0"/>
+              <w:left w:val="none" w:color="FFFFFF" w:sz="0"/>
+              <w:bottom w:val="none" w:color="FFFFFF" w:sz="0"/>
+              <w:right w:val="none" w:color="FFFFFF" w:sz="0"/>
+            </w:tcBorders>
+            <w:tcMar>
+              <w:top w:type="dxa" w:w="10"/>
               <w:left w:type="dxa" w:w="360"/>
-              <w:bottom w:type="dxa" w:w="20"/>
-              <w:right w:type="dxa" w:w="80"/>
-            </w:tcMar>
-          </w:tcPr>
-          <w:p>
-            <w:r>
-              <w:rPr>
-                <w:rFonts w:ascii="Times New Roman" w:cs="Times New Roman" w:eastAsia="Times New Roman" w:hAnsi="Times New Roman"/>
-                <w:sz w:val="20"/>
-                <w:szCs w:val="20"/>
-              </w:rPr>
-              <w:t xml:space="preserve">B. Transfer</w:t>
-            </w:r>
-          </w:p>
-        </w:tc>
-        <w:tc>
-          <w:tcPr>
-            <w:tcW w:type="dxa" w:w="4680"/>
-            <w:tcBorders>
-              <w:top w:val="none" w:color="FFFFFF" w:sz="0"/>
-              <w:left w:val="none" w:color="FFFFFF" w:sz="0"/>
-              <w:bottom w:val="none" w:color="FFFFFF" w:sz="0"/>
-              <w:right w:val="none" w:color="FFFFFF" w:sz="0"/>
-            </w:tcBorders>
-            <w:tcMar>
-              <w:top w:type="dxa" w:w="20"/>
-              <w:left w:type="dxa" w:w="360"/>
-              <w:bottom w:type="dxa" w:w="20"/>
-              <w:right w:type="dxa" w:w="80"/>
-            </w:tcMar>
-          </w:tcPr>
-          <w:p>
-            <w:r>
-              <w:rPr>
-                <w:rFonts w:ascii="Times New Roman" w:cs="Times New Roman" w:eastAsia="Times New Roman" w:hAnsi="Times New Roman"/>
-                <w:sz w:val="20"/>
-                <w:szCs w:val="20"/>
+              <w:bottom w:type="dxa" w:w="10"/>
+              <w:right w:type="dxa" w:w="40"/>
+            </w:tcMar>
+          </w:tcPr>
+          <w:p>
+            <w:r>
+              <w:rPr>
+                <w:rFonts w:ascii="Times New Roman" w:cs="Times New Roman" w:eastAsia="Times New Roman" w:hAnsi="Times New Roman"/>
+                <w:sz w:val="19"/>
+                <w:szCs w:val="19"/>
               </w:rPr>
               <w:t xml:space="preserve">D. Extension</w:t>
             </w:r>
@@ -1406,12 +1406,12 @@
     </w:tbl>
     <w:p>
       <w:pPr>
-        <w:spacing w:after="120"/>
-      </w:pPr>
-    </w:p>
-    <w:p>
-      <w:pPr>
-        <w:spacing w:after="60" w:before="0"/>
+        <w:spacing w:after="40"/>
+      </w:pPr>
+    </w:p>
+    <w:p>
+      <w:pPr>
+        <w:spacing w:after="30" w:before="0"/>
       </w:pPr>
       <w:r>
         <w:rPr>
@@ -1435,32 +1435,34 @@
         </w:tblBorders>
       </w:tblPr>
       <w:tblGrid>
-        <w:gridCol w:w="4680"/>
-        <w:gridCol w:w="4680"/>
+        <w:gridCol w:w="2100"/>
+        <w:gridCol w:w="2100"/>
+        <w:gridCol w:w="2500"/>
+        <w:gridCol w:w="2660"/>
       </w:tblGrid>
       <w:tr>
         <w:tc>
           <w:tcPr>
-            <w:tcW w:type="dxa" w:w="4680"/>
-            <w:tcBorders>
-              <w:top w:val="none" w:color="FFFFFF" w:sz="0"/>
-              <w:left w:val="none" w:color="FFFFFF" w:sz="0"/>
-              <w:bottom w:val="none" w:color="FFFFFF" w:sz="0"/>
-              <w:right w:val="none" w:color="FFFFFF" w:sz="0"/>
-            </w:tcBorders>
-            <w:tcMar>
-              <w:top w:type="dxa" w:w="20"/>
+            <w:tcW w:type="dxa" w:w="2100"/>
+            <w:tcBorders>
+              <w:top w:val="none" w:color="FFFFFF" w:sz="0"/>
+              <w:left w:val="none" w:color="FFFFFF" w:sz="0"/>
+              <w:bottom w:val="none" w:color="FFFFFF" w:sz="0"/>
+              <w:right w:val="none" w:color="FFFFFF" w:sz="0"/>
+            </w:tcBorders>
+            <w:tcMar>
+              <w:top w:type="dxa" w:w="10"/>
               <w:left w:type="dxa" w:w="360"/>
-              <w:bottom w:type="dxa" w:w="20"/>
-              <w:right w:type="dxa" w:w="80"/>
-            </w:tcMar>
-          </w:tcPr>
-          <w:p>
-            <w:r>
-              <w:rPr>
-                <w:rFonts w:ascii="Times New Roman" w:cs="Times New Roman" w:eastAsia="Times New Roman" w:hAnsi="Times New Roman"/>
-                <w:sz w:val="20"/>
-                <w:szCs w:val="20"/>
+              <w:bottom w:type="dxa" w:w="10"/>
+              <w:right w:type="dxa" w:w="40"/>
+            </w:tcMar>
+          </w:tcPr>
+          <w:p>
+            <w:r>
+              <w:rPr>
+                <w:rFonts w:ascii="Times New Roman" w:cs="Times New Roman" w:eastAsia="Times New Roman" w:hAnsi="Times New Roman"/>
+                <w:sz w:val="19"/>
+                <w:szCs w:val="19"/>
               </w:rPr>
               <w:t xml:space="preserve">A. Caller</w:t>
             </w:r>
@@ -1468,82 +1470,80 @@
         </w:tc>
         <w:tc>
           <w:tcPr>
-            <w:tcW w:type="dxa" w:w="4680"/>
-            <w:tcBorders>
-              <w:top w:val="none" w:color="FFFFFF" w:sz="0"/>
-              <w:left w:val="none" w:color="FFFFFF" w:sz="0"/>
-              <w:bottom w:val="none" w:color="FFFFFF" w:sz="0"/>
-              <w:right w:val="none" w:color="FFFFFF" w:sz="0"/>
-            </w:tcBorders>
-            <w:tcMar>
-              <w:top w:type="dxa" w:w="20"/>
+            <w:tcW w:type="dxa" w:w="2100"/>
+            <w:tcBorders>
+              <w:top w:val="none" w:color="FFFFFF" w:sz="0"/>
+              <w:left w:val="none" w:color="FFFFFF" w:sz="0"/>
+              <w:bottom w:val="none" w:color="FFFFFF" w:sz="0"/>
+              <w:right w:val="none" w:color="FFFFFF" w:sz="0"/>
+            </w:tcBorders>
+            <w:tcMar>
+              <w:top w:type="dxa" w:w="10"/>
               <w:left w:type="dxa" w:w="360"/>
-              <w:bottom w:type="dxa" w:w="20"/>
-              <w:right w:type="dxa" w:w="80"/>
-            </w:tcMar>
-          </w:tcPr>
-          <w:p>
-            <w:r>
-              <w:rPr>
-                <w:rFonts w:ascii="Times New Roman" w:cs="Times New Roman" w:eastAsia="Times New Roman" w:hAnsi="Times New Roman"/>
-                <w:sz w:val="20"/>
-                <w:szCs w:val="20"/>
+              <w:bottom w:type="dxa" w:w="10"/>
+              <w:right w:type="dxa" w:w="40"/>
+            </w:tcMar>
+          </w:tcPr>
+          <w:p>
+            <w:r>
+              <w:rPr>
+                <w:rFonts w:ascii="Times New Roman" w:cs="Times New Roman" w:eastAsia="Times New Roman" w:hAnsi="Times New Roman"/>
+                <w:sz w:val="19"/>
+                <w:szCs w:val="19"/>
+              </w:rPr>
+              <w:t xml:space="preserve">B. Message</w:t>
+            </w:r>
+          </w:p>
+        </w:tc>
+        <w:tc>
+          <w:tcPr>
+            <w:tcW w:type="dxa" w:w="2500"/>
+            <w:tcBorders>
+              <w:top w:val="none" w:color="FFFFFF" w:sz="0"/>
+              <w:left w:val="none" w:color="FFFFFF" w:sz="0"/>
+              <w:bottom w:val="none" w:color="FFFFFF" w:sz="0"/>
+              <w:right w:val="none" w:color="FFFFFF" w:sz="0"/>
+            </w:tcBorders>
+            <w:tcMar>
+              <w:top w:type="dxa" w:w="10"/>
+              <w:left w:type="dxa" w:w="360"/>
+              <w:bottom w:type="dxa" w:w="10"/>
+              <w:right w:type="dxa" w:w="40"/>
+            </w:tcMar>
+          </w:tcPr>
+          <w:p>
+            <w:r>
+              <w:rPr>
+                <w:rFonts w:ascii="Times New Roman" w:cs="Times New Roman" w:eastAsia="Times New Roman" w:hAnsi="Times New Roman"/>
+                <w:sz w:val="19"/>
+                <w:szCs w:val="19"/>
               </w:rPr>
               <w:t xml:space="preserve">C. Extension</w:t>
             </w:r>
           </w:p>
         </w:tc>
-      </w:tr>
-      <w:tr>
-        <w:tc>
-          <w:tcPr>
-            <w:tcW w:type="dxa" w:w="4680"/>
-            <w:tcBorders>
-              <w:top w:val="none" w:color="FFFFFF" w:sz="0"/>
-              <w:left w:val="none" w:color="FFFFFF" w:sz="0"/>
-              <w:bottom w:val="none" w:color="FFFFFF" w:sz="0"/>
-              <w:right w:val="none" w:color="FFFFFF" w:sz="0"/>
-            </w:tcBorders>
-            <w:tcMar>
-              <w:top w:type="dxa" w:w="20"/>
+        <w:tc>
+          <w:tcPr>
+            <w:tcW w:type="dxa" w:w="2660"/>
+            <w:tcBorders>
+              <w:top w:val="none" w:color="FFFFFF" w:sz="0"/>
+              <w:left w:val="none" w:color="FFFFFF" w:sz="0"/>
+              <w:bottom w:val="none" w:color="FFFFFF" w:sz="0"/>
+              <w:right w:val="none" w:color="FFFFFF" w:sz="0"/>
+            </w:tcBorders>
+            <w:tcMar>
+              <w:top w:type="dxa" w:w="10"/>
               <w:left w:type="dxa" w:w="360"/>
-              <w:bottom w:type="dxa" w:w="20"/>
-              <w:right w:type="dxa" w:w="80"/>
-            </w:tcMar>
-          </w:tcPr>
-          <w:p>
-            <w:r>
-              <w:rPr>
-                <w:rFonts w:ascii="Times New Roman" w:cs="Times New Roman" w:eastAsia="Times New Roman" w:hAnsi="Times New Roman"/>
-                <w:sz w:val="20"/>
-                <w:szCs w:val="20"/>
-              </w:rPr>
-              <w:t xml:space="preserve">B. Message</w:t>
-            </w:r>
-          </w:p>
-        </w:tc>
-        <w:tc>
-          <w:tcPr>
-            <w:tcW w:type="dxa" w:w="4680"/>
-            <w:tcBorders>
-              <w:top w:val="none" w:color="FFFFFF" w:sz="0"/>
-              <w:left w:val="none" w:color="FFFFFF" w:sz="0"/>
-              <w:bottom w:val="none" w:color="FFFFFF" w:sz="0"/>
-              <w:right w:val="none" w:color="FFFFFF" w:sz="0"/>
-            </w:tcBorders>
-            <w:tcMar>
-              <w:top w:type="dxa" w:w="20"/>
-              <w:left w:type="dxa" w:w="360"/>
-              <w:bottom w:type="dxa" w:w="20"/>
-              <w:right w:type="dxa" w:w="80"/>
-            </w:tcMar>
-          </w:tcPr>
-          <w:p>
-            <w:r>
-              <w:rPr>
-                <w:rFonts w:ascii="Times New Roman" w:cs="Times New Roman" w:eastAsia="Times New Roman" w:hAnsi="Times New Roman"/>
-                <w:sz w:val="20"/>
-                <w:szCs w:val="20"/>
+              <w:bottom w:type="dxa" w:w="10"/>
+              <w:right w:type="dxa" w:w="40"/>
+            </w:tcMar>
+          </w:tcPr>
+          <w:p>
+            <w:r>
+              <w:rPr>
+                <w:rFonts w:ascii="Times New Roman" w:cs="Times New Roman" w:eastAsia="Times New Roman" w:hAnsi="Times New Roman"/>
+                <w:sz w:val="19"/>
+                <w:szCs w:val="19"/>
               </w:rPr>
               <w:t xml:space="preserve">D. Confirm</w:t>
             </w:r>
@@ -1553,12 +1553,12 @@
     </w:tbl>
     <w:p>
       <w:pPr>
-        <w:spacing w:after="120"/>
-      </w:pPr>
-    </w:p>
-    <w:p>
-      <w:pPr>
-        <w:spacing w:after="60" w:before="0"/>
+        <w:spacing w:after="40"/>
+      </w:pPr>
+    </w:p>
+    <w:p>
+      <w:pPr>
+        <w:spacing w:after="30" w:before="0"/>
       </w:pPr>
       <w:r>
         <w:rPr>
@@ -1582,32 +1582,34 @@
         </w:tblBorders>
       </w:tblPr>
       <w:tblGrid>
-        <w:gridCol w:w="4680"/>
-        <w:gridCol w:w="4680"/>
+        <w:gridCol w:w="2100"/>
+        <w:gridCol w:w="2100"/>
+        <w:gridCol w:w="2500"/>
+        <w:gridCol w:w="2660"/>
       </w:tblGrid>
       <w:tr>
         <w:tc>
           <w:tcPr>
-            <w:tcW w:type="dxa" w:w="4680"/>
-            <w:tcBorders>
-              <w:top w:val="none" w:color="FFFFFF" w:sz="0"/>
-              <w:left w:val="none" w:color="FFFFFF" w:sz="0"/>
-              <w:bottom w:val="none" w:color="FFFFFF" w:sz="0"/>
-              <w:right w:val="none" w:color="FFFFFF" w:sz="0"/>
-            </w:tcBorders>
-            <w:tcMar>
-              <w:top w:type="dxa" w:w="20"/>
+            <w:tcW w:type="dxa" w:w="2100"/>
+            <w:tcBorders>
+              <w:top w:val="none" w:color="FFFFFF" w:sz="0"/>
+              <w:left w:val="none" w:color="FFFFFF" w:sz="0"/>
+              <w:bottom w:val="none" w:color="FFFFFF" w:sz="0"/>
+              <w:right w:val="none" w:color="FFFFFF" w:sz="0"/>
+            </w:tcBorders>
+            <w:tcMar>
+              <w:top w:type="dxa" w:w="10"/>
               <w:left w:type="dxa" w:w="360"/>
-              <w:bottom w:type="dxa" w:w="20"/>
-              <w:right w:type="dxa" w:w="80"/>
-            </w:tcMar>
-          </w:tcPr>
-          <w:p>
-            <w:r>
-              <w:rPr>
-                <w:rFonts w:ascii="Times New Roman" w:cs="Times New Roman" w:eastAsia="Times New Roman" w:hAnsi="Times New Roman"/>
-                <w:sz w:val="20"/>
-                <w:szCs w:val="20"/>
+              <w:bottom w:type="dxa" w:w="10"/>
+              <w:right w:type="dxa" w:w="40"/>
+            </w:tcMar>
+          </w:tcPr>
+          <w:p>
+            <w:r>
+              <w:rPr>
+                <w:rFonts w:ascii="Times New Roman" w:cs="Times New Roman" w:eastAsia="Times New Roman" w:hAnsi="Times New Roman"/>
+                <w:sz w:val="19"/>
+                <w:szCs w:val="19"/>
               </w:rPr>
               <w:t xml:space="preserve">A. Confirm</w:t>
             </w:r>
@@ -1615,82 +1617,80 @@
         </w:tc>
         <w:tc>
           <w:tcPr>
-            <w:tcW w:type="dxa" w:w="4680"/>
-            <w:tcBorders>
-              <w:top w:val="none" w:color="FFFFFF" w:sz="0"/>
-              <w:left w:val="none" w:color="FFFFFF" w:sz="0"/>
-              <w:bottom w:val="none" w:color="FFFFFF" w:sz="0"/>
-              <w:right w:val="none" w:color="FFFFFF" w:sz="0"/>
-            </w:tcBorders>
-            <w:tcMar>
-              <w:top w:type="dxa" w:w="20"/>
+            <w:tcW w:type="dxa" w:w="2100"/>
+            <w:tcBorders>
+              <w:top w:val="none" w:color="FFFFFF" w:sz="0"/>
+              <w:left w:val="none" w:color="FFFFFF" w:sz="0"/>
+              <w:bottom w:val="none" w:color="FFFFFF" w:sz="0"/>
+              <w:right w:val="none" w:color="FFFFFF" w:sz="0"/>
+            </w:tcBorders>
+            <w:tcMar>
+              <w:top w:type="dxa" w:w="10"/>
               <w:left w:type="dxa" w:w="360"/>
-              <w:bottom w:type="dxa" w:w="20"/>
-              <w:right w:type="dxa" w:w="80"/>
-            </w:tcMar>
-          </w:tcPr>
-          <w:p>
-            <w:r>
-              <w:rPr>
-                <w:rFonts w:ascii="Times New Roman" w:cs="Times New Roman" w:eastAsia="Times New Roman" w:hAnsi="Times New Roman"/>
-                <w:sz w:val="20"/>
-                <w:szCs w:val="20"/>
+              <w:bottom w:type="dxa" w:w="10"/>
+              <w:right w:type="dxa" w:w="40"/>
+            </w:tcMar>
+          </w:tcPr>
+          <w:p>
+            <w:r>
+              <w:rPr>
+                <w:rFonts w:ascii="Times New Roman" w:cs="Times New Roman" w:eastAsia="Times New Roman" w:hAnsi="Times New Roman"/>
+                <w:sz w:val="19"/>
+                <w:szCs w:val="19"/>
+              </w:rPr>
+              <w:t xml:space="preserve">B. Introduce</w:t>
+            </w:r>
+          </w:p>
+        </w:tc>
+        <w:tc>
+          <w:tcPr>
+            <w:tcW w:type="dxa" w:w="2500"/>
+            <w:tcBorders>
+              <w:top w:val="none" w:color="FFFFFF" w:sz="0"/>
+              <w:left w:val="none" w:color="FFFFFF" w:sz="0"/>
+              <w:bottom w:val="none" w:color="FFFFFF" w:sz="0"/>
+              <w:right w:val="none" w:color="FFFFFF" w:sz="0"/>
+            </w:tcBorders>
+            <w:tcMar>
+              <w:top w:type="dxa" w:w="10"/>
+              <w:left w:type="dxa" w:w="360"/>
+              <w:bottom w:type="dxa" w:w="10"/>
+              <w:right w:type="dxa" w:w="40"/>
+            </w:tcMar>
+          </w:tcPr>
+          <w:p>
+            <w:r>
+              <w:rPr>
+                <w:rFonts w:ascii="Times New Roman" w:cs="Times New Roman" w:eastAsia="Times New Roman" w:hAnsi="Times New Roman"/>
+                <w:sz w:val="19"/>
+                <w:szCs w:val="19"/>
               </w:rPr>
               <w:t xml:space="preserve">C. Greet</w:t>
             </w:r>
           </w:p>
         </w:tc>
-      </w:tr>
-      <w:tr>
-        <w:tc>
-          <w:tcPr>
-            <w:tcW w:type="dxa" w:w="4680"/>
-            <w:tcBorders>
-              <w:top w:val="none" w:color="FFFFFF" w:sz="0"/>
-              <w:left w:val="none" w:color="FFFFFF" w:sz="0"/>
-              <w:bottom w:val="none" w:color="FFFFFF" w:sz="0"/>
-              <w:right w:val="none" w:color="FFFFFF" w:sz="0"/>
-            </w:tcBorders>
-            <w:tcMar>
-              <w:top w:type="dxa" w:w="20"/>
+        <w:tc>
+          <w:tcPr>
+            <w:tcW w:type="dxa" w:w="2660"/>
+            <w:tcBorders>
+              <w:top w:val="none" w:color="FFFFFF" w:sz="0"/>
+              <w:left w:val="none" w:color="FFFFFF" w:sz="0"/>
+              <w:bottom w:val="none" w:color="FFFFFF" w:sz="0"/>
+              <w:right w:val="none" w:color="FFFFFF" w:sz="0"/>
+            </w:tcBorders>
+            <w:tcMar>
+              <w:top w:type="dxa" w:w="10"/>
               <w:left w:type="dxa" w:w="360"/>
-              <w:bottom w:type="dxa" w:w="20"/>
-              <w:right w:type="dxa" w:w="80"/>
-            </w:tcMar>
-          </w:tcPr>
-          <w:p>
-            <w:r>
-              <w:rPr>
-                <w:rFonts w:ascii="Times New Roman" w:cs="Times New Roman" w:eastAsia="Times New Roman" w:hAnsi="Times New Roman"/>
-                <w:sz w:val="20"/>
-                <w:szCs w:val="20"/>
-              </w:rPr>
-              <w:t xml:space="preserve">B. Introduce</w:t>
-            </w:r>
-          </w:p>
-        </w:tc>
-        <w:tc>
-          <w:tcPr>
-            <w:tcW w:type="dxa" w:w="4680"/>
-            <w:tcBorders>
-              <w:top w:val="none" w:color="FFFFFF" w:sz="0"/>
-              <w:left w:val="none" w:color="FFFFFF" w:sz="0"/>
-              <w:bottom w:val="none" w:color="FFFFFF" w:sz="0"/>
-              <w:right w:val="none" w:color="FFFFFF" w:sz="0"/>
-            </w:tcBorders>
-            <w:tcMar>
-              <w:top w:type="dxa" w:w="20"/>
-              <w:left w:type="dxa" w:w="360"/>
-              <w:bottom w:type="dxa" w:w="20"/>
-              <w:right w:type="dxa" w:w="80"/>
-            </w:tcMar>
-          </w:tcPr>
-          <w:p>
-            <w:r>
-              <w:rPr>
-                <w:rFonts w:ascii="Times New Roman" w:cs="Times New Roman" w:eastAsia="Times New Roman" w:hAnsi="Times New Roman"/>
-                <w:sz w:val="20"/>
-                <w:szCs w:val="20"/>
+              <w:bottom w:type="dxa" w:w="10"/>
+              <w:right w:type="dxa" w:w="40"/>
+            </w:tcMar>
+          </w:tcPr>
+          <w:p>
+            <w:r>
+              <w:rPr>
+                <w:rFonts w:ascii="Times New Roman" w:cs="Times New Roman" w:eastAsia="Times New Roman" w:hAnsi="Times New Roman"/>
+                <w:sz w:val="19"/>
+                <w:szCs w:val="19"/>
               </w:rPr>
               <w:t xml:space="preserve">D. Transfer</w:t>
             </w:r>
@@ -1700,12 +1700,12 @@
     </w:tbl>
     <w:p>
       <w:pPr>
-        <w:spacing w:after="120"/>
-      </w:pPr>
-    </w:p>
-    <w:p>
-      <w:pPr>
-        <w:spacing w:after="60" w:before="0"/>
+        <w:spacing w:after="40"/>
+      </w:pPr>
+    </w:p>
+    <w:p>
+      <w:pPr>
+        <w:spacing w:after="30" w:before="0"/>
       </w:pPr>
       <w:r>
         <w:rPr>
@@ -1729,32 +1729,34 @@
         </w:tblBorders>
       </w:tblPr>
       <w:tblGrid>
-        <w:gridCol w:w="4680"/>
-        <w:gridCol w:w="4680"/>
+        <w:gridCol w:w="2100"/>
+        <w:gridCol w:w="2100"/>
+        <w:gridCol w:w="2500"/>
+        <w:gridCol w:w="2660"/>
       </w:tblGrid>
       <w:tr>
         <w:tc>
           <w:tcPr>
-            <w:tcW w:type="dxa" w:w="4680"/>
-            <w:tcBorders>
-              <w:top w:val="none" w:color="FFFFFF" w:sz="0"/>
-              <w:left w:val="none" w:color="FFFFFF" w:sz="0"/>
-              <w:bottom w:val="none" w:color="FFFFFF" w:sz="0"/>
-              <w:right w:val="none" w:color="FFFFFF" w:sz="0"/>
-            </w:tcBorders>
-            <w:tcMar>
-              <w:top w:type="dxa" w:w="20"/>
+            <w:tcW w:type="dxa" w:w="2100"/>
+            <w:tcBorders>
+              <w:top w:val="none" w:color="FFFFFF" w:sz="0"/>
+              <w:left w:val="none" w:color="FFFFFF" w:sz="0"/>
+              <w:bottom w:val="none" w:color="FFFFFF" w:sz="0"/>
+              <w:right w:val="none" w:color="FFFFFF" w:sz="0"/>
+            </w:tcBorders>
+            <w:tcMar>
+              <w:top w:type="dxa" w:w="10"/>
               <w:left w:type="dxa" w:w="360"/>
-              <w:bottom w:type="dxa" w:w="20"/>
-              <w:right w:type="dxa" w:w="80"/>
-            </w:tcMar>
-          </w:tcPr>
-          <w:p>
-            <w:r>
-              <w:rPr>
-                <w:rFonts w:ascii="Times New Roman" w:cs="Times New Roman" w:eastAsia="Times New Roman" w:hAnsi="Times New Roman"/>
-                <w:sz w:val="20"/>
-                <w:szCs w:val="20"/>
+              <w:bottom w:type="dxa" w:w="10"/>
+              <w:right w:type="dxa" w:w="40"/>
+            </w:tcMar>
+          </w:tcPr>
+          <w:p>
+            <w:r>
+              <w:rPr>
+                <w:rFonts w:ascii="Times New Roman" w:cs="Times New Roman" w:eastAsia="Times New Roman" w:hAnsi="Times New Roman"/>
+                <w:sz w:val="19"/>
+                <w:szCs w:val="19"/>
               </w:rPr>
               <w:t xml:space="preserve">A. Caller</w:t>
             </w:r>
@@ -1762,82 +1764,80 @@
         </w:tc>
         <w:tc>
           <w:tcPr>
-            <w:tcW w:type="dxa" w:w="4680"/>
-            <w:tcBorders>
-              <w:top w:val="none" w:color="FFFFFF" w:sz="0"/>
-              <w:left w:val="none" w:color="FFFFFF" w:sz="0"/>
-              <w:bottom w:val="none" w:color="FFFFFF" w:sz="0"/>
-              <w:right w:val="none" w:color="FFFFFF" w:sz="0"/>
-            </w:tcBorders>
-            <w:tcMar>
-              <w:top w:type="dxa" w:w="20"/>
+            <w:tcW w:type="dxa" w:w="2100"/>
+            <w:tcBorders>
+              <w:top w:val="none" w:color="FFFFFF" w:sz="0"/>
+              <w:left w:val="none" w:color="FFFFFF" w:sz="0"/>
+              <w:bottom w:val="none" w:color="FFFFFF" w:sz="0"/>
+              <w:right w:val="none" w:color="FFFFFF" w:sz="0"/>
+            </w:tcBorders>
+            <w:tcMar>
+              <w:top w:type="dxa" w:w="10"/>
               <w:left w:type="dxa" w:w="360"/>
-              <w:bottom w:type="dxa" w:w="20"/>
-              <w:right w:type="dxa" w:w="80"/>
-            </w:tcMar>
-          </w:tcPr>
-          <w:p>
-            <w:r>
-              <w:rPr>
-                <w:rFonts w:ascii="Times New Roman" w:cs="Times New Roman" w:eastAsia="Times New Roman" w:hAnsi="Times New Roman"/>
-                <w:sz w:val="20"/>
-                <w:szCs w:val="20"/>
+              <w:bottom w:type="dxa" w:w="10"/>
+              <w:right w:type="dxa" w:w="40"/>
+            </w:tcMar>
+          </w:tcPr>
+          <w:p>
+            <w:r>
+              <w:rPr>
+                <w:rFonts w:ascii="Times New Roman" w:cs="Times New Roman" w:eastAsia="Times New Roman" w:hAnsi="Times New Roman"/>
+                <w:sz w:val="19"/>
+                <w:szCs w:val="19"/>
+              </w:rPr>
+              <w:t xml:space="preserve">B. Message</w:t>
+            </w:r>
+          </w:p>
+        </w:tc>
+        <w:tc>
+          <w:tcPr>
+            <w:tcW w:type="dxa" w:w="2500"/>
+            <w:tcBorders>
+              <w:top w:val="none" w:color="FFFFFF" w:sz="0"/>
+              <w:left w:val="none" w:color="FFFFFF" w:sz="0"/>
+              <w:bottom w:val="none" w:color="FFFFFF" w:sz="0"/>
+              <w:right w:val="none" w:color="FFFFFF" w:sz="0"/>
+            </w:tcBorders>
+            <w:tcMar>
+              <w:top w:type="dxa" w:w="10"/>
+              <w:left w:type="dxa" w:w="360"/>
+              <w:bottom w:type="dxa" w:w="10"/>
+              <w:right w:type="dxa" w:w="40"/>
+            </w:tcMar>
+          </w:tcPr>
+          <w:p>
+            <w:r>
+              <w:rPr>
+                <w:rFonts w:ascii="Times New Roman" w:cs="Times New Roman" w:eastAsia="Times New Roman" w:hAnsi="Times New Roman"/>
+                <w:sz w:val="19"/>
+                <w:szCs w:val="19"/>
               </w:rPr>
               <w:t xml:space="preserve">C. Hold</w:t>
             </w:r>
           </w:p>
         </w:tc>
-      </w:tr>
-      <w:tr>
-        <w:tc>
-          <w:tcPr>
-            <w:tcW w:type="dxa" w:w="4680"/>
-            <w:tcBorders>
-              <w:top w:val="none" w:color="FFFFFF" w:sz="0"/>
-              <w:left w:val="none" w:color="FFFFFF" w:sz="0"/>
-              <w:bottom w:val="none" w:color="FFFFFF" w:sz="0"/>
-              <w:right w:val="none" w:color="FFFFFF" w:sz="0"/>
-            </w:tcBorders>
-            <w:tcMar>
-              <w:top w:type="dxa" w:w="20"/>
+        <w:tc>
+          <w:tcPr>
+            <w:tcW w:type="dxa" w:w="2660"/>
+            <w:tcBorders>
+              <w:top w:val="none" w:color="FFFFFF" w:sz="0"/>
+              <w:left w:val="none" w:color="FFFFFF" w:sz="0"/>
+              <w:bottom w:val="none" w:color="FFFFFF" w:sz="0"/>
+              <w:right w:val="none" w:color="FFFFFF" w:sz="0"/>
+            </w:tcBorders>
+            <w:tcMar>
+              <w:top w:type="dxa" w:w="10"/>
               <w:left w:type="dxa" w:w="360"/>
-              <w:bottom w:type="dxa" w:w="20"/>
-              <w:right w:type="dxa" w:w="80"/>
-            </w:tcMar>
-          </w:tcPr>
-          <w:p>
-            <w:r>
-              <w:rPr>
-                <w:rFonts w:ascii="Times New Roman" w:cs="Times New Roman" w:eastAsia="Times New Roman" w:hAnsi="Times New Roman"/>
-                <w:sz w:val="20"/>
-                <w:szCs w:val="20"/>
-              </w:rPr>
-              <w:t xml:space="preserve">B. Message</w:t>
-            </w:r>
-          </w:p>
-        </w:tc>
-        <w:tc>
-          <w:tcPr>
-            <w:tcW w:type="dxa" w:w="4680"/>
-            <w:tcBorders>
-              <w:top w:val="none" w:color="FFFFFF" w:sz="0"/>
-              <w:left w:val="none" w:color="FFFFFF" w:sz="0"/>
-              <w:bottom w:val="none" w:color="FFFFFF" w:sz="0"/>
-              <w:right w:val="none" w:color="FFFFFF" w:sz="0"/>
-            </w:tcBorders>
-            <w:tcMar>
-              <w:top w:type="dxa" w:w="20"/>
-              <w:left w:type="dxa" w:w="360"/>
-              <w:bottom w:type="dxa" w:w="20"/>
-              <w:right w:type="dxa" w:w="80"/>
-            </w:tcMar>
-          </w:tcPr>
-          <w:p>
-            <w:r>
-              <w:rPr>
-                <w:rFonts w:ascii="Times New Roman" w:cs="Times New Roman" w:eastAsia="Times New Roman" w:hAnsi="Times New Roman"/>
-                <w:sz w:val="20"/>
-                <w:szCs w:val="20"/>
+              <w:bottom w:type="dxa" w:w="10"/>
+              <w:right w:type="dxa" w:w="40"/>
+            </w:tcMar>
+          </w:tcPr>
+          <w:p>
+            <w:r>
+              <w:rPr>
+                <w:rFonts w:ascii="Times New Roman" w:cs="Times New Roman" w:eastAsia="Times New Roman" w:hAnsi="Times New Roman"/>
+                <w:sz w:val="19"/>
+                <w:szCs w:val="19"/>
               </w:rPr>
               <w:t xml:space="preserve">D. Extension</w:t>
             </w:r>
@@ -1847,7 +1847,7 @@
     </w:tbl>
     <w:p>
       <w:pPr>
-        <w:spacing w:after="120"/>
+        <w:spacing w:after="40"/>
       </w:pPr>
     </w:p>
     <w:p>
@@ -1855,7 +1855,7 @@
         <w:pBdr>
           <w:bottom w:val="single" w:color="163B65" w:sz="8" w:space="4"/>
         </w:pBdr>
-        <w:spacing w:after="130" w:before="280"/>
+        <w:spacing w:after="90" w:before="100"/>
       </w:pPr>
       <w:r>
         <w:rPr>
@@ -1863,15 +1863,15 @@
           <w:b/>
           <w:bCs/>
           <w:color w:val="163B65"/>
-          <w:sz w:val="27"/>
-          <w:szCs w:val="27"/>
+          <w:sz w:val="26"/>
+          <w:szCs w:val="26"/>
         </w:rPr>
         <w:t xml:space="preserve">Part II: True or False</w:t>
       </w:r>
     </w:p>
     <w:p>
       <w:pPr>
-        <w:spacing w:after="100" w:before="0"/>
+        <w:spacing w:after="50" w:before="0"/>
       </w:pPr>
       <w:r>
         <w:rPr>
@@ -1887,7 +1887,7 @@
     </w:p>
     <w:p>
       <w:pPr>
-        <w:spacing w:after="160" w:before="0"/>
+        <w:spacing w:after="70" w:before="0"/>
       </w:pPr>
       <w:r>
         <w:rPr>
@@ -1925,9 +1925,9 @@
               <w:right w:val="none" w:color="FFFFFF" w:sz="0"/>
             </w:tcBorders>
             <w:tcMar>
-              <w:top w:type="dxa" w:w="40"/>
+              <w:top w:type="dxa" w:w="20"/>
               <w:left w:type="dxa" w:w="0"/>
-              <w:bottom w:type="dxa" w:w="40"/>
+              <w:bottom w:type="dxa" w:w="20"/>
               <w:right w:type="dxa" w:w="160"/>
             </w:tcMar>
           </w:tcPr>
@@ -1952,9 +1952,9 @@
               <w:right w:val="none" w:color="FFFFFF" w:sz="0"/>
             </w:tcBorders>
             <w:tcMar>
-              <w:top w:type="dxa" w:w="40"/>
+              <w:top w:type="dxa" w:w="20"/>
               <w:left w:type="dxa" w:w="0"/>
-              <w:bottom w:type="dxa" w:w="40"/>
+              <w:bottom w:type="dxa" w:w="20"/>
               <w:right w:type="dxa" w:w="0"/>
             </w:tcMar>
           </w:tcPr>
@@ -1976,7 +1976,7 @@
     </w:tbl>
     <w:p>
       <w:pPr>
-        <w:spacing w:after="90"/>
+        <w:spacing w:after="30"/>
       </w:pPr>
     </w:p>
     <w:tbl>
@@ -2006,9 +2006,9 @@
               <w:right w:val="none" w:color="FFFFFF" w:sz="0"/>
             </w:tcBorders>
             <w:tcMar>
-              <w:top w:type="dxa" w:w="40"/>
+              <w:top w:type="dxa" w:w="20"/>
               <w:left w:type="dxa" w:w="0"/>
-              <w:bottom w:type="dxa" w:w="40"/>
+              <w:bottom w:type="dxa" w:w="20"/>
               <w:right w:type="dxa" w:w="160"/>
             </w:tcMar>
           </w:tcPr>
@@ -2033,9 +2033,9 @@
               <w:right w:val="none" w:color="FFFFFF" w:sz="0"/>
             </w:tcBorders>
             <w:tcMar>
-              <w:top w:type="dxa" w:w="40"/>
+              <w:top w:type="dxa" w:w="20"/>
               <w:left w:type="dxa" w:w="0"/>
-              <w:bottom w:type="dxa" w:w="40"/>
+              <w:bottom w:type="dxa" w:w="20"/>
               <w:right w:type="dxa" w:w="0"/>
             </w:tcMar>
           </w:tcPr>
@@ -2057,7 +2057,7 @@
     </w:tbl>
     <w:p>
       <w:pPr>
-        <w:spacing w:after="90"/>
+        <w:spacing w:after="30"/>
       </w:pPr>
     </w:p>
     <w:tbl>
@@ -2087,9 +2087,9 @@
               <w:right w:val="none" w:color="FFFFFF" w:sz="0"/>
             </w:tcBorders>
             <w:tcMar>
-              <w:top w:type="dxa" w:w="40"/>
+              <w:top w:type="dxa" w:w="20"/>
               <w:left w:type="dxa" w:w="0"/>
-              <w:bottom w:type="dxa" w:w="40"/>
+              <w:bottom w:type="dxa" w:w="20"/>
               <w:right w:type="dxa" w:w="160"/>
             </w:tcMar>
           </w:tcPr>
@@ -2114,9 +2114,9 @@
               <w:right w:val="none" w:color="FFFFFF" w:sz="0"/>
             </w:tcBorders>
             <w:tcMar>
-              <w:top w:type="dxa" w:w="40"/>
+              <w:top w:type="dxa" w:w="20"/>
               <w:left w:type="dxa" w:w="0"/>
-              <w:bottom w:type="dxa" w:w="40"/>
+              <w:bottom w:type="dxa" w:w="20"/>
               <w:right w:type="dxa" w:w="0"/>
             </w:tcMar>
           </w:tcPr>
@@ -2138,7 +2138,7 @@
     </w:tbl>
     <w:p>
       <w:pPr>
-        <w:spacing w:after="90"/>
+        <w:spacing w:after="30"/>
       </w:pPr>
     </w:p>
     <w:tbl>
@@ -2168,9 +2168,9 @@
               <w:right w:val="none" w:color="FFFFFF" w:sz="0"/>
             </w:tcBorders>
             <w:tcMar>
-              <w:top w:type="dxa" w:w="40"/>
+              <w:top w:type="dxa" w:w="20"/>
               <w:left w:type="dxa" w:w="0"/>
-              <w:bottom w:type="dxa" w:w="40"/>
+              <w:bottom w:type="dxa" w:w="20"/>
               <w:right w:type="dxa" w:w="160"/>
             </w:tcMar>
           </w:tcPr>
@@ -2195,9 +2195,9 @@
               <w:right w:val="none" w:color="FFFFFF" w:sz="0"/>
             </w:tcBorders>
             <w:tcMar>
-              <w:top w:type="dxa" w:w="40"/>
+              <w:top w:type="dxa" w:w="20"/>
               <w:left w:type="dxa" w:w="0"/>
-              <w:bottom w:type="dxa" w:w="40"/>
+              <w:bottom w:type="dxa" w:w="20"/>
               <w:right w:type="dxa" w:w="0"/>
             </w:tcMar>
           </w:tcPr>
@@ -2219,7 +2219,7 @@
     </w:tbl>
     <w:p>
       <w:pPr>
-        <w:spacing w:after="90"/>
+        <w:spacing w:after="30"/>
       </w:pPr>
     </w:p>
     <w:tbl>
@@ -2249,9 +2249,9 @@
               <w:right w:val="none" w:color="FFFFFF" w:sz="0"/>
             </w:tcBorders>
             <w:tcMar>
-              <w:top w:type="dxa" w:w="40"/>
+              <w:top w:type="dxa" w:w="20"/>
               <w:left w:type="dxa" w:w="0"/>
-              <w:bottom w:type="dxa" w:w="40"/>
+              <w:bottom w:type="dxa" w:w="20"/>
               <w:right w:type="dxa" w:w="160"/>
             </w:tcMar>
           </w:tcPr>
@@ -2276,9 +2276,9 @@
               <w:right w:val="none" w:color="FFFFFF" w:sz="0"/>
             </w:tcBorders>
             <w:tcMar>
-              <w:top w:type="dxa" w:w="40"/>
+              <w:top w:type="dxa" w:w="20"/>
               <w:left w:type="dxa" w:w="0"/>
-              <w:bottom w:type="dxa" w:w="40"/>
+              <w:bottom w:type="dxa" w:w="20"/>
               <w:right w:type="dxa" w:w="0"/>
             </w:tcMar>
           </w:tcPr>
@@ -2300,7 +2300,7 @@
     </w:tbl>
     <w:p>
       <w:pPr>
-        <w:spacing w:after="90"/>
+        <w:spacing w:after="30"/>
       </w:pPr>
     </w:p>
     <w:tbl>
@@ -2330,9 +2330,9 @@
               <w:right w:val="none" w:color="FFFFFF" w:sz="0"/>
             </w:tcBorders>
             <w:tcMar>
-              <w:top w:type="dxa" w:w="40"/>
+              <w:top w:type="dxa" w:w="20"/>
               <w:left w:type="dxa" w:w="0"/>
-              <w:bottom w:type="dxa" w:w="40"/>
+              <w:bottom w:type="dxa" w:w="20"/>
               <w:right w:type="dxa" w:w="160"/>
             </w:tcMar>
           </w:tcPr>
@@ -2357,9 +2357,9 @@
               <w:right w:val="none" w:color="FFFFFF" w:sz="0"/>
             </w:tcBorders>
             <w:tcMar>
-              <w:top w:type="dxa" w:w="40"/>
+              <w:top w:type="dxa" w:w="20"/>
               <w:left w:type="dxa" w:w="0"/>
-              <w:bottom w:type="dxa" w:w="40"/>
+              <w:bottom w:type="dxa" w:w="20"/>
               <w:right w:type="dxa" w:w="0"/>
             </w:tcMar>
           </w:tcPr>
@@ -2381,7 +2381,7 @@
     </w:tbl>
     <w:p>
       <w:pPr>
-        <w:spacing w:after="90"/>
+        <w:spacing w:after="30"/>
       </w:pPr>
     </w:p>
     <w:tbl>
@@ -2411,9 +2411,9 @@
               <w:right w:val="none" w:color="FFFFFF" w:sz="0"/>
             </w:tcBorders>
             <w:tcMar>
-              <w:top w:type="dxa" w:w="40"/>
+              <w:top w:type="dxa" w:w="20"/>
               <w:left w:type="dxa" w:w="0"/>
-              <w:bottom w:type="dxa" w:w="40"/>
+              <w:bottom w:type="dxa" w:w="20"/>
               <w:right w:type="dxa" w:w="160"/>
             </w:tcMar>
           </w:tcPr>
@@ -2438,9 +2438,9 @@
               <w:right w:val="none" w:color="FFFFFF" w:sz="0"/>
             </w:tcBorders>
             <w:tcMar>
-              <w:top w:type="dxa" w:w="40"/>
+              <w:top w:type="dxa" w:w="20"/>
               <w:left w:type="dxa" w:w="0"/>
-              <w:bottom w:type="dxa" w:w="40"/>
+              <w:bottom w:type="dxa" w:w="20"/>
               <w:right w:type="dxa" w:w="0"/>
             </w:tcMar>
           </w:tcPr>
@@ -2462,7 +2462,7 @@
     </w:tbl>
     <w:p>
       <w:pPr>
-        <w:spacing w:after="90"/>
+        <w:spacing w:after="30"/>
       </w:pPr>
     </w:p>
     <w:tbl>
@@ -2492,9 +2492,9 @@
               <w:right w:val="none" w:color="FFFFFF" w:sz="0"/>
             </w:tcBorders>
             <w:tcMar>
-              <w:top w:type="dxa" w:w="40"/>
+              <w:top w:type="dxa" w:w="20"/>
               <w:left w:type="dxa" w:w="0"/>
-              <w:bottom w:type="dxa" w:w="40"/>
+              <w:bottom w:type="dxa" w:w="20"/>
               <w:right w:type="dxa" w:w="160"/>
             </w:tcMar>
           </w:tcPr>
@@ -2519,9 +2519,9 @@
               <w:right w:val="none" w:color="FFFFFF" w:sz="0"/>
             </w:tcBorders>
             <w:tcMar>
-              <w:top w:type="dxa" w:w="40"/>
+              <w:top w:type="dxa" w:w="20"/>
               <w:left w:type="dxa" w:w="0"/>
-              <w:bottom w:type="dxa" w:w="40"/>
+              <w:bottom w:type="dxa" w:w="20"/>
               <w:right w:type="dxa" w:w="0"/>
             </w:tcMar>
           </w:tcPr>
@@ -2543,7 +2543,7 @@
     </w:tbl>
     <w:p>
       <w:pPr>
-        <w:spacing w:after="90"/>
+        <w:spacing w:after="30"/>
       </w:pPr>
     </w:p>
     <w:tbl>
@@ -2573,9 +2573,9 @@
               <w:right w:val="none" w:color="FFFFFF" w:sz="0"/>
             </w:tcBorders>
             <w:tcMar>
-              <w:top w:type="dxa" w:w="40"/>
+              <w:top w:type="dxa" w:w="20"/>
               <w:left w:type="dxa" w:w="0"/>
-              <w:bottom w:type="dxa" w:w="40"/>
+              <w:bottom w:type="dxa" w:w="20"/>
               <w:right w:type="dxa" w:w="160"/>
             </w:tcMar>
           </w:tcPr>
@@ -2600,9 +2600,9 @@
               <w:right w:val="none" w:color="FFFFFF" w:sz="0"/>
             </w:tcBorders>
             <w:tcMar>
-              <w:top w:type="dxa" w:w="40"/>
+              <w:top w:type="dxa" w:w="20"/>
               <w:left w:type="dxa" w:w="0"/>
-              <w:bottom w:type="dxa" w:w="40"/>
+              <w:bottom w:type="dxa" w:w="20"/>
               <w:right w:type="dxa" w:w="0"/>
             </w:tcMar>
           </w:tcPr>
@@ -2624,7 +2624,7 @@
     </w:tbl>
     <w:p>
       <w:pPr>
-        <w:spacing w:after="90"/>
+        <w:spacing w:after="30"/>
       </w:pPr>
     </w:p>
     <w:tbl>
@@ -2654,9 +2654,9 @@
               <w:right w:val="none" w:color="FFFFFF" w:sz="0"/>
             </w:tcBorders>
             <w:tcMar>
-              <w:top w:type="dxa" w:w="40"/>
+              <w:top w:type="dxa" w:w="20"/>
               <w:left w:type="dxa" w:w="0"/>
-              <w:bottom w:type="dxa" w:w="40"/>
+              <w:bottom w:type="dxa" w:w="20"/>
               <w:right w:type="dxa" w:w="160"/>
             </w:tcMar>
           </w:tcPr>
@@ -2681,9 +2681,9 @@
               <w:right w:val="none" w:color="FFFFFF" w:sz="0"/>
             </w:tcBorders>
             <w:tcMar>
-              <w:top w:type="dxa" w:w="40"/>
+              <w:top w:type="dxa" w:w="20"/>
               <w:left w:type="dxa" w:w="0"/>
-              <w:bottom w:type="dxa" w:w="40"/>
+              <w:bottom w:type="dxa" w:w="20"/>
               <w:right w:type="dxa" w:w="0"/>
             </w:tcMar>
           </w:tcPr>
@@ -2705,16 +2705,15 @@
     </w:tbl>
     <w:p>
       <w:pPr>
-        <w:spacing w:after="90"/>
-      </w:pPr>
-    </w:p>
-    <w:p>
-      <w:pPr>
-        <w:pageBreakBefore/>
+        <w:spacing w:after="30"/>
+      </w:pPr>
+    </w:p>
+    <w:p>
+      <w:pPr>
         <w:pBdr>
           <w:bottom w:val="single" w:color="163B65" w:sz="8" w:space="4"/>
         </w:pBdr>
-        <w:spacing w:after="130" w:before="280"/>
+        <w:spacing w:after="90" w:before="100"/>
       </w:pPr>
       <w:r>
         <w:rPr>
@@ -2722,15 +2721,15 @@
           <w:b/>
           <w:bCs/>
           <w:color w:val="163B65"/>
-          <w:sz w:val="27"/>
-          <w:szCs w:val="27"/>
+          <w:sz w:val="26"/>
+          <w:szCs w:val="26"/>
         </w:rPr>
         <w:t xml:space="preserve">Part III: Taking Notes</w:t>
       </w:r>
     </w:p>
     <w:p>
       <w:pPr>
-        <w:spacing w:after="100" w:before="0"/>
+        <w:spacing w:after="50" w:before="0"/>
       </w:pPr>
       <w:r>
         <w:rPr>
@@ -2746,7 +2745,7 @@
     </w:p>
     <w:p>
       <w:pPr>
-        <w:spacing w:after="200" w:before="0"/>
+        <w:spacing w:after="70" w:before="0"/>
       </w:pPr>
       <w:r>
         <w:rPr>
@@ -2759,7 +2758,7 @@
     </w:p>
     <w:p>
       <w:pPr>
-        <w:spacing w:after="90" w:before="160"/>
+        <w:spacing w:after="90" w:before="70"/>
       </w:pPr>
       <w:r>
         <w:rPr>
@@ -2794,151 +2793,151 @@
             <w:tcW w:type="dxa" w:w="9360"/>
             <w:shd w:fill="F4F4F4" w:val="clear"/>
             <w:tcMar>
-              <w:top w:type="dxa" w:w="140"/>
+              <w:top w:type="dxa" w:w="90"/>
               <w:left w:type="dxa" w:w="160"/>
-              <w:bottom w:type="dxa" w:w="140"/>
+              <w:bottom w:type="dxa" w:w="90"/>
               <w:right w:type="dxa" w:w="160"/>
             </w:tcMar>
           </w:tcPr>
           <w:p>
             <w:pPr>
-              <w:spacing w:after="50" w:before="0"/>
+              <w:spacing w:after="18" w:before="0"/>
             </w:pPr>
             <w:r>
               <w:rPr>
                 <w:rFonts w:ascii="Times New Roman" w:cs="Times New Roman" w:eastAsia="Times New Roman" w:hAnsi="Times New Roman"/>
-                <w:sz w:val="19"/>
-                <w:szCs w:val="19"/>
+                <w:sz w:val="18"/>
+                <w:szCs w:val="18"/>
               </w:rPr>
               <w:t xml:space="preserve">Staff: Good afternoon, MICE Console, this is Nan speaking. How may I help you?</w:t>
             </w:r>
           </w:p>
           <w:p>
             <w:pPr>
-              <w:spacing w:after="50" w:before="0"/>
+              <w:spacing w:after="18" w:before="0"/>
             </w:pPr>
             <w:r>
               <w:rPr>
                 <w:rFonts w:ascii="Times New Roman" w:cs="Times New Roman" w:eastAsia="Times New Roman" w:hAnsi="Times New Roman"/>
-                <w:sz w:val="19"/>
-                <w:szCs w:val="19"/>
+                <w:sz w:val="18"/>
+                <w:szCs w:val="18"/>
               </w:rPr>
               <w:t xml:space="preserve">Caller: Hi, could I speak with the parking coordinator? We need extra parking spaces for our group.</w:t>
             </w:r>
           </w:p>
           <w:p>
             <w:pPr>
-              <w:spacing w:after="50" w:before="0"/>
+              <w:spacing w:after="18" w:before="0"/>
             </w:pPr>
             <w:r>
               <w:rPr>
                 <w:rFonts w:ascii="Times New Roman" w:cs="Times New Roman" w:eastAsia="Times New Roman" w:hAnsi="Times New Roman"/>
-                <w:sz w:val="19"/>
-                <w:szCs w:val="19"/>
+                <w:sz w:val="18"/>
+                <w:szCs w:val="18"/>
               </w:rPr>
               <w:t xml:space="preserve">Staff: I’m sorry, he’s busy with another group right now. Can I take a message?</w:t>
             </w:r>
           </w:p>
           <w:p>
             <w:pPr>
-              <w:spacing w:after="50" w:before="0"/>
+              <w:spacing w:after="18" w:before="0"/>
             </w:pPr>
             <w:r>
               <w:rPr>
                 <w:rFonts w:ascii="Times New Roman" w:cs="Times New Roman" w:eastAsia="Times New Roman" w:hAnsi="Times New Roman"/>
-                <w:sz w:val="19"/>
-                <w:szCs w:val="19"/>
+                <w:sz w:val="18"/>
+                <w:szCs w:val="18"/>
               </w:rPr>
               <w:t xml:space="preserve">Caller: Yes, please. This is Khun Nattapong, from Siam Exports.</w:t>
             </w:r>
           </w:p>
           <w:p>
             <w:pPr>
-              <w:spacing w:after="50" w:before="0"/>
+              <w:spacing w:after="18" w:before="0"/>
             </w:pPr>
             <w:r>
               <w:rPr>
                 <w:rFonts w:ascii="Times New Roman" w:cs="Times New Roman" w:eastAsia="Times New Roman" w:hAnsi="Times New Roman"/>
-                <w:sz w:val="19"/>
-                <w:szCs w:val="19"/>
+                <w:sz w:val="18"/>
+                <w:szCs w:val="18"/>
               </w:rPr>
               <w:t xml:space="preserve">Staff: Thank you, Khun Nattapong. Could I get a number to reach you?</w:t>
             </w:r>
           </w:p>
           <w:p>
             <w:pPr>
-              <w:spacing w:after="50" w:before="0"/>
+              <w:spacing w:after="18" w:before="0"/>
             </w:pPr>
             <w:r>
               <w:rPr>
                 <w:rFonts w:ascii="Times New Roman" w:cs="Times New Roman" w:eastAsia="Times New Roman" w:hAnsi="Times New Roman"/>
-                <w:sz w:val="19"/>
-                <w:szCs w:val="19"/>
+                <w:sz w:val="18"/>
+                <w:szCs w:val="18"/>
               </w:rPr>
               <w:t xml:space="preserve">Caller: Sure, it’s 085-678-1234.</w:t>
             </w:r>
           </w:p>
           <w:p>
             <w:pPr>
-              <w:spacing w:after="50" w:before="0"/>
+              <w:spacing w:after="18" w:before="0"/>
             </w:pPr>
             <w:r>
               <w:rPr>
                 <w:rFonts w:ascii="Times New Roman" w:cs="Times New Roman" w:eastAsia="Times New Roman" w:hAnsi="Times New Roman"/>
-                <w:sz w:val="19"/>
-                <w:szCs w:val="19"/>
+                <w:sz w:val="18"/>
+                <w:szCs w:val="18"/>
               </w:rPr>
               <w:t xml:space="preserve">Staff: Got it. And what would you like to ask about?</w:t>
             </w:r>
           </w:p>
           <w:p>
             <w:pPr>
-              <w:spacing w:after="50" w:before="0"/>
+              <w:spacing w:after="18" w:before="0"/>
             </w:pPr>
             <w:r>
               <w:rPr>
                 <w:rFonts w:ascii="Times New Roman" w:cs="Times New Roman" w:eastAsia="Times New Roman" w:hAnsi="Times New Roman"/>
-                <w:sz w:val="19"/>
-                <w:szCs w:val="19"/>
+                <w:sz w:val="18"/>
+                <w:szCs w:val="18"/>
               </w:rPr>
               <w:t xml:space="preserve">Caller: We need 5 more parking spaces for tomorrow’s conference.</w:t>
             </w:r>
           </w:p>
           <w:p>
             <w:pPr>
-              <w:spacing w:after="50" w:before="0"/>
+              <w:spacing w:after="18" w:before="0"/>
             </w:pPr>
             <w:r>
               <w:rPr>
                 <w:rFonts w:ascii="Times New Roman" w:cs="Times New Roman" w:eastAsia="Times New Roman" w:hAnsi="Times New Roman"/>
-                <w:sz w:val="19"/>
-                <w:szCs w:val="19"/>
+                <w:sz w:val="18"/>
+                <w:szCs w:val="18"/>
               </w:rPr>
               <w:t xml:space="preserve">Staff: Understood. Is there a good time for him to call you back?</w:t>
             </w:r>
           </w:p>
           <w:p>
             <w:pPr>
-              <w:spacing w:after="50" w:before="0"/>
+              <w:spacing w:after="18" w:before="0"/>
             </w:pPr>
             <w:r>
               <w:rPr>
                 <w:rFonts w:ascii="Times New Roman" w:cs="Times New Roman" w:eastAsia="Times New Roman" w:hAnsi="Times New Roman"/>
-                <w:sz w:val="19"/>
-                <w:szCs w:val="19"/>
+                <w:sz w:val="18"/>
+                <w:szCs w:val="18"/>
               </w:rPr>
               <w:t xml:space="preserve">Caller: Anytime before 6pm tonight.</w:t>
             </w:r>
           </w:p>
           <w:p>
             <w:pPr>
-              <w:spacing w:after="50" w:before="0"/>
+              <w:spacing w:after="18" w:before="0"/>
             </w:pPr>
             <w:r>
               <w:rPr>
                 <w:rFonts w:ascii="Times New Roman" w:cs="Times New Roman" w:eastAsia="Times New Roman" w:hAnsi="Times New Roman"/>
-                <w:sz w:val="19"/>
-                <w:szCs w:val="19"/>
+                <w:sz w:val="18"/>
+                <w:szCs w:val="18"/>
               </w:rPr>
               <w:t xml:space="preserve">Staff: Perfect, I’ll make sure he gets the message and calls you back before 6pm tonight. Thank you, Khun Nattapong.</w:t>
             </w:r>
@@ -2948,12 +2947,12 @@
     </w:tbl>
     <w:p>
       <w:pPr>
-        <w:spacing w:after="100"/>
-      </w:pPr>
-    </w:p>
-    <w:p>
-      <w:pPr>
-        <w:spacing w:after="80" w:before="0"/>
+        <w:spacing w:after="40"/>
+      </w:pPr>
+    </w:p>
+    <w:p>
+      <w:pPr>
+        <w:spacing w:after="30" w:before="0"/>
       </w:pPr>
       <w:r>
         <w:rPr>
@@ -2969,7 +2968,7 @@
     </w:p>
     <w:p>
       <w:pPr>
-        <w:spacing w:after="190"/>
+        <w:spacing w:after="100"/>
       </w:pPr>
       <w:r>
         <w:rPr>
@@ -2980,7 +2979,7 @@
     </w:p>
     <w:p>
       <w:pPr>
-        <w:spacing w:after="190"/>
+        <w:spacing w:after="100"/>
       </w:pPr>
       <w:r>
         <w:rPr>
@@ -2991,7 +2990,7 @@
     </w:p>
     <w:p>
       <w:pPr>
-        <w:spacing w:after="190"/>
+        <w:spacing w:after="100"/>
       </w:pPr>
       <w:r>
         <w:rPr>
@@ -3002,23 +3001,12 @@
     </w:p>
     <w:p>
       <w:pPr>
-        <w:spacing w:after="190"/>
-      </w:pPr>
-      <w:r>
-        <w:rPr>
-          <w:color w:val="999999"/>
-        </w:rPr>
-        <w:t xml:space="preserve">____________________________________________________________________________________________________</w:t>
-      </w:r>
-    </w:p>
-    <w:p>
-      <w:pPr>
-        <w:spacing w:after="140"/>
-      </w:pPr>
-    </w:p>
-    <w:p>
-      <w:pPr>
-        <w:spacing w:after="90" w:before="160"/>
+        <w:spacing w:after="50"/>
+      </w:pPr>
+    </w:p>
+    <w:p>
+      <w:pPr>
+        <w:spacing w:after="90" w:before="70"/>
       </w:pPr>
       <w:r>
         <w:rPr>
@@ -3053,151 +3041,151 @@
             <w:tcW w:type="dxa" w:w="9360"/>
             <w:shd w:fill="F4F4F4" w:val="clear"/>
             <w:tcMar>
-              <w:top w:type="dxa" w:w="140"/>
+              <w:top w:type="dxa" w:w="90"/>
               <w:left w:type="dxa" w:w="160"/>
-              <w:bottom w:type="dxa" w:w="140"/>
+              <w:bottom w:type="dxa" w:w="90"/>
               <w:right w:type="dxa" w:w="160"/>
             </w:tcMar>
           </w:tcPr>
           <w:p>
             <w:pPr>
-              <w:spacing w:after="50" w:before="0"/>
+              <w:spacing w:after="18" w:before="0"/>
             </w:pPr>
             <w:r>
               <w:rPr>
                 <w:rFonts w:ascii="Times New Roman" w:cs="Times New Roman" w:eastAsia="Times New Roman" w:hAnsi="Times New Roman"/>
-                <w:sz w:val="19"/>
-                <w:szCs w:val="19"/>
+                <w:sz w:val="18"/>
+                <w:szCs w:val="18"/>
               </w:rPr>
               <w:t xml:space="preserve">Staff: Good afternoon, MICE Console, this is Nan speaking. How may I help you?</w:t>
             </w:r>
           </w:p>
           <w:p>
             <w:pPr>
-              <w:spacing w:after="50" w:before="0"/>
+              <w:spacing w:after="18" w:before="0"/>
             </w:pPr>
             <w:r>
               <w:rPr>
                 <w:rFonts w:ascii="Times New Roman" w:cs="Times New Roman" w:eastAsia="Times New Roman" w:hAnsi="Times New Roman"/>
-                <w:sz w:val="19"/>
-                <w:szCs w:val="19"/>
+                <w:sz w:val="18"/>
+                <w:szCs w:val="18"/>
               </w:rPr>
               <w:t xml:space="preserve">Caller: Hi, could I speak with the booth manager? I need an extra visitor badge for a colleague.</w:t>
             </w:r>
           </w:p>
           <w:p>
             <w:pPr>
-              <w:spacing w:after="50" w:before="0"/>
+              <w:spacing w:after="18" w:before="0"/>
             </w:pPr>
             <w:r>
               <w:rPr>
                 <w:rFonts w:ascii="Times New Roman" w:cs="Times New Roman" w:eastAsia="Times New Roman" w:hAnsi="Times New Roman"/>
-                <w:sz w:val="19"/>
-                <w:szCs w:val="19"/>
+                <w:sz w:val="18"/>
+                <w:szCs w:val="18"/>
               </w:rPr>
               <w:t xml:space="preserve">Staff: I’m sorry, she’s out at lunch right now. Can I take a message?</w:t>
             </w:r>
           </w:p>
           <w:p>
             <w:pPr>
-              <w:spacing w:after="50" w:before="0"/>
+              <w:spacing w:after="18" w:before="0"/>
             </w:pPr>
             <w:r>
               <w:rPr>
                 <w:rFonts w:ascii="Times New Roman" w:cs="Times New Roman" w:eastAsia="Times New Roman" w:hAnsi="Times New Roman"/>
-                <w:sz w:val="19"/>
-                <w:szCs w:val="19"/>
+                <w:sz w:val="18"/>
+                <w:szCs w:val="18"/>
               </w:rPr>
               <w:t xml:space="preserve">Caller: Yes, please. This is Khun Achara, from Blue Ocean Spa Products.</w:t>
             </w:r>
           </w:p>
           <w:p>
             <w:pPr>
-              <w:spacing w:after="50" w:before="0"/>
+              <w:spacing w:after="18" w:before="0"/>
             </w:pPr>
             <w:r>
               <w:rPr>
                 <w:rFonts w:ascii="Times New Roman" w:cs="Times New Roman" w:eastAsia="Times New Roman" w:hAnsi="Times New Roman"/>
-                <w:sz w:val="19"/>
-                <w:szCs w:val="19"/>
+                <w:sz w:val="18"/>
+                <w:szCs w:val="18"/>
               </w:rPr>
               <w:t xml:space="preserve">Staff: Thank you, Khun Achara. Could I get a number to reach you?</w:t>
             </w:r>
           </w:p>
           <w:p>
             <w:pPr>
-              <w:spacing w:after="50" w:before="0"/>
+              <w:spacing w:after="18" w:before="0"/>
             </w:pPr>
             <w:r>
               <w:rPr>
                 <w:rFonts w:ascii="Times New Roman" w:cs="Times New Roman" w:eastAsia="Times New Roman" w:hAnsi="Times New Roman"/>
-                <w:sz w:val="19"/>
-                <w:szCs w:val="19"/>
+                <w:sz w:val="18"/>
+                <w:szCs w:val="18"/>
               </w:rPr>
               <w:t xml:space="preserve">Caller: Sure, it’s 098-234-5566.</w:t>
             </w:r>
           </w:p>
           <w:p>
             <w:pPr>
-              <w:spacing w:after="50" w:before="0"/>
+              <w:spacing w:after="18" w:before="0"/>
             </w:pPr>
             <w:r>
               <w:rPr>
                 <w:rFonts w:ascii="Times New Roman" w:cs="Times New Roman" w:eastAsia="Times New Roman" w:hAnsi="Times New Roman"/>
-                <w:sz w:val="19"/>
-                <w:szCs w:val="19"/>
+                <w:sz w:val="18"/>
+                <w:szCs w:val="18"/>
               </w:rPr>
               <w:t xml:space="preserve">Staff: Got it. And what would you like to ask about?</w:t>
             </w:r>
           </w:p>
           <w:p>
             <w:pPr>
-              <w:spacing w:after="50" w:before="0"/>
+              <w:spacing w:after="18" w:before="0"/>
             </w:pPr>
             <w:r>
               <w:rPr>
                 <w:rFonts w:ascii="Times New Roman" w:cs="Times New Roman" w:eastAsia="Times New Roman" w:hAnsi="Times New Roman"/>
-                <w:sz w:val="19"/>
-                <w:szCs w:val="19"/>
+                <w:sz w:val="18"/>
+                <w:szCs w:val="18"/>
               </w:rPr>
               <w:t xml:space="preserve">Caller: I need one extra visitor badge for a colleague arriving this afternoon.</w:t>
             </w:r>
           </w:p>
           <w:p>
             <w:pPr>
-              <w:spacing w:after="50" w:before="0"/>
+              <w:spacing w:after="18" w:before="0"/>
             </w:pPr>
             <w:r>
               <w:rPr>
                 <w:rFonts w:ascii="Times New Roman" w:cs="Times New Roman" w:eastAsia="Times New Roman" w:hAnsi="Times New Roman"/>
-                <w:sz w:val="19"/>
-                <w:szCs w:val="19"/>
+                <w:sz w:val="18"/>
+                <w:szCs w:val="18"/>
               </w:rPr>
               <w:t xml:space="preserve">Staff: Understood. Is there a good time for her to call you back?</w:t>
             </w:r>
           </w:p>
           <w:p>
             <w:pPr>
-              <w:spacing w:after="50" w:before="0"/>
+              <w:spacing w:after="18" w:before="0"/>
             </w:pPr>
             <w:r>
               <w:rPr>
                 <w:rFonts w:ascii="Times New Roman" w:cs="Times New Roman" w:eastAsia="Times New Roman" w:hAnsi="Times New Roman"/>
-                <w:sz w:val="19"/>
-                <w:szCs w:val="19"/>
+                <w:sz w:val="18"/>
+                <w:szCs w:val="18"/>
               </w:rPr>
               <w:t xml:space="preserve">Caller: Anytime before 3pm would be great.</w:t>
             </w:r>
           </w:p>
           <w:p>
             <w:pPr>
-              <w:spacing w:after="50" w:before="0"/>
+              <w:spacing w:after="18" w:before="0"/>
             </w:pPr>
             <w:r>
               <w:rPr>
                 <w:rFonts w:ascii="Times New Roman" w:cs="Times New Roman" w:eastAsia="Times New Roman" w:hAnsi="Times New Roman"/>
-                <w:sz w:val="19"/>
-                <w:szCs w:val="19"/>
+                <w:sz w:val="18"/>
+                <w:szCs w:val="18"/>
               </w:rPr>
               <w:t xml:space="preserve">Staff: Perfect, I’ll make sure she gets the message and calls you back before 3pm. Thank you, Khun Achara.</w:t>
             </w:r>
@@ -3207,12 +3195,12 @@
     </w:tbl>
     <w:p>
       <w:pPr>
-        <w:spacing w:after="100"/>
-      </w:pPr>
-    </w:p>
-    <w:p>
-      <w:pPr>
-        <w:spacing w:after="80" w:before="0"/>
+        <w:spacing w:after="40"/>
+      </w:pPr>
+    </w:p>
+    <w:p>
+      <w:pPr>
+        <w:spacing w:after="30" w:before="0"/>
       </w:pPr>
       <w:r>
         <w:rPr>
@@ -3228,7 +3216,7 @@
     </w:p>
     <w:p>
       <w:pPr>
-        <w:spacing w:after="190"/>
+        <w:spacing w:after="100"/>
       </w:pPr>
       <w:r>
         <w:rPr>
@@ -3239,7 +3227,7 @@
     </w:p>
     <w:p>
       <w:pPr>
-        <w:spacing w:after="190"/>
+        <w:spacing w:after="100"/>
       </w:pPr>
       <w:r>
         <w:rPr>
@@ -3250,7 +3238,7 @@
     </w:p>
     <w:p>
       <w:pPr>
-        <w:spacing w:after="190"/>
+        <w:spacing w:after="100"/>
       </w:pPr>
       <w:r>
         <w:rPr>
@@ -3261,18 +3249,7 @@
     </w:p>
     <w:p>
       <w:pPr>
-        <w:spacing w:after="190"/>
-      </w:pPr>
-      <w:r>
-        <w:rPr>
-          <w:color w:val="999999"/>
-        </w:rPr>
-        <w:t xml:space="preserve">____________________________________________________________________________________________________</w:t>
-      </w:r>
-    </w:p>
-    <w:p>
-      <w:pPr>
-        <w:spacing w:after="140"/>
+        <w:spacing w:after="50"/>
       </w:pPr>
     </w:p>
     <w:p>
@@ -3280,7 +3257,7 @@
         <w:pBdr>
           <w:bottom w:val="single" w:color="163B65" w:sz="8" w:space="4"/>
         </w:pBdr>
-        <w:spacing w:after="130" w:before="280"/>
+        <w:spacing w:after="90" w:before="100"/>
       </w:pPr>
       <w:r>
         <w:rPr>
@@ -3288,15 +3265,15 @@
           <w:b/>
           <w:bCs/>
           <w:color w:val="163B65"/>
-          <w:sz w:val="27"/>
-          <w:szCs w:val="27"/>
+          <w:sz w:val="26"/>
+          <w:szCs w:val="26"/>
         </w:rPr>
         <w:t xml:space="preserve">Part IV: Put the Sentence in Order</w:t>
       </w:r>
     </w:p>
     <w:p>
       <w:pPr>
-        <w:spacing w:after="100" w:before="0"/>
+        <w:spacing w:after="50" w:before="0"/>
       </w:pPr>
       <w:r>
         <w:rPr>
@@ -3312,7 +3289,7 @@
     </w:p>
     <w:p>
       <w:pPr>
-        <w:spacing w:after="200" w:before="0"/>
+        <w:spacing w:after="70" w:before="0"/>
       </w:pPr>
       <w:r>
         <w:rPr>
@@ -3325,7 +3302,7 @@
     </w:p>
     <w:p>
       <w:pPr>
-        <w:spacing w:after="80" w:before="0"/>
+        <w:spacing w:after="40" w:before="0"/>
       </w:pPr>
       <w:r>
         <w:rPr>
@@ -3341,7 +3318,7 @@
     </w:p>
     <w:p>
       <w:pPr>
-        <w:spacing w:after="60"/>
+        <w:spacing w:after="30"/>
         <w:ind w:left="360"/>
       </w:pPr>
       <w:r>
@@ -3363,7 +3340,7 @@
     </w:p>
     <w:p>
       <w:pPr>
-        <w:spacing w:after="60"/>
+        <w:spacing w:after="30"/>
         <w:ind w:left="360"/>
       </w:pPr>
       <w:r>
@@ -3385,7 +3362,7 @@
     </w:p>
     <w:p>
       <w:pPr>
-        <w:spacing w:after="60"/>
+        <w:spacing w:after="30"/>
         <w:ind w:left="360"/>
       </w:pPr>
       <w:r>
@@ -3407,7 +3384,7 @@
     </w:p>
     <w:p>
       <w:pPr>
-        <w:spacing w:after="60"/>
+        <w:spacing w:after="30"/>
         <w:ind w:left="360"/>
       </w:pPr>
       <w:r>
@@ -3429,7 +3406,7 @@
     </w:p>
     <w:p>
       <w:pPr>
-        <w:spacing w:after="40" w:before="80"/>
+        <w:spacing w:after="10" w:before="20"/>
       </w:pPr>
       <w:r>
         <w:rPr>
@@ -3445,7 +3422,7 @@
     </w:p>
     <w:p>
       <w:pPr>
-        <w:spacing w:after="190"/>
+        <w:spacing w:after="100"/>
       </w:pPr>
       <w:r>
         <w:rPr>
@@ -3456,12 +3433,12 @@
     </w:p>
     <w:p>
       <w:pPr>
-        <w:spacing w:after="160"/>
-      </w:pPr>
-    </w:p>
-    <w:p>
-      <w:pPr>
-        <w:spacing w:after="80" w:before="0"/>
+        <w:spacing w:after="60"/>
+      </w:pPr>
+    </w:p>
+    <w:p>
+      <w:pPr>
+        <w:spacing w:after="40" w:before="0"/>
       </w:pPr>
       <w:r>
         <w:rPr>
@@ -3477,7 +3454,7 @@
     </w:p>
     <w:p>
       <w:pPr>
-        <w:spacing w:after="60"/>
+        <w:spacing w:after="30"/>
         <w:ind w:left="360"/>
       </w:pPr>
       <w:r>
@@ -3499,7 +3476,7 @@
     </w:p>
     <w:p>
       <w:pPr>
-        <w:spacing w:after="60"/>
+        <w:spacing w:after="30"/>
         <w:ind w:left="360"/>
       </w:pPr>
       <w:r>
@@ -3521,7 +3498,7 @@
     </w:p>
     <w:p>
       <w:pPr>
-        <w:spacing w:after="60"/>
+        <w:spacing w:after="30"/>
         <w:ind w:left="360"/>
       </w:pPr>
       <w:r>
@@ -3543,7 +3520,7 @@
     </w:p>
     <w:p>
       <w:pPr>
-        <w:spacing w:after="60"/>
+        <w:spacing w:after="30"/>
         <w:ind w:left="360"/>
       </w:pPr>
       <w:r>
@@ -3565,7 +3542,7 @@
     </w:p>
     <w:p>
       <w:pPr>
-        <w:spacing w:after="40" w:before="80"/>
+        <w:spacing w:after="10" w:before="20"/>
       </w:pPr>
       <w:r>
         <w:rPr>
@@ -3581,7 +3558,7 @@
     </w:p>
     <w:p>
       <w:pPr>
-        <w:spacing w:after="190"/>
+        <w:spacing w:after="100"/>
       </w:pPr>
       <w:r>
         <w:rPr>
@@ -3592,12 +3569,12 @@
     </w:p>
     <w:p>
       <w:pPr>
-        <w:spacing w:after="160"/>
-      </w:pPr>
-    </w:p>
-    <w:p>
-      <w:pPr>
-        <w:spacing w:after="80" w:before="0"/>
+        <w:spacing w:after="60"/>
+      </w:pPr>
+    </w:p>
+    <w:p>
+      <w:pPr>
+        <w:spacing w:after="40" w:before="0"/>
       </w:pPr>
       <w:r>
         <w:rPr>
@@ -3613,7 +3590,7 @@
     </w:p>
     <w:p>
       <w:pPr>
-        <w:spacing w:after="60"/>
+        <w:spacing w:after="30"/>
         <w:ind w:left="360"/>
       </w:pPr>
       <w:r>
@@ -3635,7 +3612,7 @@
     </w:p>
     <w:p>
       <w:pPr>
-        <w:spacing w:after="60"/>
+        <w:spacing w:after="30"/>
         <w:ind w:left="360"/>
       </w:pPr>
       <w:r>
@@ -3657,7 +3634,7 @@
     </w:p>
     <w:p>
       <w:pPr>
-        <w:spacing w:after="60"/>
+        <w:spacing w:after="30"/>
         <w:ind w:left="360"/>
       </w:pPr>
       <w:r>
@@ -3679,7 +3656,7 @@
     </w:p>
     <w:p>
       <w:pPr>
-        <w:spacing w:after="60"/>
+        <w:spacing w:after="30"/>
         <w:ind w:left="360"/>
       </w:pPr>
       <w:r>
@@ -3701,7 +3678,7 @@
     </w:p>
     <w:p>
       <w:pPr>
-        <w:spacing w:after="40" w:before="80"/>
+        <w:spacing w:after="10" w:before="20"/>
       </w:pPr>
       <w:r>
         <w:rPr>
@@ -3717,7 +3694,7 @@
     </w:p>
     <w:p>
       <w:pPr>
-        <w:spacing w:after="190"/>
+        <w:spacing w:after="100"/>
       </w:pPr>
       <w:r>
         <w:rPr>
@@ -3728,16 +3705,15 @@
     </w:p>
     <w:p>
       <w:pPr>
-        <w:spacing w:after="160"/>
-      </w:pPr>
-    </w:p>
-    <w:p>
-      <w:pPr>
-        <w:pageBreakBefore/>
+        <w:spacing w:after="60"/>
+      </w:pPr>
+    </w:p>
+    <w:p>
+      <w:pPr>
         <w:pBdr>
           <w:bottom w:val="single" w:color="163B65" w:sz="8" w:space="4"/>
         </w:pBdr>
-        <w:spacing w:after="130" w:before="280"/>
+        <w:spacing w:after="90" w:before="100"/>
       </w:pPr>
       <w:r>
         <w:rPr>
@@ -3745,15 +3721,15 @@
           <w:b/>
           <w:bCs/>
           <w:color w:val="163B65"/>
-          <w:sz w:val="27"/>
-          <w:szCs w:val="27"/>
+          <w:sz w:val="26"/>
+          <w:szCs w:val="26"/>
         </w:rPr>
         <w:t xml:space="preserve">Part V: Essay</w:t>
       </w:r>
     </w:p>
     <w:p>
       <w:pPr>
-        <w:spacing w:after="100" w:before="0"/>
+        <w:spacing w:after="50" w:before="0"/>
       </w:pPr>
       <w:r>
         <w:rPr>
@@ -3769,7 +3745,7 @@
     </w:p>
     <w:p>
       <w:pPr>
-        <w:spacing w:after="200" w:before="0"/>
+        <w:spacing w:after="70" w:before="0"/>
       </w:pPr>
       <w:r>
         <w:rPr>
@@ -3782,7 +3758,7 @@
     </w:p>
     <w:p>
       <w:pPr>
-        <w:spacing w:after="140" w:before="0"/>
+        <w:spacing w:after="50" w:before="0"/>
       </w:pPr>
       <w:r>
         <w:rPr>
@@ -3795,7 +3771,7 @@
     </w:p>
     <w:p>
       <w:pPr>
-        <w:spacing w:after="190"/>
+        <w:spacing w:after="100"/>
       </w:pPr>
       <w:r>
         <w:rPr>
@@ -3806,7 +3782,7 @@
     </w:p>
     <w:p>
       <w:pPr>
-        <w:spacing w:after="190"/>
+        <w:spacing w:after="100"/>
       </w:pPr>
       <w:r>
         <w:rPr>
@@ -3817,7 +3793,7 @@
     </w:p>
     <w:p>
       <w:pPr>
-        <w:spacing w:after="190"/>
+        <w:spacing w:after="100"/>
       </w:pPr>
       <w:r>
         <w:rPr>
@@ -3828,7 +3804,25 @@
     </w:p>
     <w:p>
       <w:pPr>
-        <w:spacing w:after="190"/>
+        <w:spacing w:after="40"/>
+      </w:pPr>
+    </w:p>
+    <w:p>
+      <w:pPr>
+        <w:spacing w:after="50" w:before="0"/>
+      </w:pPr>
+      <w:r>
+        <w:rPr>
+          <w:rFonts w:ascii="Times New Roman" w:cs="Times New Roman" w:eastAsia="Times New Roman" w:hAnsi="Times New Roman"/>
+          <w:sz w:val="20"/>
+          <w:szCs w:val="20"/>
+        </w:rPr>
+        <w:t xml:space="preserve">2. You are staffing your company’s booth at a MICE exhibition. A visitor stops at your booth and seems interested in your product, but says a competitor’s product is cheaper and starts to walk away. Write what you would say to this visitor to explain your product and keep their interest.</w:t>
+      </w:r>
+    </w:p>
+    <w:p>
+      <w:pPr>
+        <w:spacing w:after="100"/>
       </w:pPr>
       <w:r>
         <w:rPr>
@@ -3839,7 +3833,7 @@
     </w:p>
     <w:p>
       <w:pPr>
-        <w:spacing w:after="190"/>
+        <w:spacing w:after="100"/>
       </w:pPr>
       <w:r>
         <w:rPr>
@@ -3850,7 +3844,7 @@
     </w:p>
     <w:p>
       <w:pPr>
-        <w:spacing w:after="190"/>
+        <w:spacing w:after="100"/>
       </w:pPr>
       <w:r>
         <w:rPr>
@@ -3861,119 +3855,59 @@
     </w:p>
     <w:p>
       <w:pPr>
-        <w:spacing w:after="190"/>
-      </w:pPr>
-      <w:r>
-        <w:rPr>
-          <w:color w:val="999999"/>
-        </w:rPr>
-        <w:t xml:space="preserve">____________________________________________________________________________________________________</w:t>
-      </w:r>
-    </w:p>
-    <w:p>
-      <w:pPr>
-        <w:spacing w:after="220"/>
-      </w:pPr>
-    </w:p>
-    <w:p>
-      <w:pPr>
-        <w:spacing w:after="140" w:before="0"/>
-      </w:pPr>
-      <w:r>
-        <w:rPr>
-          <w:rFonts w:ascii="Times New Roman" w:cs="Times New Roman" w:eastAsia="Times New Roman" w:hAnsi="Times New Roman"/>
-          <w:sz w:val="20"/>
-          <w:szCs w:val="20"/>
-        </w:rPr>
-        <w:t xml:space="preserve">2. You are staffing your company’s booth at a MICE exhibition. A visitor stops at your booth and seems interested in your product, but says a competitor’s product is cheaper and starts to walk away. Write what you would say to this visitor to explain your product and keep their interest.</w:t>
-      </w:r>
-    </w:p>
-    <w:p>
-      <w:pPr>
-        <w:spacing w:after="190"/>
-      </w:pPr>
-      <w:r>
-        <w:rPr>
-          <w:color w:val="999999"/>
-        </w:rPr>
-        <w:t xml:space="preserve">____________________________________________________________________________________________________</w:t>
-      </w:r>
-    </w:p>
-    <w:p>
-      <w:pPr>
-        <w:spacing w:after="190"/>
-      </w:pPr>
-      <w:r>
-        <w:rPr>
-          <w:color w:val="999999"/>
-        </w:rPr>
-        <w:t xml:space="preserve">____________________________________________________________________________________________________</w:t>
-      </w:r>
-    </w:p>
-    <w:p>
-      <w:pPr>
-        <w:spacing w:after="190"/>
-      </w:pPr>
-      <w:r>
-        <w:rPr>
-          <w:color w:val="999999"/>
-        </w:rPr>
-        <w:t xml:space="preserve">____________________________________________________________________________________________________</w:t>
-      </w:r>
-    </w:p>
-    <w:p>
-      <w:pPr>
-        <w:spacing w:after="190"/>
-      </w:pPr>
-      <w:r>
-        <w:rPr>
-          <w:color w:val="999999"/>
-        </w:rPr>
-        <w:t xml:space="preserve">____________________________________________________________________________________________________</w:t>
-      </w:r>
-    </w:p>
-    <w:p>
-      <w:pPr>
-        <w:spacing w:after="190"/>
-      </w:pPr>
-      <w:r>
-        <w:rPr>
-          <w:color w:val="999999"/>
-        </w:rPr>
-        <w:t xml:space="preserve">____________________________________________________________________________________________________</w:t>
-      </w:r>
-    </w:p>
-    <w:p>
-      <w:pPr>
-        <w:spacing w:after="190"/>
-      </w:pPr>
-      <w:r>
-        <w:rPr>
-          <w:color w:val="999999"/>
-        </w:rPr>
-        <w:t xml:space="preserve">____________________________________________________________________________________________________</w:t>
-      </w:r>
-    </w:p>
-    <w:p>
-      <w:pPr>
-        <w:spacing w:after="190"/>
-      </w:pPr>
-      <w:r>
-        <w:rPr>
-          <w:color w:val="999999"/>
-        </w:rPr>
-        <w:t xml:space="preserve">____________________________________________________________________________________________________</w:t>
-      </w:r>
-    </w:p>
-    <w:p>
-      <w:pPr>
-        <w:spacing w:after="220"/>
-      </w:pPr>
+        <w:spacing w:after="0" w:before="0"/>
+        <w:jc w:val="center"/>
+      </w:pPr>
+      <w:r>
+        <w:rPr>
+          <w:rFonts w:ascii="Times New Roman" w:cs="Times New Roman" w:eastAsia="Times New Roman" w:hAnsi="Times New Roman"/>
+          <w:b/>
+          <w:bCs/>
+          <w:color w:val="163B65"/>
+          <w:sz w:val="20"/>
+          <w:szCs w:val="20"/>
+        </w:rPr>
+        <w:t xml:space="preserve">End of Quiz. Total: 40 points.</w:t>
+      </w:r>
+    </w:p>
+    <w:p>
+      <w:r>
+        <w:br w:type="page"/>
+      </w:r>
+    </w:p>
+    <w:p>
+      <w:pPr>
+        <w:spacing w:after="6"/>
+        <w:jc w:val="center"/>
+      </w:pPr>
+      <w:r>
+        <w:rPr>
+          <w:rFonts w:ascii="Times New Roman" w:cs="Times New Roman" w:eastAsia="Times New Roman" w:hAnsi="Times New Roman"/>
+          <w:b/>
+          <w:bCs/>
+          <w:color w:val="163B65"/>
+          <w:sz w:val="30"/>
+          <w:szCs w:val="30"/>
+        </w:rPr>
+        <w:t xml:space="preserve">ANSWER KEY</w:t>
+      </w:r>
     </w:p>
     <w:p>
       <w:pPr>
         <w:spacing w:after="200"/>
-      </w:pPr>
+        <w:jc w:val="center"/>
+      </w:pPr>
+      <w:r>
+        <w:rPr>
+          <w:rFonts w:ascii="Times New Roman" w:cs="Times New Roman" w:eastAsia="Times New Roman" w:hAnsi="Times New Roman"/>
+          <w:i/>
+          <w:iCs/>
+          <w:color w:val="D9740F"/>
+          <w:sz w:val="20"/>
+          <w:szCs w:val="20"/>
+        </w:rPr>
+        <w:t xml:space="preserve">Long Quiz: Units 9–11 — Teacher Copy Only</w:t>
+      </w:r>
     </w:p>
     <w:tbl>
       <w:tblPr>
@@ -3994,18 +3928,17 @@
         <w:tc>
           <w:tcPr>
             <w:tcW w:type="dxa" w:w="9360"/>
-            <w:shd w:fill="EAF0F6" w:val="clear"/>
-            <w:tcMar>
-              <w:top w:type="dxa" w:w="140"/>
+            <w:shd w:fill="F4E9DD" w:val="clear"/>
+            <w:tcMar>
+              <w:top w:type="dxa" w:w="90"/>
               <w:left w:type="dxa" w:w="160"/>
-              <w:bottom w:type="dxa" w:w="140"/>
+              <w:bottom w:type="dxa" w:w="90"/>
               <w:right w:type="dxa" w:w="160"/>
             </w:tcMar>
           </w:tcPr>
           <w:p>
             <w:pPr>
               <w:spacing w:after="0" w:before="0"/>
-              <w:jc w:val="center"/>
             </w:pPr>
             <w:r>
               <w:rPr>
@@ -4016,91 +3949,6 @@
                 <w:sz w:val="20"/>
                 <w:szCs w:val="20"/>
               </w:rPr>
-              <w:t xml:space="preserve">End of Quiz. Total: 40 points.</w:t>
-            </w:r>
-          </w:p>
-        </w:tc>
-      </w:tr>
-    </w:tbl>
-    <w:p>
-      <w:r>
-        <w:br w:type="page"/>
-      </w:r>
-    </w:p>
-    <w:p>
-      <w:pPr>
-        <w:spacing w:after="6"/>
-        <w:jc w:val="center"/>
-      </w:pPr>
-      <w:r>
-        <w:rPr>
-          <w:rFonts w:ascii="Times New Roman" w:cs="Times New Roman" w:eastAsia="Times New Roman" w:hAnsi="Times New Roman"/>
-          <w:b/>
-          <w:bCs/>
-          <w:color w:val="163B65"/>
-          <w:sz w:val="30"/>
-          <w:szCs w:val="30"/>
-        </w:rPr>
-        <w:t xml:space="preserve">ANSWER KEY</w:t>
-      </w:r>
-    </w:p>
-    <w:p>
-      <w:pPr>
-        <w:spacing w:after="200"/>
-        <w:jc w:val="center"/>
-      </w:pPr>
-      <w:r>
-        <w:rPr>
-          <w:rFonts w:ascii="Times New Roman" w:cs="Times New Roman" w:eastAsia="Times New Roman" w:hAnsi="Times New Roman"/>
-          <w:i/>
-          <w:iCs/>
-          <w:color w:val="D9740F"/>
-          <w:sz w:val="20"/>
-          <w:szCs w:val="20"/>
-        </w:rPr>
-        <w:t xml:space="preserve">Long Quiz: Units 9–11 — Teacher Copy Only</w:t>
-      </w:r>
-    </w:p>
-    <w:tbl>
-      <w:tblPr>
-        <w:tblW w:type="dxa" w:w="9360"/>
-        <w:tblBorders>
-          <w:top w:val="single" w:color="auto" w:sz="4"/>
-          <w:left w:val="single" w:color="auto" w:sz="4"/>
-          <w:bottom w:val="single" w:color="auto" w:sz="4"/>
-          <w:right w:val="single" w:color="auto" w:sz="4"/>
-          <w:insideH w:val="single" w:color="auto" w:sz="4"/>
-          <w:insideV w:val="single" w:color="auto" w:sz="4"/>
-        </w:tblBorders>
-      </w:tblPr>
-      <w:tblGrid>
-        <w:gridCol w:w="9360"/>
-      </w:tblGrid>
-      <w:tr>
-        <w:tc>
-          <w:tcPr>
-            <w:tcW w:type="dxa" w:w="9360"/>
-            <w:shd w:fill="F4E9DD" w:val="clear"/>
-            <w:tcMar>
-              <w:top w:type="dxa" w:w="140"/>
-              <w:left w:type="dxa" w:w="160"/>
-              <w:bottom w:type="dxa" w:w="140"/>
-              <w:right w:type="dxa" w:w="160"/>
-            </w:tcMar>
-          </w:tcPr>
-          <w:p>
-            <w:pPr>
-              <w:spacing w:after="0" w:before="0"/>
-            </w:pPr>
-            <w:r>
-              <w:rPr>
-                <w:rFonts w:ascii="Times New Roman" w:cs="Times New Roman" w:eastAsia="Times New Roman" w:hAnsi="Times New Roman"/>
-                <w:b/>
-                <w:bCs/>
-                <w:color w:val="163B65"/>
-                <w:sz w:val="20"/>
-                <w:szCs w:val="20"/>
-              </w:rPr>
               <w:t xml:space="preserve">Do not distribute this page to students.</w:t>
             </w:r>
           </w:p>
@@ -4435,7 +4283,7 @@
     </w:p>
     <w:sectPr>
       <w:pgSz w:w="12240" w:h="15840" w:orient="portrait"/>
-      <w:pgMar w:top="900" w:right="1000" w:bottom="900" w:left="1000" w:header="708" w:footer="708" w:gutter="0"/>
+      <w:pgMar w:top="560" w:right="940" w:bottom="500" w:left="940" w:header="708" w:footer="708" w:gutter="0"/>
       <w:pgNumType/>
       <w:docGrid w:linePitch="360"/>
     </w:sectPr>

</xml_diff>

<commit_message>
Set explicit single line spacing on the Long Quiz
Added a document-wide default paragraph spacing (line: 240, auto) so
the page count renders consistently across Word and LibreOffice
instead of depending on each app's own default line-height.

Co-Authored-By: Claude Sonnet 5 <noreply@anthropic.com>
</commit_message>
<xml_diff>
--- a/_deliverables/MICE-LongQuiz-Units9-11.docx
+++ b/_deliverables/MICE-LongQuiz-Units9-11.docx
@@ -4464,7 +4464,11 @@
 <w:styles xmlns:mc="http://schemas.openxmlformats.org/markup-compatibility/2006" xmlns:r="http://schemas.openxmlformats.org/officeDocument/2006/relationships" xmlns:w="http://schemas.openxmlformats.org/wordprocessingml/2006/main" xmlns:w14="http://schemas.microsoft.com/office/word/2010/wordml" xmlns:w15="http://schemas.microsoft.com/office/word/2012/wordml" mc:Ignorable="w14 w15">
   <w:docDefaults>
     <w:rPrDefault/>
-    <w:pPrDefault/>
+    <w:pPrDefault>
+      <w:pPr>
+        <w:spacing w:line="240" w:lineRule="auto"/>
+      </w:pPr>
+    </w:pPrDefault>
   </w:docDefaults>
   <w:style w:type="paragraph" w:styleId="Normal" w:default="1">
     <w:name w:val="Normal"/>

</xml_diff>

<commit_message>
Long Quiz: replace the points line with a phones and AI instruction
Co-Authored-By: Claude Sonnet 5.5 <noreply@anthropic.com>
</commit_message>
<xml_diff>
--- a/_deliverables/MICE-LongQuiz-Units9-11.docx
+++ b/_deliverables/MICE-LongQuiz-Units9-11.docx
@@ -11,7 +11,6 @@
         <w:rPr>
           <w:b/>
           <w:bCs/>
-          <w:color w:val="5B6B7C"/>
           <w:sz w:val="18"/>
           <w:szCs w:val="18"/>
         </w:rPr>
@@ -27,7 +26,6 @@
         <w:rPr>
           <w:b/>
           <w:bCs/>
-          <w:color w:val="163B65"/>
           <w:sz w:val="32"/>
           <w:szCs w:val="32"/>
         </w:rPr>
@@ -43,22 +41,13 @@
         <w:rPr>
           <w:i/>
           <w:iCs/>
-          <w:color w:val="D9740F"/>
         </w:rPr>
         <w:t>Exhibition Booth Communication · Answering the Phone · Apologizing &amp; Saying No Professionally</w:t>
       </w:r>
     </w:p>
     <w:tbl>
       <w:tblPr>
-        <w:tblW w:w="9360" w:type="dxa"/>
-        <w:tblBorders>
-          <w:top w:val="single" w:sz="4" w:space="0" w:color="auto"/>
-          <w:left w:val="single" w:sz="4" w:space="0" w:color="auto"/>
-          <w:bottom w:val="single" w:sz="4" w:space="0" w:color="auto"/>
-          <w:right w:val="single" w:sz="4" w:space="0" w:color="auto"/>
-          <w:insideH w:val="single" w:sz="4" w:space="0" w:color="auto"/>
-          <w:insideV w:val="single" w:sz="4" w:space="0" w:color="auto"/>
-        </w:tblBorders>
+        <w:tblW w:w="10343" w:type="dxa"/>
         <w:tblCellMar>
           <w:left w:w="10" w:type="dxa"/>
           <w:right w:w="10" w:type="dxa"/>
@@ -66,19 +55,12 @@
         <w:tblLook w:val="04A0" w:firstRow="1" w:lastRow="0" w:firstColumn="1" w:lastColumn="0" w:noHBand="0" w:noVBand="1"/>
       </w:tblPr>
       <w:tblGrid>
-        <w:gridCol w:w="9360"/>
+        <w:gridCol w:w="10343"/>
       </w:tblGrid>
       <w:tr>
-        <w:tblPrEx>
-          <w:tblCellMar>
-            <w:top w:w="0" w:type="dxa"/>
-            <w:bottom w:w="0" w:type="dxa"/>
-          </w:tblCellMar>
-        </w:tblPrEx>
-        <w:tc>
-          <w:tcPr>
-            <w:tcW w:w="9360" w:type="dxa"/>
-            <w:shd w:val="clear" w:color="auto" w:fill="EAF0F6"/>
+        <w:tc>
+          <w:tcPr>
+            <w:tcW w:w="10343" w:type="dxa"/>
             <w:tcMar>
               <w:top w:w="90" w:type="dxa"/>
               <w:left w:w="160" w:type="dxa"/>
@@ -91,9 +73,8 @@
               <w:rPr>
                 <w:b/>
                 <w:bCs/>
-                <w:color w:val="163B65"/>
-              </w:rPr>
-              <w:t>Total: 40 points  ·  This quiz reviews Units 9–11 and is preparation for your Final Exam.</w:t>
+              </w:rPr>
+              <w:t>Put away your phone. Do not use AI for this Long Quiz.</w:t>
             </w:r>
           </w:p>
         </w:tc>
@@ -106,7 +87,7 @@
     </w:p>
     <w:tbl>
       <w:tblPr>
-        <w:tblW w:w="9360" w:type="dxa"/>
+        <w:tblW w:w="10343" w:type="dxa"/>
         <w:tblBorders>
           <w:top w:val="single" w:sz="4" w:space="0" w:color="auto"/>
           <w:left w:val="single" w:sz="4" w:space="0" w:color="auto"/>
@@ -125,15 +106,9 @@
         <w:gridCol w:w="1400"/>
         <w:gridCol w:w="4760"/>
         <w:gridCol w:w="1600"/>
-        <w:gridCol w:w="1600"/>
+        <w:gridCol w:w="2583"/>
       </w:tblGrid>
       <w:tr>
-        <w:tblPrEx>
-          <w:tblCellMar>
-            <w:top w:w="0" w:type="dxa"/>
-            <w:bottom w:w="0" w:type="dxa"/>
-          </w:tblCellMar>
-        </w:tblPrEx>
         <w:tc>
           <w:tcPr>
             <w:tcW w:w="1400" w:type="dxa"/>
@@ -188,7 +163,7 @@
         </w:tc>
         <w:tc>
           <w:tcPr>
-            <w:tcW w:w="1600" w:type="dxa"/>
+            <w:tcW w:w="2583" w:type="dxa"/>
             <w:tcMar>
               <w:top w:w="90" w:type="dxa"/>
               <w:left w:w="110" w:type="dxa"/>
@@ -200,12 +175,6 @@
         </w:tc>
       </w:tr>
       <w:tr>
-        <w:tblPrEx>
-          <w:tblCellMar>
-            <w:top w:w="0" w:type="dxa"/>
-            <w:bottom w:w="0" w:type="dxa"/>
-          </w:tblCellMar>
-        </w:tblPrEx>
         <w:tc>
           <w:tcPr>
             <w:tcW w:w="1400" w:type="dxa"/>
@@ -260,7 +229,7 @@
         </w:tc>
         <w:tc>
           <w:tcPr>
-            <w:tcW w:w="1600" w:type="dxa"/>
+            <w:tcW w:w="2583" w:type="dxa"/>
             <w:tcMar>
               <w:top w:w="90" w:type="dxa"/>
               <w:left w:w="110" w:type="dxa"/>
@@ -285,7 +254,6 @@
         <w:rPr>
           <w:i/>
           <w:iCs/>
-          <w:color w:val="5B6B7C"/>
         </w:rPr>
         <w:t>Read every question carefully. Write your answers clearly in English. Good luck!</w:t>
       </w:r>
@@ -301,7 +269,6 @@
         <w:rPr>
           <w:b/>
           <w:bCs/>
-          <w:color w:val="163B65"/>
           <w:sz w:val="26"/>
           <w:szCs w:val="26"/>
         </w:rPr>
@@ -316,7 +283,6 @@
         <w:rPr>
           <w:i/>
           <w:iCs/>
-          <w:color w:val="5B6B7C"/>
           <w:sz w:val="19"/>
           <w:szCs w:val="19"/>
         </w:rPr>
@@ -363,12 +329,6 @@
         <w:gridCol w:w="2660"/>
       </w:tblGrid>
       <w:tr>
-        <w:tblPrEx>
-          <w:tblCellMar>
-            <w:top w:w="0" w:type="dxa"/>
-            <w:bottom w:w="0" w:type="dxa"/>
-          </w:tblCellMar>
-        </w:tblPrEx>
         <w:tc>
           <w:tcPr>
             <w:tcW w:w="2100" w:type="dxa"/>
@@ -512,12 +472,6 @@
         <w:gridCol w:w="2660"/>
       </w:tblGrid>
       <w:tr>
-        <w:tblPrEx>
-          <w:tblCellMar>
-            <w:top w:w="0" w:type="dxa"/>
-            <w:bottom w:w="0" w:type="dxa"/>
-          </w:tblCellMar>
-        </w:tblPrEx>
         <w:tc>
           <w:tcPr>
             <w:tcW w:w="2100" w:type="dxa"/>
@@ -661,12 +615,6 @@
         <w:gridCol w:w="2660"/>
       </w:tblGrid>
       <w:tr>
-        <w:tblPrEx>
-          <w:tblCellMar>
-            <w:top w:w="0" w:type="dxa"/>
-            <w:bottom w:w="0" w:type="dxa"/>
-          </w:tblCellMar>
-        </w:tblPrEx>
         <w:tc>
           <w:tcPr>
             <w:tcW w:w="2100" w:type="dxa"/>
@@ -810,12 +758,6 @@
         <w:gridCol w:w="2660"/>
       </w:tblGrid>
       <w:tr>
-        <w:tblPrEx>
-          <w:tblCellMar>
-            <w:top w:w="0" w:type="dxa"/>
-            <w:bottom w:w="0" w:type="dxa"/>
-          </w:tblCellMar>
-        </w:tblPrEx>
         <w:tc>
           <w:tcPr>
             <w:tcW w:w="2100" w:type="dxa"/>
@@ -959,12 +901,6 @@
         <w:gridCol w:w="2660"/>
       </w:tblGrid>
       <w:tr>
-        <w:tblPrEx>
-          <w:tblCellMar>
-            <w:top w:w="0" w:type="dxa"/>
-            <w:bottom w:w="0" w:type="dxa"/>
-          </w:tblCellMar>
-        </w:tblPrEx>
         <w:tc>
           <w:tcPr>
             <w:tcW w:w="2100" w:type="dxa"/>
@@ -1108,12 +1044,6 @@
         <w:gridCol w:w="2660"/>
       </w:tblGrid>
       <w:tr>
-        <w:tblPrEx>
-          <w:tblCellMar>
-            <w:top w:w="0" w:type="dxa"/>
-            <w:bottom w:w="0" w:type="dxa"/>
-          </w:tblCellMar>
-        </w:tblPrEx>
         <w:tc>
           <w:tcPr>
             <w:tcW w:w="2100" w:type="dxa"/>
@@ -1257,12 +1187,6 @@
         <w:gridCol w:w="2660"/>
       </w:tblGrid>
       <w:tr>
-        <w:tblPrEx>
-          <w:tblCellMar>
-            <w:top w:w="0" w:type="dxa"/>
-            <w:bottom w:w="0" w:type="dxa"/>
-          </w:tblCellMar>
-        </w:tblPrEx>
         <w:tc>
           <w:tcPr>
             <w:tcW w:w="2100" w:type="dxa"/>
@@ -1406,12 +1330,6 @@
         <w:gridCol w:w="2660"/>
       </w:tblGrid>
       <w:tr>
-        <w:tblPrEx>
-          <w:tblCellMar>
-            <w:top w:w="0" w:type="dxa"/>
-            <w:bottom w:w="0" w:type="dxa"/>
-          </w:tblCellMar>
-        </w:tblPrEx>
         <w:tc>
           <w:tcPr>
             <w:tcW w:w="2100" w:type="dxa"/>
@@ -1555,12 +1473,6 @@
         <w:gridCol w:w="2660"/>
       </w:tblGrid>
       <w:tr>
-        <w:tblPrEx>
-          <w:tblCellMar>
-            <w:top w:w="0" w:type="dxa"/>
-            <w:bottom w:w="0" w:type="dxa"/>
-          </w:tblCellMar>
-        </w:tblPrEx>
         <w:tc>
           <w:tcPr>
             <w:tcW w:w="2100" w:type="dxa"/>
@@ -1704,12 +1616,6 @@
         <w:gridCol w:w="2660"/>
       </w:tblGrid>
       <w:tr>
-        <w:tblPrEx>
-          <w:tblCellMar>
-            <w:top w:w="0" w:type="dxa"/>
-            <w:bottom w:w="0" w:type="dxa"/>
-          </w:tblCellMar>
-        </w:tblPrEx>
         <w:tc>
           <w:tcPr>
             <w:tcW w:w="2100" w:type="dxa"/>
@@ -1832,7 +1738,6 @@
         <w:rPr>
           <w:b/>
           <w:bCs/>
-          <w:color w:val="163B65"/>
           <w:sz w:val="26"/>
           <w:szCs w:val="26"/>
         </w:rPr>
@@ -1847,7 +1752,6 @@
         <w:rPr>
           <w:i/>
           <w:iCs/>
-          <w:color w:val="5B6B7C"/>
           <w:sz w:val="19"/>
           <w:szCs w:val="19"/>
         </w:rPr>
@@ -1884,12 +1788,6 @@
         <w:gridCol w:w="2000"/>
       </w:tblGrid>
       <w:tr>
-        <w:tblPrEx>
-          <w:tblCellMar>
-            <w:top w:w="0" w:type="dxa"/>
-            <w:bottom w:w="0" w:type="dxa"/>
-          </w:tblCellMar>
-        </w:tblPrEx>
         <w:tc>
           <w:tcPr>
             <w:tcW w:w="7360" w:type="dxa"/>
@@ -1966,12 +1864,6 @@
         <w:gridCol w:w="2000"/>
       </w:tblGrid>
       <w:tr>
-        <w:tblPrEx>
-          <w:tblCellMar>
-            <w:top w:w="0" w:type="dxa"/>
-            <w:bottom w:w="0" w:type="dxa"/>
-          </w:tblCellMar>
-        </w:tblPrEx>
         <w:tc>
           <w:tcPr>
             <w:tcW w:w="7360" w:type="dxa"/>
@@ -2048,12 +1940,6 @@
         <w:gridCol w:w="2000"/>
       </w:tblGrid>
       <w:tr>
-        <w:tblPrEx>
-          <w:tblCellMar>
-            <w:top w:w="0" w:type="dxa"/>
-            <w:bottom w:w="0" w:type="dxa"/>
-          </w:tblCellMar>
-        </w:tblPrEx>
         <w:tc>
           <w:tcPr>
             <w:tcW w:w="7360" w:type="dxa"/>
@@ -2130,12 +2016,6 @@
         <w:gridCol w:w="2000"/>
       </w:tblGrid>
       <w:tr>
-        <w:tblPrEx>
-          <w:tblCellMar>
-            <w:top w:w="0" w:type="dxa"/>
-            <w:bottom w:w="0" w:type="dxa"/>
-          </w:tblCellMar>
-        </w:tblPrEx>
         <w:tc>
           <w:tcPr>
             <w:tcW w:w="7360" w:type="dxa"/>
@@ -2212,12 +2092,6 @@
         <w:gridCol w:w="2000"/>
       </w:tblGrid>
       <w:tr>
-        <w:tblPrEx>
-          <w:tblCellMar>
-            <w:top w:w="0" w:type="dxa"/>
-            <w:bottom w:w="0" w:type="dxa"/>
-          </w:tblCellMar>
-        </w:tblPrEx>
         <w:tc>
           <w:tcPr>
             <w:tcW w:w="7360" w:type="dxa"/>
@@ -2294,12 +2168,6 @@
         <w:gridCol w:w="2000"/>
       </w:tblGrid>
       <w:tr>
-        <w:tblPrEx>
-          <w:tblCellMar>
-            <w:top w:w="0" w:type="dxa"/>
-            <w:bottom w:w="0" w:type="dxa"/>
-          </w:tblCellMar>
-        </w:tblPrEx>
         <w:tc>
           <w:tcPr>
             <w:tcW w:w="7360" w:type="dxa"/>
@@ -2376,12 +2244,6 @@
         <w:gridCol w:w="2000"/>
       </w:tblGrid>
       <w:tr>
-        <w:tblPrEx>
-          <w:tblCellMar>
-            <w:top w:w="0" w:type="dxa"/>
-            <w:bottom w:w="0" w:type="dxa"/>
-          </w:tblCellMar>
-        </w:tblPrEx>
         <w:tc>
           <w:tcPr>
             <w:tcW w:w="7360" w:type="dxa"/>
@@ -2458,12 +2320,6 @@
         <w:gridCol w:w="2000"/>
       </w:tblGrid>
       <w:tr>
-        <w:tblPrEx>
-          <w:tblCellMar>
-            <w:top w:w="0" w:type="dxa"/>
-            <w:bottom w:w="0" w:type="dxa"/>
-          </w:tblCellMar>
-        </w:tblPrEx>
         <w:tc>
           <w:tcPr>
             <w:tcW w:w="7360" w:type="dxa"/>
@@ -2540,12 +2396,6 @@
         <w:gridCol w:w="2000"/>
       </w:tblGrid>
       <w:tr>
-        <w:tblPrEx>
-          <w:tblCellMar>
-            <w:top w:w="0" w:type="dxa"/>
-            <w:bottom w:w="0" w:type="dxa"/>
-          </w:tblCellMar>
-        </w:tblPrEx>
         <w:tc>
           <w:tcPr>
             <w:tcW w:w="7360" w:type="dxa"/>
@@ -2622,12 +2472,6 @@
         <w:gridCol w:w="2000"/>
       </w:tblGrid>
       <w:tr>
-        <w:tblPrEx>
-          <w:tblCellMar>
-            <w:top w:w="0" w:type="dxa"/>
-            <w:bottom w:w="0" w:type="dxa"/>
-          </w:tblCellMar>
-        </w:tblPrEx>
         <w:tc>
           <w:tcPr>
             <w:tcW w:w="7360" w:type="dxa"/>
@@ -2693,7 +2537,6 @@
         <w:rPr>
           <w:b/>
           <w:bCs/>
-          <w:color w:val="163B65"/>
           <w:sz w:val="26"/>
           <w:szCs w:val="26"/>
         </w:rPr>
@@ -2708,7 +2551,6 @@
         <w:rPr>
           <w:i/>
           <w:iCs/>
-          <w:color w:val="5B6B7C"/>
           <w:sz w:val="19"/>
           <w:szCs w:val="19"/>
         </w:rPr>
@@ -2720,7 +2562,38 @@
         <w:spacing w:after="70"/>
       </w:pPr>
       <w:r>
-        <w:t>Read each phone call below. Write the short notes that you need to take.</w:t>
+        <w:t>Read each phone call below.</w:t>
+      </w:r>
+      <w:r>
+        <w:t xml:space="preserve"> </w:t>
+      </w:r>
+      <w:r>
+        <w:rPr>
+          <w:sz w:val="21"/>
+          <w:szCs w:val="21"/>
+        </w:rPr>
+        <w:t>Take</w:t>
+      </w:r>
+      <w:r>
+        <w:rPr>
+          <w:sz w:val="21"/>
+          <w:szCs w:val="21"/>
+        </w:rPr>
+        <w:t xml:space="preserve"> your notes</w:t>
+      </w:r>
+      <w:r>
+        <w:rPr>
+          <w:sz w:val="21"/>
+          <w:szCs w:val="21"/>
+        </w:rPr>
+        <w:t xml:space="preserve"> on the space provided</w:t>
+      </w:r>
+      <w:r>
+        <w:rPr>
+          <w:sz w:val="21"/>
+          <w:szCs w:val="21"/>
+        </w:rPr>
+        <w:t>. Write short words and key facts only, not full sentences.</w:t>
       </w:r>
     </w:p>
     <w:p>
@@ -2731,11 +2604,531 @@
         <w:rPr>
           <w:b/>
           <w:bCs/>
-          <w:color w:val="D9740F"/>
           <w:sz w:val="22"/>
           <w:szCs w:val="22"/>
         </w:rPr>
         <w:t>Phone Call 1</w:t>
+      </w:r>
+    </w:p>
+    <w:tbl>
+      <w:tblPr>
+        <w:tblW w:w="9918" w:type="dxa"/>
+        <w:tblCellMar>
+          <w:left w:w="10" w:type="dxa"/>
+          <w:right w:w="10" w:type="dxa"/>
+        </w:tblCellMar>
+        <w:tblLook w:val="04A0" w:firstRow="1" w:lastRow="0" w:firstColumn="1" w:lastColumn="0" w:noHBand="0" w:noVBand="1"/>
+      </w:tblPr>
+      <w:tblGrid>
+        <w:gridCol w:w="9918"/>
+      </w:tblGrid>
+      <w:tr>
+        <w:tc>
+          <w:tcPr>
+            <w:tcW w:w="9918" w:type="dxa"/>
+            <w:tcMar>
+              <w:top w:w="90" w:type="dxa"/>
+              <w:left w:w="160" w:type="dxa"/>
+              <w:bottom w:w="90" w:type="dxa"/>
+              <w:right w:w="160" w:type="dxa"/>
+            </w:tcMar>
+          </w:tcPr>
+          <w:p>
+            <w:r>
+              <w:rPr>
+                <w:sz w:val="19"/>
+                <w:szCs w:val="19"/>
+              </w:rPr>
+              <w:t>A man named Khun Nattapong, from Siam Exports, calls the MICE Console asking to speak with the parking coordinator. The parking coordinator is busy with another group, so the staff member offers to take a message. Khun Nattapong gives his number, 085-678-1234, and explains that his group needs 5 more parking spaces for tomorrow’s conference. He asks for a call back before 6pm tonight.</w:t>
+            </w:r>
+          </w:p>
+        </w:tc>
+      </w:tr>
+    </w:tbl>
+    <w:p>
+      <w:pPr>
+        <w:spacing w:after="40"/>
+      </w:pPr>
+    </w:p>
+    <w:p>
+      <w:pPr>
+        <w:spacing w:after="30"/>
+      </w:pPr>
+      <w:r>
+        <w:rPr>
+          <w:b/>
+          <w:bCs/>
+        </w:rPr>
+        <w:t>Your Notes:</w:t>
+      </w:r>
+      <w:r>
+        <w:rPr>
+          <w:b/>
+          <w:bCs/>
+        </w:rPr>
+        <w:br/>
+      </w:r>
+      <w:r>
+        <w:rPr>
+          <w:b/>
+          <w:bCs/>
+        </w:rPr>
+        <w:br/>
+      </w:r>
+    </w:p>
+    <w:p>
+      <w:pPr>
+        <w:spacing w:after="50"/>
+      </w:pPr>
+      <w:r>
+        <w:br/>
+      </w:r>
+      <w:r>
+        <w:br/>
+      </w:r>
+      <w:r>
+        <w:br/>
+      </w:r>
+      <w:r>
+        <w:br/>
+      </w:r>
+      <w:r>
+        <w:br/>
+      </w:r>
+      <w:r>
+        <w:br/>
+      </w:r>
+    </w:p>
+    <w:p>
+      <w:pPr>
+        <w:spacing w:before="70" w:after="90"/>
+      </w:pPr>
+      <w:r>
+        <w:rPr>
+          <w:b/>
+          <w:bCs/>
+          <w:sz w:val="22"/>
+          <w:szCs w:val="22"/>
+        </w:rPr>
+        <w:t>Phone Call 2</w:t>
+      </w:r>
+    </w:p>
+    <w:tbl>
+      <w:tblPr>
+        <w:tblW w:w="10065" w:type="dxa"/>
+        <w:tblCellMar>
+          <w:left w:w="10" w:type="dxa"/>
+          <w:right w:w="10" w:type="dxa"/>
+        </w:tblCellMar>
+        <w:tblLook w:val="04A0" w:firstRow="1" w:lastRow="0" w:firstColumn="1" w:lastColumn="0" w:noHBand="0" w:noVBand="1"/>
+      </w:tblPr>
+      <w:tblGrid>
+        <w:gridCol w:w="10065"/>
+      </w:tblGrid>
+      <w:tr>
+        <w:tc>
+          <w:tcPr>
+            <w:tcW w:w="10065" w:type="dxa"/>
+            <w:tcMar>
+              <w:top w:w="90" w:type="dxa"/>
+              <w:left w:w="160" w:type="dxa"/>
+              <w:bottom w:w="90" w:type="dxa"/>
+              <w:right w:w="160" w:type="dxa"/>
+            </w:tcMar>
+          </w:tcPr>
+          <w:p>
+            <w:r>
+              <w:rPr>
+                <w:sz w:val="19"/>
+                <w:szCs w:val="19"/>
+              </w:rPr>
+              <w:t>A woman named Khun Achara, from Blue Ocean Spa Products, calls the MICE Console asking to speak with the booth manager. The booth manager is out at lunch, so the staff member offers to take a message. Khun Achara gives her number, 098-234-5566, and explains that she needs one extra visitor badge for a colleague arriving this afternoon. She asks for a call back before 3pm.</w:t>
+            </w:r>
+          </w:p>
+        </w:tc>
+      </w:tr>
+    </w:tbl>
+    <w:p>
+      <w:pPr>
+        <w:spacing w:after="40"/>
+      </w:pPr>
+    </w:p>
+    <w:p>
+      <w:pPr>
+        <w:spacing w:after="30"/>
+      </w:pPr>
+      <w:r>
+        <w:rPr>
+          <w:b/>
+          <w:bCs/>
+        </w:rPr>
+        <w:t>Your Notes:</w:t>
+      </w:r>
+      <w:r>
+        <w:rPr>
+          <w:b/>
+          <w:bCs/>
+        </w:rPr>
+        <w:br/>
+      </w:r>
+      <w:r>
+        <w:rPr>
+          <w:b/>
+          <w:bCs/>
+        </w:rPr>
+        <w:br/>
+      </w:r>
+    </w:p>
+    <w:p>
+      <w:pPr>
+        <w:spacing w:after="50"/>
+      </w:pPr>
+      <w:r>
+        <w:br/>
+      </w:r>
+      <w:r>
+        <w:br/>
+      </w:r>
+      <w:r>
+        <w:br/>
+      </w:r>
+      <w:r>
+        <w:br/>
+      </w:r>
+      <w:r>
+        <w:br/>
+      </w:r>
+      <w:r>
+        <w:br/>
+      </w:r>
+      <w:r>
+        <w:br/>
+      </w:r>
+      <w:r>
+        <w:br/>
+      </w:r>
+      <w:r>
+        <w:lastRenderedPageBreak/>
+        <w:br/>
+      </w:r>
+    </w:p>
+    <w:p>
+      <w:pPr>
+        <w:pBdr>
+          <w:bottom w:val="single" w:sz="8" w:space="4" w:color="163B65"/>
+        </w:pBdr>
+        <w:spacing w:before="100" w:after="90"/>
+      </w:pPr>
+      <w:r>
+        <w:rPr>
+          <w:b/>
+          <w:bCs/>
+          <w:sz w:val="26"/>
+          <w:szCs w:val="26"/>
+        </w:rPr>
+        <w:t>Part IV: Put the Sentence in Order</w:t>
+      </w:r>
+    </w:p>
+    <w:p>
+      <w:pPr>
+        <w:spacing w:after="50"/>
+      </w:pPr>
+      <w:r>
+        <w:rPr>
+          <w:i/>
+          <w:iCs/>
+          <w:sz w:val="19"/>
+          <w:szCs w:val="19"/>
+        </w:rPr>
+        <w:t>6 points</w:t>
+      </w:r>
+    </w:p>
+    <w:p>
+      <w:pPr>
+        <w:spacing w:after="70"/>
+      </w:pPr>
+      <w:r>
+        <w:t>Put the phrases in the correct order to make ONE professional sentence. Write the numbers 1, 2, 3, 4 in the blanks</w:t>
+      </w:r>
+      <w:r>
+        <w:t>.</w:t>
+      </w:r>
+    </w:p>
+    <w:p>
+      <w:pPr>
+        <w:spacing w:after="40"/>
+      </w:pPr>
+      <w:r>
+        <w:rPr>
+          <w:b/>
+          <w:bCs/>
+        </w:rPr>
+        <w:t>1. Complete a polite apology with a solution.</w:t>
+      </w:r>
+    </w:p>
+    <w:p>
+      <w:pPr>
+        <w:spacing w:after="30"/>
+        <w:ind w:left="360"/>
+      </w:pPr>
+      <w:r>
+        <w:t>[ ___ ]  another table.</w:t>
+      </w:r>
+      <w:r>
+        <w:t xml:space="preserve">  </w:t>
+      </w:r>
+      <w:r>
+        <w:t>[ ___ ]  I'm sorry,</w:t>
+      </w:r>
+      <w:r>
+        <w:t xml:space="preserve">  </w:t>
+      </w:r>
+      <w:r>
+        <w:t>[ ___ ]  but I can offer you</w:t>
+      </w:r>
+      <w:r>
+        <w:t xml:space="preserve">  </w:t>
+      </w:r>
+      <w:r>
+        <w:t>[ ___ ]  that table is booked,</w:t>
+      </w:r>
+    </w:p>
+    <w:p>
+      <w:pPr>
+        <w:spacing w:after="60"/>
+      </w:pPr>
+    </w:p>
+    <w:p>
+      <w:pPr>
+        <w:spacing w:after="40"/>
+      </w:pPr>
+      <w:r>
+        <w:rPr>
+          <w:b/>
+          <w:bCs/>
+        </w:rPr>
+        <w:t>2. Complete a fast, professional fix.</w:t>
+      </w:r>
+    </w:p>
+    <w:p>
+      <w:pPr>
+        <w:spacing w:after="30"/>
+        <w:ind w:left="360"/>
+      </w:pPr>
+      <w:r>
+        <w:t>[ ___ ]  for you</w:t>
+      </w:r>
+      <w:r>
+        <w:t xml:space="preserve">  </w:t>
+      </w:r>
+      <w:r>
+        <w:t>[ ___ ]  Let me find</w:t>
+      </w:r>
+      <w:r>
+        <w:t xml:space="preserve">. </w:t>
+      </w:r>
+      <w:r>
+        <w:t>[ ___ ]  right away.</w:t>
+      </w:r>
+      <w:r>
+        <w:t xml:space="preserve">   </w:t>
+      </w:r>
+      <w:r>
+        <w:t>[ ___ ]  a solution</w:t>
+      </w:r>
+    </w:p>
+    <w:p>
+      <w:pPr>
+        <w:spacing w:after="60"/>
+      </w:pPr>
+    </w:p>
+    <w:p>
+      <w:pPr>
+        <w:spacing w:after="40"/>
+      </w:pPr>
+      <w:r>
+        <w:rPr>
+          <w:b/>
+          <w:bCs/>
+        </w:rPr>
+        <w:t>3. Complete a polite refusal with an alternative.</w:t>
+      </w:r>
+    </w:p>
+    <w:p>
+      <w:pPr>
+        <w:spacing w:after="30"/>
+        <w:ind w:left="360"/>
+      </w:pPr>
+      <w:r>
+        <w:t>[ ___ ]  but I can offer you</w:t>
+      </w:r>
+      <w:r>
+        <w:t xml:space="preserve">.   </w:t>
+      </w:r>
+      <w:r>
+        <w:t>[ ___ ]  instead.</w:t>
+      </w:r>
+      <w:r>
+        <w:t xml:space="preserve">  </w:t>
+      </w:r>
+      <w:r>
+        <w:t>[ ___ ]  I'm afraid that won't be possible,</w:t>
+      </w:r>
+      <w:r>
+        <w:t xml:space="preserve">  </w:t>
+      </w:r>
+      <w:r>
+        <w:t>[ ___ ]  the 3 PM slot</w:t>
+      </w:r>
+    </w:p>
+    <w:p>
+      <w:pPr>
+        <w:spacing w:after="60"/>
+      </w:pPr>
+    </w:p>
+    <w:p>
+      <w:pPr>
+        <w:pBdr>
+          <w:bottom w:val="single" w:sz="8" w:space="4" w:color="163B65"/>
+        </w:pBdr>
+        <w:spacing w:before="100" w:after="90"/>
+      </w:pPr>
+      <w:r>
+        <w:rPr>
+          <w:b/>
+          <w:bCs/>
+          <w:sz w:val="26"/>
+          <w:szCs w:val="26"/>
+        </w:rPr>
+        <w:t>Part V: Essay</w:t>
+      </w:r>
+    </w:p>
+    <w:p>
+      <w:pPr>
+        <w:spacing w:after="50"/>
+      </w:pPr>
+      <w:r>
+        <w:rPr>
+          <w:i/>
+          <w:iCs/>
+          <w:sz w:val="19"/>
+          <w:szCs w:val="19"/>
+        </w:rPr>
+        <w:t>8 points</w:t>
+      </w:r>
+    </w:p>
+    <w:p>
+      <w:pPr>
+        <w:spacing w:after="70"/>
+      </w:pPr>
+      <w:r>
+        <w:t>Read each situation. Write a complete, professional response in 4 to 6 sentences.</w:t>
+      </w:r>
+    </w:p>
+    <w:p>
+      <w:pPr>
+        <w:spacing w:after="50"/>
+      </w:pPr>
+      <w:r>
+        <w:t>1. You are working at the Information Desk during a large conference. A delegate calls and says they confirmed a seat in the front row for this afternoon’s keynote session. When they arrive, there is no seat reserved for them, and the front row is already full. The delegate sounds upset and asks what you are going to do. Write your complete response to the delegate.</w:t>
+      </w:r>
+    </w:p>
+    <w:p>
+      <w:pPr>
+        <w:spacing w:after="40"/>
+      </w:pPr>
+      <w:r>
+        <w:br/>
+      </w:r>
+      <w:r>
+        <w:br/>
+      </w:r>
+      <w:r>
+        <w:br/>
+      </w:r>
+      <w:r>
+        <w:br/>
+      </w:r>
+      <w:r>
+        <w:br/>
+      </w:r>
+      <w:r>
+        <w:br/>
+      </w:r>
+      <w:r>
+        <w:br/>
+      </w:r>
+      <w:r>
+        <w:br/>
+      </w:r>
+      <w:r>
+        <w:br/>
+      </w:r>
+      <w:r>
+        <w:br/>
+      </w:r>
+      <w:r>
+        <w:br/>
+      </w:r>
+      <w:r>
+        <w:br/>
+      </w:r>
+      <w:r>
+        <w:br/>
+      </w:r>
+      <w:r>
+        <w:br/>
+      </w:r>
+      <w:r>
+        <w:br/>
+      </w:r>
+      <w:r>
+        <w:br/>
+      </w:r>
+      <w:r>
+        <w:br/>
+      </w:r>
+    </w:p>
+    <w:p>
+      <w:pPr>
+        <w:spacing w:after="50"/>
+      </w:pPr>
+      <w:r>
+        <w:t>2. You are staffing your company’s booth at a MICE exhibition. A visitor stops at your booth and seems interested in your product, but says a competitor’s product is cheaper and starts to walk away. Write what you would say to this visitor to explain your product and keep their interest.</w:t>
+      </w:r>
+    </w:p>
+    <w:p>
+      <w:r>
+        <w:br w:type="page"/>
+      </w:r>
+    </w:p>
+    <w:p>
+      <w:pPr>
+        <w:spacing w:after="6"/>
+        <w:jc w:val="center"/>
+      </w:pPr>
+      <w:r>
+        <w:rPr>
+          <w:b/>
+          <w:bCs/>
+          <w:sz w:val="30"/>
+          <w:szCs w:val="30"/>
+        </w:rPr>
+        <w:lastRenderedPageBreak/>
+        <w:t>ANSWER KEY</w:t>
+      </w:r>
+    </w:p>
+    <w:p>
+      <w:pPr>
+        <w:spacing w:after="200"/>
+        <w:jc w:val="center"/>
+      </w:pPr>
+      <w:r>
+        <w:rPr>
+          <w:i/>
+          <w:iCs/>
+        </w:rPr>
+        <w:t>Long Quiz: Units 9–11 — Teacher Copy Only</w:t>
       </w:r>
     </w:p>
     <w:tbl>
@@ -2759,16 +3152,10 @@
         <w:gridCol w:w="9360"/>
       </w:tblGrid>
       <w:tr>
-        <w:tblPrEx>
-          <w:tblCellMar>
-            <w:top w:w="0" w:type="dxa"/>
-            <w:bottom w:w="0" w:type="dxa"/>
-          </w:tblCellMar>
-        </w:tblPrEx>
         <w:tc>
           <w:tcPr>
             <w:tcW w:w="9360" w:type="dxa"/>
-            <w:shd w:val="clear" w:color="auto" w:fill="F4F4F4"/>
+            <w:shd w:val="clear" w:color="auto" w:fill="F4E9DD"/>
             <w:tcMar>
               <w:top w:w="90" w:type="dxa"/>
               <w:left w:w="160" w:type="dxa"/>
@@ -2777,15 +3164,12 @@
             </w:tcMar>
           </w:tcPr>
           <w:p>
-            <w:pPr>
-              <w:spacing w:after="0"/>
-            </w:pPr>
-            <w:r>
-              <w:rPr>
-                <w:sz w:val="19"/>
-                <w:szCs w:val="19"/>
-              </w:rPr>
-              <w:t xml:space="preserve">A man named Khun Nattapong, from Siam Exports, calls the MICE Console asking to speak with the parking coordinator. The parking coordinator is busy with another group, so the staff member offers to take a message. Khun Nattapong gives his number, 085-678-1234, and explains that his group needs 5 more parking spaces for tomorrow’s conference. He asks for a call back before 6pm tonight.</w:t>
+            <w:r>
+              <w:rPr>
+                <w:b/>
+                <w:bCs/>
+              </w:rPr>
+              <w:t>Do not distribute this page to students.</w:t>
             </w:r>
           </w:p>
         </w:tc>
@@ -2793,603 +3177,17 @@
     </w:tbl>
     <w:p>
       <w:pPr>
-        <w:spacing w:after="40"/>
-      </w:pPr>
-    </w:p>
-    <w:p>
-      <w:pPr>
-        <w:spacing w:after="30"/>
+        <w:spacing w:after="200"/>
+      </w:pPr>
+    </w:p>
+    <w:p>
+      <w:pPr>
+        <w:spacing w:before="200" w:after="90"/>
       </w:pPr>
       <w:r>
         <w:rPr>
           <w:b/>
           <w:bCs/>
-          <w:color w:val="163B65"/>
-        </w:rPr>
-        <w:t>Your Notes:</w:t>
-      </w:r>
-    </w:p>
-    <w:p>
-      <w:pPr>
-        <w:spacing w:after="100"/>
-      </w:pPr>
-      <w:r>
-        <w:rPr>
-          <w:color w:val="999999"/>
-        </w:rPr>
-        <w:t>____________________________________________________________________________________________________</w:t>
-      </w:r>
-    </w:p>
-    <w:p>
-      <w:pPr>
-        <w:spacing w:after="100"/>
-      </w:pPr>
-      <w:r>
-        <w:rPr>
-          <w:color w:val="999999"/>
-        </w:rPr>
-        <w:t>____________________________________________________________________________________________________</w:t>
-      </w:r>
-    </w:p>
-    <w:p>
-      <w:pPr>
-        <w:spacing w:after="100"/>
-      </w:pPr>
-      <w:r>
-        <w:rPr>
-          <w:color w:val="999999"/>
-        </w:rPr>
-        <w:t>____________________________________________________________________________________________________</w:t>
-      </w:r>
-    </w:p>
-    <w:p>
-      <w:pPr>
-        <w:spacing w:after="50"/>
-      </w:pPr>
-    </w:p>
-    <w:p>
-      <w:pPr>
-        <w:spacing w:before="70" w:after="90"/>
-      </w:pPr>
-      <w:r>
-        <w:rPr>
-          <w:b/>
-          <w:bCs/>
-          <w:color w:val="D9740F"/>
-          <w:sz w:val="22"/>
-          <w:szCs w:val="22"/>
-        </w:rPr>
-        <w:t>Phone Call 2</w:t>
-      </w:r>
-    </w:p>
-    <w:tbl>
-      <w:tblPr>
-        <w:tblW w:w="9360" w:type="dxa"/>
-        <w:tblBorders>
-          <w:top w:val="single" w:sz="4" w:space="0" w:color="auto"/>
-          <w:left w:val="single" w:sz="4" w:space="0" w:color="auto"/>
-          <w:bottom w:val="single" w:sz="4" w:space="0" w:color="auto"/>
-          <w:right w:val="single" w:sz="4" w:space="0" w:color="auto"/>
-          <w:insideH w:val="single" w:sz="4" w:space="0" w:color="auto"/>
-          <w:insideV w:val="single" w:sz="4" w:space="0" w:color="auto"/>
-        </w:tblBorders>
-        <w:tblCellMar>
-          <w:left w:w="10" w:type="dxa"/>
-          <w:right w:w="10" w:type="dxa"/>
-        </w:tblCellMar>
-        <w:tblLook w:val="04A0" w:firstRow="1" w:lastRow="0" w:firstColumn="1" w:lastColumn="0" w:noHBand="0" w:noVBand="1"/>
-      </w:tblPr>
-      <w:tblGrid>
-        <w:gridCol w:w="9360"/>
-      </w:tblGrid>
-      <w:tr>
-        <w:tblPrEx>
-          <w:tblCellMar>
-            <w:top w:w="0" w:type="dxa"/>
-            <w:bottom w:w="0" w:type="dxa"/>
-          </w:tblCellMar>
-        </w:tblPrEx>
-        <w:tc>
-          <w:tcPr>
-            <w:tcW w:w="9360" w:type="dxa"/>
-            <w:shd w:val="clear" w:color="auto" w:fill="F4F4F4"/>
-            <w:tcMar>
-              <w:top w:w="90" w:type="dxa"/>
-              <w:left w:w="160" w:type="dxa"/>
-              <w:bottom w:w="90" w:type="dxa"/>
-              <w:right w:w="160" w:type="dxa"/>
-            </w:tcMar>
-          </w:tcPr>
-          <w:p>
-            <w:pPr>
-              <w:spacing w:after="0"/>
-            </w:pPr>
-            <w:r>
-              <w:rPr>
-                <w:sz w:val="19"/>
-                <w:szCs w:val="19"/>
-              </w:rPr>
-              <w:t xml:space="preserve">A woman named Khun Achara, from Blue Ocean Spa Products, calls the MICE Console asking to speak with the booth manager. The booth manager is out at lunch, so the staff member offers to take a message. Khun Achara gives her number, 098-234-5566, and explains that she needs one extra visitor badge for a colleague arriving this afternoon. She asks for a call back before 3pm.</w:t>
-            </w:r>
-          </w:p>
-        </w:tc>
-      </w:tr>
-    </w:tbl>
-    <w:p>
-      <w:pPr>
-        <w:spacing w:after="40"/>
-      </w:pPr>
-    </w:p>
-    <w:p>
-      <w:pPr>
-        <w:spacing w:after="30"/>
-      </w:pPr>
-      <w:r>
-        <w:rPr>
-          <w:b/>
-          <w:bCs/>
-          <w:color w:val="163B65"/>
-        </w:rPr>
-        <w:t>Your Notes:</w:t>
-      </w:r>
-    </w:p>
-    <w:p>
-      <w:pPr>
-        <w:spacing w:after="100"/>
-      </w:pPr>
-      <w:r>
-        <w:rPr>
-          <w:color w:val="999999"/>
-        </w:rPr>
-        <w:t>____________________________________________________________________________________________________</w:t>
-      </w:r>
-    </w:p>
-    <w:p>
-      <w:pPr>
-        <w:spacing w:after="100"/>
-      </w:pPr>
-      <w:r>
-        <w:rPr>
-          <w:color w:val="999999"/>
-        </w:rPr>
-        <w:lastRenderedPageBreak/>
-        <w:t>____________________________________________________________________________________________________</w:t>
-      </w:r>
-    </w:p>
-    <w:p>
-      <w:pPr>
-        <w:spacing w:after="100"/>
-      </w:pPr>
-      <w:r>
-        <w:rPr>
-          <w:color w:val="999999"/>
-        </w:rPr>
-        <w:t>____________________________________________________________________________________________________</w:t>
-      </w:r>
-    </w:p>
-    <w:p>
-      <w:pPr>
-        <w:spacing w:after="50"/>
-      </w:pPr>
-    </w:p>
-    <w:p>
-      <w:pPr>
-        <w:pBdr>
-          <w:bottom w:val="single" w:sz="8" w:space="4" w:color="163B65"/>
-        </w:pBdr>
-        <w:spacing w:before="100" w:after="90"/>
-      </w:pPr>
-      <w:r>
-        <w:rPr>
-          <w:b/>
-          <w:bCs/>
-          <w:color w:val="163B65"/>
-          <w:sz w:val="26"/>
-          <w:szCs w:val="26"/>
-        </w:rPr>
-        <w:t>Part IV: Put the Sentence in Order</w:t>
-      </w:r>
-    </w:p>
-    <w:p>
-      <w:pPr>
-        <w:spacing w:after="50"/>
-      </w:pPr>
-      <w:r>
-        <w:rPr>
-          <w:i/>
-          <w:iCs/>
-          <w:color w:val="5B6B7C"/>
-          <w:sz w:val="19"/>
-          <w:szCs w:val="19"/>
-        </w:rPr>
-        <w:t>6 points</w:t>
-      </w:r>
-    </w:p>
-    <w:p>
-      <w:pPr>
-        <w:spacing w:after="70"/>
-      </w:pPr>
-      <w:r>
-        <w:t>Put the phrases in the correct order to make ONE professional sentence. Write the numbers 1, 2, 3, 4 in the blanks, then write the complete sentence.</w:t>
-      </w:r>
-    </w:p>
-    <w:p>
-      <w:pPr>
-        <w:spacing w:after="40"/>
-      </w:pPr>
-      <w:r>
-        <w:rPr>
-          <w:b/>
-          <w:bCs/>
-          <w:color w:val="163B65"/>
-        </w:rPr>
-        <w:t>1. Complete a polite apology with a solution.</w:t>
-      </w:r>
-    </w:p>
-    <w:p>
-      <w:pPr>
-        <w:spacing w:after="30"/>
-        <w:ind w:left="360"/>
-      </w:pPr>
-      <w:r>
-        <w:t>[ ___ ]  another table.</w:t>
-      </w:r>
-      <w:r>
-        <w:t xml:space="preserve">  </w:t>
-      </w:r>
-      <w:r>
-        <w:t>[ ___ ]  I'm sorry,</w:t>
-      </w:r>
-      <w:r>
-        <w:t xml:space="preserve">  </w:t>
-      </w:r>
-      <w:r>
-        <w:t>[ ___ ]  but I can offer you</w:t>
-      </w:r>
-      <w:r>
-        <w:t xml:space="preserve">  </w:t>
-      </w:r>
-      <w:r>
-        <w:t>[ ___ ]  that table is booked,</w:t>
-      </w:r>
-    </w:p>
-    <w:p>
-      <w:pPr>
-        <w:spacing w:after="60"/>
-      </w:pPr>
-    </w:p>
-    <w:p>
-      <w:pPr>
-        <w:spacing w:after="40"/>
-      </w:pPr>
-      <w:r>
-        <w:rPr>
-          <w:b/>
-          <w:bCs/>
-          <w:color w:val="163B65"/>
-        </w:rPr>
-        <w:t>2. Complete a fast, professional fix.</w:t>
-      </w:r>
-    </w:p>
-    <w:p>
-      <w:pPr>
-        <w:spacing w:after="30"/>
-        <w:ind w:left="360"/>
-      </w:pPr>
-      <w:r>
-        <w:t>[ ___ ]  for you</w:t>
-      </w:r>
-      <w:r>
-        <w:t xml:space="preserve">  </w:t>
-      </w:r>
-      <w:r>
-        <w:t>[ ___ ]  Let me find</w:t>
-      </w:r>
-      <w:r>
-        <w:t xml:space="preserve">. </w:t>
-      </w:r>
-      <w:r>
-        <w:t>[ ___ ]  right away.</w:t>
-      </w:r>
-      <w:r>
-        <w:t xml:space="preserve">   </w:t>
-      </w:r>
-      <w:r>
-        <w:t>[ ___ ]  a solution</w:t>
-      </w:r>
-    </w:p>
-    <w:p>
-      <w:pPr>
-        <w:spacing w:after="60"/>
-      </w:pPr>
-    </w:p>
-    <w:p>
-      <w:pPr>
-        <w:spacing w:after="40"/>
-      </w:pPr>
-      <w:r>
-        <w:rPr>
-          <w:b/>
-          <w:bCs/>
-          <w:color w:val="163B65"/>
-        </w:rPr>
-        <w:t>3. Complete a polite refusal with an alternative.</w:t>
-      </w:r>
-    </w:p>
-    <w:p>
-      <w:pPr>
-        <w:spacing w:after="30"/>
-        <w:ind w:left="360"/>
-      </w:pPr>
-      <w:r>
-        <w:t>[ ___ ]  but I can offer you</w:t>
-      </w:r>
-      <w:r>
-        <w:t xml:space="preserve">.   </w:t>
-      </w:r>
-      <w:r>
-        <w:t>[ ___ ]  instead.</w:t>
-      </w:r>
-      <w:r>
-        <w:t xml:space="preserve">  </w:t>
-      </w:r>
-      <w:r>
-        <w:t>[ ___ ]  I'm afraid that won't be possible,</w:t>
-      </w:r>
-      <w:r>
-        <w:t xml:space="preserve">  </w:t>
-      </w:r>
-      <w:r>
-        <w:t>[ ___ ]  the 3 PM slot</w:t>
-      </w:r>
-    </w:p>
-    <w:p>
-      <w:pPr>
-        <w:spacing w:after="60"/>
-      </w:pPr>
-    </w:p>
-    <w:p>
-      <w:pPr>
-        <w:pBdr>
-          <w:bottom w:val="single" w:sz="8" w:space="4" w:color="163B65"/>
-        </w:pBdr>
-        <w:spacing w:before="100" w:after="90"/>
-      </w:pPr>
-      <w:r>
-        <w:rPr>
-          <w:b/>
-          <w:bCs/>
-          <w:color w:val="163B65"/>
-          <w:sz w:val="26"/>
-          <w:szCs w:val="26"/>
-        </w:rPr>
-        <w:t>Part V: Essay</w:t>
-      </w:r>
-    </w:p>
-    <w:p>
-      <w:pPr>
-        <w:spacing w:after="50"/>
-      </w:pPr>
-      <w:r>
-        <w:rPr>
-          <w:i/>
-          <w:iCs/>
-          <w:color w:val="5B6B7C"/>
-          <w:sz w:val="19"/>
-          <w:szCs w:val="19"/>
-        </w:rPr>
-        <w:t>8 points</w:t>
-      </w:r>
-    </w:p>
-    <w:p>
-      <w:pPr>
-        <w:spacing w:after="70"/>
-      </w:pPr>
-      <w:r>
-        <w:t>Read each situation. Write a complete, professional response in 4 to 6 sentences.</w:t>
-      </w:r>
-    </w:p>
-    <w:p>
-      <w:pPr>
-        <w:spacing w:after="50"/>
-      </w:pPr>
-      <w:r>
-        <w:t>1. You are working at the Information Desk during a large conference. A delegate calls and says they confirmed a seat in the front row for this afternoon’s keynote session. When they arrive, there is no seat reserved for them, and the front row is already full. The delegate sounds upset and asks what you are going to do. Write your complete response to the delegate.</w:t>
-      </w:r>
-    </w:p>
-    <w:p>
-      <w:pPr>
-        <w:spacing w:after="100"/>
-      </w:pPr>
-      <w:r>
-        <w:rPr>
-          <w:color w:val="999999"/>
-        </w:rPr>
-        <w:t>____________________________________________________________________________________________________</w:t>
-      </w:r>
-    </w:p>
-    <w:p>
-      <w:pPr>
-        <w:spacing w:after="100"/>
-      </w:pPr>
-      <w:r>
-        <w:rPr>
-          <w:color w:val="999999"/>
-        </w:rPr>
-        <w:t>____________________________________________________________________________________________________</w:t>
-      </w:r>
-    </w:p>
-    <w:p>
-      <w:pPr>
-        <w:spacing w:after="100"/>
-      </w:pPr>
-      <w:r>
-        <w:rPr>
-          <w:color w:val="999999"/>
-        </w:rPr>
-        <w:t>____________________________________________________________________________________________________</w:t>
-      </w:r>
-    </w:p>
-    <w:p>
-      <w:pPr>
-        <w:spacing w:after="40"/>
-      </w:pPr>
-    </w:p>
-    <w:p>
-      <w:pPr>
-        <w:spacing w:after="50"/>
-      </w:pPr>
-      <w:r>
-        <w:t>2. You are staffing your company’s booth at a MICE exhibition. A visitor stops at your booth and seems interested in your product, but says a competitor’s product is cheaper and starts to walk away. Write what you would say to this visitor to explain your product and keep their interest.</w:t>
-      </w:r>
-    </w:p>
-    <w:p>
-      <w:pPr>
-        <w:spacing w:after="100"/>
-      </w:pPr>
-      <w:r>
-        <w:rPr>
-          <w:color w:val="999999"/>
-        </w:rPr>
-        <w:t>____________________________________________________________________________________________________</w:t>
-      </w:r>
-    </w:p>
-    <w:p>
-      <w:pPr>
-        <w:spacing w:after="100"/>
-      </w:pPr>
-      <w:r>
-        <w:rPr>
-          <w:color w:val="999999"/>
-        </w:rPr>
-        <w:t>____________________________________________________________________________________________________</w:t>
-      </w:r>
-    </w:p>
-    <w:p>
-      <w:pPr>
-        <w:spacing w:after="100"/>
-      </w:pPr>
-      <w:r>
-        <w:rPr>
-          <w:color w:val="999999"/>
-        </w:rPr>
-        <w:t>____________________________________________________________________________________________________</w:t>
-      </w:r>
-    </w:p>
-    <w:p>
-      <w:pPr>
-        <w:jc w:val="center"/>
-      </w:pPr>
-      <w:r>
-        <w:rPr>
-          <w:b/>
-          <w:bCs/>
-          <w:color w:val="163B65"/>
-        </w:rPr>
-        <w:t>End of Quiz. Total: 40 points.</w:t>
-      </w:r>
-    </w:p>
-    <w:p>
-      <w:r>
-        <w:br w:type="page"/>
-      </w:r>
-    </w:p>
-    <w:p>
-      <w:pPr>
-        <w:spacing w:after="6"/>
-        <w:jc w:val="center"/>
-      </w:pPr>
-      <w:r>
-        <w:rPr>
-          <w:b/>
-          <w:bCs/>
-          <w:color w:val="163B65"/>
-          <w:sz w:val="30"/>
-          <w:szCs w:val="30"/>
-        </w:rPr>
-        <w:lastRenderedPageBreak/>
-        <w:t>ANSWER KEY</w:t>
-      </w:r>
-    </w:p>
-    <w:p>
-      <w:pPr>
-        <w:spacing w:after="200"/>
-        <w:jc w:val="center"/>
-      </w:pPr>
-      <w:r>
-        <w:rPr>
-          <w:i/>
-          <w:iCs/>
-          <w:color w:val="D9740F"/>
-        </w:rPr>
-        <w:t>Long Quiz: Units 9–11 — Teacher Copy Only</w:t>
-      </w:r>
-    </w:p>
-    <w:tbl>
-      <w:tblPr>
-        <w:tblW w:w="9360" w:type="dxa"/>
-        <w:tblBorders>
-          <w:top w:val="single" w:sz="4" w:space="0" w:color="auto"/>
-          <w:left w:val="single" w:sz="4" w:space="0" w:color="auto"/>
-          <w:bottom w:val="single" w:sz="4" w:space="0" w:color="auto"/>
-          <w:right w:val="single" w:sz="4" w:space="0" w:color="auto"/>
-          <w:insideH w:val="single" w:sz="4" w:space="0" w:color="auto"/>
-          <w:insideV w:val="single" w:sz="4" w:space="0" w:color="auto"/>
-        </w:tblBorders>
-        <w:tblCellMar>
-          <w:left w:w="10" w:type="dxa"/>
-          <w:right w:w="10" w:type="dxa"/>
-        </w:tblCellMar>
-        <w:tblLook w:val="04A0" w:firstRow="1" w:lastRow="0" w:firstColumn="1" w:lastColumn="0" w:noHBand="0" w:noVBand="1"/>
-      </w:tblPr>
-      <w:tblGrid>
-        <w:gridCol w:w="9360"/>
-      </w:tblGrid>
-      <w:tr>
-        <w:tblPrEx>
-          <w:tblCellMar>
-            <w:top w:w="0" w:type="dxa"/>
-            <w:bottom w:w="0" w:type="dxa"/>
-          </w:tblCellMar>
-        </w:tblPrEx>
-        <w:tc>
-          <w:tcPr>
-            <w:tcW w:w="9360" w:type="dxa"/>
-            <w:shd w:val="clear" w:color="auto" w:fill="F4E9DD"/>
-            <w:tcMar>
-              <w:top w:w="90" w:type="dxa"/>
-              <w:left w:w="160" w:type="dxa"/>
-              <w:bottom w:w="90" w:type="dxa"/>
-              <w:right w:w="160" w:type="dxa"/>
-            </w:tcMar>
-          </w:tcPr>
-          <w:p>
-            <w:r>
-              <w:rPr>
-                <w:b/>
-                <w:bCs/>
-                <w:color w:val="163B65"/>
-              </w:rPr>
-              <w:t>Do not distribute this page to students.</w:t>
-            </w:r>
-          </w:p>
-        </w:tc>
-      </w:tr>
-    </w:tbl>
-    <w:p>
-      <w:pPr>
-        <w:spacing w:after="200"/>
-      </w:pPr>
-    </w:p>
-    <w:p>
-      <w:pPr>
-        <w:spacing w:before="200" w:after="90"/>
-      </w:pPr>
-      <w:r>
-        <w:rPr>
-          <w:b/>
-          <w:bCs/>
-          <w:color w:val="D9740F"/>
           <w:sz w:val="22"/>
           <w:szCs w:val="22"/>
         </w:rPr>
@@ -3412,7 +3210,6 @@
         <w:rPr>
           <w:b/>
           <w:bCs/>
-          <w:color w:val="D9740F"/>
           <w:sz w:val="22"/>
           <w:szCs w:val="22"/>
         </w:rPr>
@@ -3443,7 +3240,6 @@
         <w:rPr>
           <w:b/>
           <w:bCs/>
-          <w:color w:val="D9740F"/>
           <w:sz w:val="22"/>
           <w:szCs w:val="22"/>
         </w:rPr>
@@ -3458,7 +3254,6 @@
         <w:rPr>
           <w:i/>
           <w:iCs/>
-          <w:color w:val="5B6B7C"/>
           <w:sz w:val="18"/>
           <w:szCs w:val="18"/>
         </w:rPr>
@@ -3473,7 +3268,6 @@
         <w:rPr>
           <w:b/>
           <w:bCs/>
-          <w:color w:val="163B65"/>
         </w:rPr>
         <w:t>Phone Call 1:</w:t>
       </w:r>
@@ -3494,7 +3288,6 @@
         <w:rPr>
           <w:b/>
           <w:bCs/>
-          <w:color w:val="163B65"/>
         </w:rPr>
         <w:t>Phone Call 2:</w:t>
       </w:r>
@@ -3515,7 +3308,6 @@
         <w:rPr>
           <w:b/>
           <w:bCs/>
-          <w:color w:val="D9740F"/>
           <w:sz w:val="22"/>
           <w:szCs w:val="22"/>
         </w:rPr>
@@ -3559,7 +3351,6 @@
         <w:rPr>
           <w:b/>
           <w:bCs/>
-          <w:color w:val="D9740F"/>
           <w:sz w:val="22"/>
           <w:szCs w:val="22"/>
         </w:rPr>
@@ -3574,7 +3365,6 @@
         <w:rPr>
           <w:i/>
           <w:iCs/>
-          <w:color w:val="5B6B7C"/>
           <w:sz w:val="18"/>
           <w:szCs w:val="18"/>
         </w:rPr>
@@ -3589,7 +3379,6 @@
         <w:rPr>
           <w:b/>
           <w:bCs/>
-          <w:color w:val="163B65"/>
         </w:rPr>
         <w:t>Model answer 1:</w:t>
       </w:r>
@@ -3602,7 +3391,6 @@
         <w:rPr>
           <w:i/>
           <w:iCs/>
-          <w:color w:val="2F7D4F"/>
           <w:sz w:val="19"/>
           <w:szCs w:val="19"/>
         </w:rPr>
@@ -3617,7 +3405,6 @@
         <w:rPr>
           <w:b/>
           <w:bCs/>
-          <w:color w:val="163B65"/>
         </w:rPr>
         <w:t>Model answer 2:</w:t>
       </w:r>
@@ -3630,7 +3417,6 @@
         <w:rPr>
           <w:i/>
           <w:iCs/>
-          <w:color w:val="2F7D4F"/>
           <w:sz w:val="19"/>
           <w:szCs w:val="19"/>
         </w:rPr>
@@ -3645,6 +3431,44 @@
     </w:sectPr>
   </w:body>
 </w:document>
+</file>
+
+<file path=word/endnotes.xml><?xml version="1.0" encoding="utf-8"?>
+<w:endnotes xmlns:wpc="http://schemas.microsoft.com/office/word/2010/wordprocessingCanvas" xmlns:cx="http://schemas.microsoft.com/office/drawing/2014/chartex" xmlns:cx1="http://schemas.microsoft.com/office/drawing/2015/9/8/chartex" xmlns:cx2="http://schemas.microsoft.com/office/drawing/2015/10/21/chartex" xmlns:cx3="http://schemas.microsoft.com/office/drawing/2016/5/9/chartex" xmlns:cx4="http://schemas.microsoft.com/office/drawing/2016/5/10/chartex" xmlns:cx5="http://schemas.microsoft.com/office/drawing/2016/5/11/chartex" xmlns:cx6="http://schemas.microsoft.com/office/drawing/2016/5/12/chartex" xmlns:cx7="http://schemas.microsoft.com/office/drawing/2016/5/13/chartex" xmlns:cx8="http://schemas.microsoft.com/office/drawing/2016/5/14/chartex" xmlns:mc="http://schemas.openxmlformats.org/markup-compatibility/2006" xmlns:m="http://schemas.openxmlformats.org/officeDocument/2006/math" xmlns:aink="http://schemas.microsoft.com/office/drawing/2016/ink" xmlns:am3d="http://schemas.microsoft.com/office/drawing/2017/model3d" xmlns:oel="http://schemas.microsoft.com/office/2019/extlst" xmlns:r="http://schemas.openxmlformats.org/officeDocument/2006/relationships" xmlns:wp14="http://schemas.microsoft.com/office/word/2010/wordprocessingDrawing" xmlns:wp="http://schemas.openxmlformats.org/drawingml/2006/wordprocessingDrawing" xmlns:wpg="http://schemas.microsoft.com/office/word/2010/wordprocessingGroup" xmlns:wpi="http://schemas.microsoft.com/office/word/2010/wordprocessingInk" xmlns:wps="http://schemas.microsoft.com/office/word/2010/wordprocessingShape" xmlns:o="urn:schemas-microsoft-com:office:office" xmlns:v="urn:schemas-microsoft-com:vml" xmlns:w10="urn:schemas-microsoft-com:office:word" xmlns:w="http://schemas.openxmlformats.org/wordprocessingml/2006/main" xmlns:w14="http://schemas.microsoft.com/office/word/2010/wordml" xmlns:w15="http://schemas.microsoft.com/office/word/2012/wordml" xmlns:w16cex="http://schemas.microsoft.com/office/word/2018/wordml/cex" xmlns:w16cid="http://schemas.microsoft.com/office/word/2016/wordml/cid" xmlns:w16="http://schemas.microsoft.com/office/word/2018/wordml" xmlns:w16sdtdh="http://schemas.microsoft.com/office/word/2020/wordml/sdtdatahash" xmlns:w16sdtfl="http://schemas.microsoft.com/office/word/2024/wordml/sdtformatlock" xmlns:w16se="http://schemas.microsoft.com/office/word/2015/wordml/symex" xmlns:w16du="http://schemas.microsoft.com/office/word/2023/wordml/word16du" xmlns:wne="http://schemas.microsoft.com/office/word/2006/wordml" mc:Ignorable="w14 w15 w16se w16cid w16 w16cex w16sdtdh w16sdtfl w16du wp14">
+  <w:endnote w:type="separator" w:id="-1">
+    <w:p>
+      <w:r>
+        <w:separator/>
+      </w:r>
+    </w:p>
+  </w:endnote>
+  <w:endnote w:type="continuationSeparator" w:id="0">
+    <w:p>
+      <w:r>
+        <w:continuationSeparator/>
+      </w:r>
+    </w:p>
+  </w:endnote>
+</w:endnotes>
+</file>
+
+<file path=word/footnotes.xml><?xml version="1.0" encoding="utf-8"?>
+<w:footnotes xmlns:wpc="http://schemas.microsoft.com/office/word/2010/wordprocessingCanvas" xmlns:cx="http://schemas.microsoft.com/office/drawing/2014/chartex" xmlns:cx1="http://schemas.microsoft.com/office/drawing/2015/9/8/chartex" xmlns:cx2="http://schemas.microsoft.com/office/drawing/2015/10/21/chartex" xmlns:cx3="http://schemas.microsoft.com/office/drawing/2016/5/9/chartex" xmlns:cx4="http://schemas.microsoft.com/office/drawing/2016/5/10/chartex" xmlns:cx5="http://schemas.microsoft.com/office/drawing/2016/5/11/chartex" xmlns:cx6="http://schemas.microsoft.com/office/drawing/2016/5/12/chartex" xmlns:cx7="http://schemas.microsoft.com/office/drawing/2016/5/13/chartex" xmlns:cx8="http://schemas.microsoft.com/office/drawing/2016/5/14/chartex" xmlns:mc="http://schemas.openxmlformats.org/markup-compatibility/2006" xmlns:m="http://schemas.openxmlformats.org/officeDocument/2006/math" xmlns:aink="http://schemas.microsoft.com/office/drawing/2016/ink" xmlns:am3d="http://schemas.microsoft.com/office/drawing/2017/model3d" xmlns:oel="http://schemas.microsoft.com/office/2019/extlst" xmlns:r="http://schemas.openxmlformats.org/officeDocument/2006/relationships" xmlns:wp14="http://schemas.microsoft.com/office/word/2010/wordprocessingDrawing" xmlns:wp="http://schemas.openxmlformats.org/drawingml/2006/wordprocessingDrawing" xmlns:wpg="http://schemas.microsoft.com/office/word/2010/wordprocessingGroup" xmlns:wpi="http://schemas.microsoft.com/office/word/2010/wordprocessingInk" xmlns:wps="http://schemas.microsoft.com/office/word/2010/wordprocessingShape" xmlns:o="urn:schemas-microsoft-com:office:office" xmlns:v="urn:schemas-microsoft-com:vml" xmlns:w10="urn:schemas-microsoft-com:office:word" xmlns:w="http://schemas.openxmlformats.org/wordprocessingml/2006/main" xmlns:w14="http://schemas.microsoft.com/office/word/2010/wordml" xmlns:w15="http://schemas.microsoft.com/office/word/2012/wordml" xmlns:w16cex="http://schemas.microsoft.com/office/word/2018/wordml/cex" xmlns:w16cid="http://schemas.microsoft.com/office/word/2016/wordml/cid" xmlns:w16="http://schemas.microsoft.com/office/word/2018/wordml" xmlns:w16sdtdh="http://schemas.microsoft.com/office/word/2020/wordml/sdtdatahash" xmlns:w16sdtfl="http://schemas.microsoft.com/office/word/2024/wordml/sdtformatlock" xmlns:w16se="http://schemas.microsoft.com/office/word/2015/wordml/symex" xmlns:w16du="http://schemas.microsoft.com/office/word/2023/wordml/word16du" xmlns:wne="http://schemas.microsoft.com/office/word/2006/wordml" mc:Ignorable="w14 w15 w16se w16cid w16 w16cex w16sdtdh w16sdtfl w16du wp14">
+  <w:footnote w:type="separator" w:id="-1">
+    <w:p>
+      <w:r>
+        <w:separator/>
+      </w:r>
+    </w:p>
+  </w:footnote>
+  <w:footnote w:type="continuationSeparator" w:id="0">
+    <w:p>
+      <w:r>
+        <w:continuationSeparator/>
+      </w:r>
+    </w:p>
+  </w:footnote>
+</w:footnotes>
 </file>
 
 <file path=word/numbering.xml><?xml version="1.0" encoding="utf-8"?>
@@ -4351,6 +4175,48 @@
       <w:szCs w:val="20"/>
     </w:rPr>
   </w:style>
+  <w:style w:type="paragraph" w:styleId="Header">
+    <w:name w:val="header"/>
+    <w:basedOn w:val="Normal"/>
+    <w:link w:val="HeaderChar"/>
+    <w:uiPriority w:val="99"/>
+    <w:unhideWhenUsed/>
+    <w:rsid w:val="00847841"/>
+    <w:pPr>
+      <w:tabs>
+        <w:tab w:val="center" w:pos="4680"/>
+        <w:tab w:val="right" w:pos="9360"/>
+      </w:tabs>
+    </w:pPr>
+  </w:style>
+  <w:style w:type="character" w:customStyle="1" w:styleId="HeaderChar">
+    <w:name w:val="Header Char"/>
+    <w:basedOn w:val="DefaultParagraphFont"/>
+    <w:link w:val="Header"/>
+    <w:uiPriority w:val="99"/>
+    <w:rsid w:val="00847841"/>
+  </w:style>
+  <w:style w:type="paragraph" w:styleId="Footer">
+    <w:name w:val="footer"/>
+    <w:basedOn w:val="Normal"/>
+    <w:link w:val="FooterChar"/>
+    <w:uiPriority w:val="99"/>
+    <w:unhideWhenUsed/>
+    <w:rsid w:val="00847841"/>
+    <w:pPr>
+      <w:tabs>
+        <w:tab w:val="center" w:pos="4680"/>
+        <w:tab w:val="right" w:pos="9360"/>
+      </w:tabs>
+    </w:pPr>
+  </w:style>
+  <w:style w:type="character" w:customStyle="1" w:styleId="FooterChar">
+    <w:name w:val="Footer Char"/>
+    <w:basedOn w:val="DefaultParagraphFont"/>
+    <w:link w:val="Footer"/>
+    <w:uiPriority w:val="99"/>
+    <w:rsid w:val="00847841"/>
+  </w:style>
 </w:styles>
 </file>
 

</xml_diff>